<commit_message>
feat(manuscript): add municipal IRCA map for the most complete year
Add a choropleth of the annual IRCA by municipality for 2019, classed
into the Resolution 2115 risk categories, to the introduction. Add
DANE 2020 boundaries (via the Humanitarian Data Exchange) as a
simplified GeoPackage with the script that rebuilds it. Joining the
boundaries to the file identifies the 8 municipalities and 19
non-municipalised areas that never appear, which question 2 now states.

Prompts:
- 2026-09-29-004-add-a-map-with-showing-the-measurement

Assisted-by: Claude claude-fable-5-1
</commit_message>
<xml_diff>
--- a/manuscript/_manuscript/index.docx
+++ b/manuscript/_manuscript/index.docx
@@ -66,7 +66,7 @@
         <w:t xml:space="preserve">This note answers the first two questions posed for the Colombian drinking-water quality dataset held in this repository. Question 1 asks for the observational unit of the measurements: it is the municipality-year. Each row carries the annual Water Quality Risk Index (IRCA) and its risk category for one municipality in one calendar year, for the municipality as a whole and for its urban and rural areas, and a smaller set of department-year aggregates is stacked in the same file. Question 2 asks how complete the data are. The overall IRCA is never missing and every calendar year from 2007 to 2024 is present, but the rural component is unavailable in about half of all municipal rows, about 6% of municipality-years are absent from the implied panel, with the shortfall concentrated in Chocó and the Amazon and Orinoco departments, and roughly a quarter of municipalities have an interrupted series.</w:t>
       </w:r>
     </w:p>
-    <w:bookmarkStart w:id="20" w:name="introduction"/>
+    <w:bookmarkStart w:id="25" w:name="introduction"/>
     <w:p>
       <w:pPr>
         <w:pStyle w:val="Heading1"/>
@@ -146,50 +146,25 @@
       <w:r>
         <w:t xml:space="preserve">from the structure of the file alone. The file was imported with every column as text, so that nothing was coerced silently; the year, stored as text with a thousands separator, was converted to an integer. All numbers below are computed from the file when the document is rendered.</w:t>
       </w:r>
-    </w:p>
-    <w:p>
-      <w:r>
-        <w:br w:type="page"/>
-      </w:r>
-    </w:p>
-    <w:bookmarkEnd w:id="20"/>
-    <w:bookmarkStart w:id="25" w:name="Xa68b6d5b5acbd028757e26f1c3e8cbb9e372abd"/>
-    <w:p>
-      <w:pPr>
-        <w:pStyle w:val="Heading1"/>
-      </w:pPr>
-      <w:r>
-        <w:t xml:space="preserve">2. Question 1: What is the observational unit?</w:t>
-      </w:r>
-    </w:p>
-    <w:bookmarkStart w:id="22" w:name="structure-of-the-file"/>
-    <w:p>
-      <w:pPr>
-        <w:pStyle w:val="Heading2"/>
-      </w:pPr>
-      <w:r>
-        <w:t xml:space="preserve">2.1 Structure of the file</w:t>
-      </w:r>
-    </w:p>
-    <w:p>
-      <w:pPr>
-        <w:pStyle w:val="FirstParagraph"/>
-      </w:pPr>
-      <w:r>
-        <w:t xml:space="preserve">The file has 19,160 rows and 11 columns (</w:t>
-      </w:r>
-      <w:hyperlink w:anchor="tbl-vars">
+      <w:r>
+        <w:t xml:space="preserve"> </w:t>
+      </w:r>
+      <w:hyperlink w:anchor="fig-map">
         <w:r>
           <w:rPr>
             <w:rStyle w:val="Hyperlink"/>
           </w:rPr>
-          <w:t xml:space="preserve">Table 1</w:t>
+          <w:t xml:space="preserve">Figure 1</w:t>
         </w:r>
       </w:hyperlink>
       <w:r>
-        <w:t xml:space="preserve">). Four columns identify a place, one identifies a calendar year, and six are measurements: a numeric IRCA and its risk category, reported for the whole territorial unit, for its urban area and for its rural area.</w:t>
-      </w:r>
-    </w:p>
+        <w:t xml:space="preserve"> </w:t>
+      </w:r>
+      <w:r>
+        <w:t xml:space="preserve">gives a first view of the measurement: the annual IRCA of every municipality in 2019, the year in which the largest number of municipalities is reported, drawn on the DANE 2020 municipal boundaries and classed into the official risk categories of Resolution 2115.</w:t>
+      </w:r>
+    </w:p>
+    <w:bookmarkStart w:id="24" w:name="cell-fig-map"/>
     <w:tbl>
       <w:tblPr>
         <w:tblStyle w:val="Table"/>
@@ -203,7 +178,130 @@
       <w:tr>
         <w:tc>
           <w:tcPr/>
-          <w:bookmarkStart w:id="21" w:name="tbl-vars"/>
+          <w:bookmarkStart w:id="23" w:name="fig-map"/>
+          <w:p>
+            <w:pPr>
+              <w:pStyle w:val="Compact"/>
+              <w:jc w:val="center"/>
+            </w:pPr>
+            <w:r>
+              <w:drawing>
+                <wp:inline>
+                  <wp:extent cx="5334000" cy="5087815"/>
+                  <wp:effectExtent b="0" l="0" r="0" t="0"/>
+                  <wp:docPr descr="" title="" id="21" name="Picture"/>
+                  <a:graphic>
+                    <a:graphicData uri="http://schemas.openxmlformats.org/drawingml/2006/picture">
+                      <pic:pic>
+                        <pic:nvPicPr>
+                          <pic:cNvPr descr="index_files/figure-docx/fig-map-1.png" id="22" name="Picture"/>
+                          <pic:cNvPicPr>
+                            <a:picLocks noChangeArrowheads="1" noChangeAspect="1"/>
+                          </pic:cNvPicPr>
+                        </pic:nvPicPr>
+                        <pic:blipFill>
+                          <a:blip r:embed="rId20"/>
+                          <a:stretch>
+                            <a:fillRect/>
+                          </a:stretch>
+                        </pic:blipFill>
+                        <pic:spPr bwMode="auto">
+                          <a:xfrm>
+                            <a:off x="0" y="0"/>
+                            <a:ext cx="5334000" cy="5087815"/>
+                          </a:xfrm>
+                          <a:prstGeom prst="rect">
+                            <a:avLst/>
+                          </a:prstGeom>
+                          <a:noFill/>
+                          <a:ln w="9525">
+                            <a:noFill/>
+                            <a:headEnd/>
+                            <a:tailEnd/>
+                          </a:ln>
+                        </pic:spPr>
+                      </pic:pic>
+                    </a:graphicData>
+                  </a:graphic>
+                </wp:inline>
+              </w:drawing>
+            </w:r>
+          </w:p>
+          <w:p>
+            <w:pPr>
+              <w:jc w:val="center"/>
+            </w:pPr>
+            <w:pPr>
+              <w:jc w:val="start"/>
+              <w:spacing w:before="200"/>
+              <w:pStyle w:val="ImageCaption"/>
+            </w:pPr>
+            <w:r>
+              <w:t xml:space="preserve">Figure 1: Annual IRCA by municipality in 2019, the most complete year in the file, classed into the risk categories of Resolution 2115 of 2007. Grey municipalities have no record for that year. The Archipelago of San Andrés is outside the frame. Boundaries: DANE Marco Geoestadístico Nacional 2020.</w:t>
+            </w:r>
+          </w:p>
+          <w:bookmarkEnd w:id="23"/>
+        </w:tc>
+      </w:tr>
+    </w:tbl>
+    <w:bookmarkEnd w:id="24"/>
+    <w:p>
+      <w:r>
+        <w:br w:type="page"/>
+      </w:r>
+    </w:p>
+    <w:bookmarkEnd w:id="25"/>
+    <w:bookmarkStart w:id="30" w:name="Xa68b6d5b5acbd028757e26f1c3e8cbb9e372abd"/>
+    <w:p>
+      <w:pPr>
+        <w:pStyle w:val="Heading1"/>
+      </w:pPr>
+      <w:r>
+        <w:t xml:space="preserve">2. Question 1: What is the observational unit?</w:t>
+      </w:r>
+    </w:p>
+    <w:bookmarkStart w:id="27" w:name="structure-of-the-file"/>
+    <w:p>
+      <w:pPr>
+        <w:pStyle w:val="Heading2"/>
+      </w:pPr>
+      <w:r>
+        <w:t xml:space="preserve">2.1 Structure of the file</w:t>
+      </w:r>
+    </w:p>
+    <w:p>
+      <w:pPr>
+        <w:pStyle w:val="FirstParagraph"/>
+      </w:pPr>
+      <w:r>
+        <w:t xml:space="preserve">The file has 19,160 rows and 11 columns (</w:t>
+      </w:r>
+      <w:hyperlink w:anchor="tbl-vars">
+        <w:r>
+          <w:rPr>
+            <w:rStyle w:val="Hyperlink"/>
+          </w:rPr>
+          <w:t xml:space="preserve">Table 1</w:t>
+        </w:r>
+      </w:hyperlink>
+      <w:r>
+        <w:t xml:space="preserve">). Four columns identify a place, one identifies a calendar year, and six are measurements: a numeric IRCA and its risk category, reported for the whole territorial unit, for its urban area and for its rural area.</w:t>
+      </w:r>
+    </w:p>
+    <w:tbl>
+      <w:tblPr>
+        <w:tblStyle w:val="Table"/>
+        <w:tblW w:type="pct" w:w="5000"/>
+        <w:tblLayout w:type="fixed"/>
+        <w:tblLook w:firstRow="0" w:lastRow="0" w:firstColumn="0" w:lastColumn="0" w:noHBand="0" w:noVBand="0" w:val="0000"/>
+      </w:tblPr>
+      <w:tblGrid>
+        <w:gridCol w:w="7920"/>
+      </w:tblGrid>
+      <w:tr>
+        <w:tc>
+          <w:tcPr/>
+          <w:bookmarkStart w:id="26" w:name="tbl-vars"/>
           <w:p>
             <w:pPr>
               <w:jc w:val="center"/>
@@ -725,13 +823,13 @@
               </w:tc>
             </w:tr>
           </w:tbl>
-          <w:bookmarkEnd w:id="21"/>
+          <w:bookmarkEnd w:id="26"/>
           <w:p/>
         </w:tc>
       </w:tr>
     </w:tbl>
-    <w:bookmarkEnd w:id="22"/>
-    <w:bookmarkStart w:id="23" w:name="two-levels-of-aggregation-and-one-key"/>
+    <w:bookmarkEnd w:id="27"/>
+    <w:bookmarkStart w:id="28" w:name="two-levels-of-aggregation-and-one-key"/>
     <w:p>
       <w:pPr>
         <w:pStyle w:val="Heading2"/>
@@ -777,8 +875,8 @@
         <w:t xml:space="preserve">The combination of department code, municipality code and year identifies every row exactly once (0 duplicates). Within the municipal rows, municipality code and year suffice, because the municipality code embeds the department code as its first two digits in every row (0 mismatches). Within the departmental rows, department code and year suffice. The municipal rows cover 1,095 municipality codes in 33 departments over 18 years, from 2007 to 2024.</w:t>
       </w:r>
     </w:p>
-    <w:bookmarkEnd w:id="23"/>
-    <w:bookmarkStart w:id="24" w:name="answer"/>
+    <w:bookmarkEnd w:id="28"/>
+    <w:bookmarkStart w:id="29" w:name="answer"/>
     <w:p>
       <w:pPr>
         <w:pStyle w:val="Heading2"/>
@@ -904,9 +1002,9 @@
         <w:br w:type="page"/>
       </w:r>
     </w:p>
-    <w:bookmarkEnd w:id="24"/>
-    <w:bookmarkEnd w:id="25"/>
-    <w:bookmarkStart w:id="35" w:name="question-2-how-complete-are-the-data"/>
+    <w:bookmarkEnd w:id="29"/>
+    <w:bookmarkEnd w:id="30"/>
+    <w:bookmarkStart w:id="40" w:name="question-2-how-complete-are-the-data"/>
     <w:p>
       <w:pPr>
         <w:pStyle w:val="Heading1"/>
@@ -923,7 +1021,7 @@
         <w:t xml:space="preserve">Completeness is examined at three levels: values within a row, municipalities within a year, and years within a municipality’s series. The file carries no list of the municipalities that ought to be present, so the reference set is defined internally as every municipality code that appears at least once, crossed with every year that appears at least once.</w:t>
       </w:r>
     </w:p>
-    <w:bookmarkStart w:id="26" w:name="missing-values-in-the-measurements"/>
+    <w:bookmarkStart w:id="31" w:name="missing-values-in-the-measurements"/>
     <w:p>
       <w:pPr>
         <w:pStyle w:val="Heading2"/>
@@ -1014,8 +1112,8 @@
         <w:t xml:space="preserve">and the urban IRCA is present, the overall IRCA equals the urban IRCA in 87% of cases, but in 785 rows the two differ by more than one point, so rural samples entered the overall index even though the rural component is reported as unavailable.</w:t>
       </w:r>
     </w:p>
-    <w:bookmarkEnd w:id="26"/>
-    <w:bookmarkStart w:id="32" w:name="missing-observational-units"/>
+    <w:bookmarkEnd w:id="31"/>
+    <w:bookmarkStart w:id="37" w:name="missing-observational-units"/>
     <w:p>
       <w:pPr>
         <w:pStyle w:val="Heading2"/>
@@ -1036,14 +1134,14 @@
           <w:rPr>
             <w:rStyle w:val="Hyperlink"/>
           </w:rPr>
-          <w:t xml:space="preserve">Figure 1</w:t>
+          <w:t xml:space="preserve">Figure 2</w:t>
         </w:r>
       </w:hyperlink>
       <w:r>
-        <w:t xml:space="preserve">). Only 5 departments are complete over the whole period. Chocó is missing 84% of its municipality-years and has no rows of any kind before 2014; of the 23 municipalities observed in five or fewer years, 21 are in Chocó. Guainía, Vaupés, Guaviare, Amazonas, Vichada and Córdoba also show substantial gaps. Department-level aggregates are absent in 25 of 594 department-years, always exactly when the department reported no municipality at all (0 exceptions). Municipalities that never appear cannot be detected from the file itself; DANE’s register lists on the order of 1,100 municipalities, so a few are likely absent throughout, and no non-municipalised areas are included.</w:t>
-      </w:r>
-    </w:p>
-    <w:bookmarkStart w:id="31" w:name="cell-fig-heatmap"/>
+        <w:t xml:space="preserve">). Only 5 departments are complete over the whole period. Chocó is missing 84% of its municipality-years and has no rows of any kind before 2014; of the 23 municipalities observed in five or fewer years, 21 are in Chocó. Guainía, Vaupés, Guaviare, Amazonas, Vichada and Córdoba also show substantial gaps. Department-level aggregates are absent in 25 of 594 department-years, always exactly when the department reported no municipality at all (0 exceptions). Joining the file to the DANE 2020 boundary register (1,122 units) shows that every code in the file exists in the register, and that 8 municipalities never appear in any year (6 in Chocó, 2 in Antioquia), together with the 19 non-municipalised areas of Amazonas, Guainía and Vaupés.</w:t>
+      </w:r>
+    </w:p>
+    <w:bookmarkStart w:id="36" w:name="cell-fig-heatmap"/>
     <w:tbl>
       <w:tblPr>
         <w:tblStyle w:val="Table"/>
@@ -1057,7 +1155,7 @@
       <w:tr>
         <w:tc>
           <w:tcPr/>
-          <w:bookmarkStart w:id="30" w:name="fig-heatmap"/>
+          <w:bookmarkStart w:id="35" w:name="fig-heatmap"/>
           <w:p>
             <w:pPr>
               <w:pStyle w:val="Compact"/>
@@ -1068,18 +1166,18 @@
                 <wp:inline>
                   <wp:extent cx="5334000" cy="2954215"/>
                   <wp:effectExtent b="0" l="0" r="0" t="0"/>
-                  <wp:docPr descr="" title="" id="28" name="Picture"/>
+                  <wp:docPr descr="" title="" id="33" name="Picture"/>
                   <a:graphic>
                     <a:graphicData uri="http://schemas.openxmlformats.org/drawingml/2006/picture">
                       <pic:pic>
                         <pic:nvPicPr>
-                          <pic:cNvPr descr="index_files/figure-docx/fig-heatmap-1.png" id="29" name="Picture"/>
+                          <pic:cNvPr descr="index_files/figure-docx/fig-heatmap-1.png" id="34" name="Picture"/>
                           <pic:cNvPicPr>
                             <a:picLocks noChangeArrowheads="1" noChangeAspect="1"/>
                           </pic:cNvPicPr>
                         </pic:nvPicPr>
                         <pic:blipFill>
-                          <a:blip r:embed="rId27"/>
+                          <a:blip r:embed="rId32"/>
                           <a:stretch>
                             <a:fillRect/>
                           </a:stretch>
@@ -1116,16 +1214,16 @@
               <w:pStyle w:val="ImageCaption"/>
             </w:pPr>
             <w:r>
-              <w:t xml:space="preserve">Figure 1: Share of each department’s municipalities absent from the file in each year, departments ordered by overall share missing.</w:t>
+              <w:t xml:space="preserve">Figure 2: Share of each department’s municipalities absent from the file in each year, departments ordered by overall share missing.</w:t>
             </w:r>
           </w:p>
-          <w:bookmarkEnd w:id="30"/>
+          <w:bookmarkEnd w:id="35"/>
         </w:tc>
       </w:tr>
     </w:tbl>
-    <w:bookmarkEnd w:id="31"/>
-    <w:bookmarkEnd w:id="32"/>
-    <w:bookmarkStart w:id="33" w:name="missing-years"/>
+    <w:bookmarkEnd w:id="36"/>
+    <w:bookmarkEnd w:id="37"/>
+    <w:bookmarkStart w:id="38" w:name="missing-years"/>
     <w:p>
       <w:pPr>
         <w:pStyle w:val="Heading2"/>
@@ -1142,8 +1240,8 @@
         <w:t xml:space="preserve">At the national level there are no missing years: every calendar year from 2007 to 2024 is present (0 gaps). The file was downloaded in September 2026, so the absence of 2025 most likely reflects publication lag. At the municipal level, 732 municipalities (67%) are observed in all 18 years. Of the rest, 101 start after 2007, 89 end before 2024, and 259 have at least one interruption inside their series, accounting for 460 missing municipality-years.</w:t>
       </w:r>
     </w:p>
-    <w:bookmarkEnd w:id="33"/>
-    <w:bookmarkStart w:id="34" w:name="answer-1"/>
+    <w:bookmarkEnd w:id="38"/>
+    <w:bookmarkStart w:id="39" w:name="answer-1"/>
     <w:p>
       <w:pPr>
         <w:pStyle w:val="Heading2"/>
@@ -1160,8 +1258,8 @@
         <w:t xml:space="preserve">The data are complete in the overall IRCA and in calendar coverage. They are incomplete in the urban and rural components, which are missing in a large and time-varying share of rows, and as a panel of municipalities, with about 6% of municipality-years absent, most of them in Chocó and the Amazon and Orinoco departments, and a quarter of municipalities with interrupted series. Analyses that use the components, compare departments or follow individual municipalities over time must account for this missingness explicitly; analyses of the overall index at the national level can proceed with fewer reservations.</w:t>
       </w:r>
     </w:p>
-    <w:bookmarkEnd w:id="34"/>
-    <w:bookmarkEnd w:id="35"/>
+    <w:bookmarkEnd w:id="39"/>
+    <w:bookmarkEnd w:id="40"/>
     <w:sectPr>
       <w:footnotePr>
         <w:numRestart w:val="eachSect"/>

</xml_diff>

<commit_message>
feat(manuscript): rebuild Q1 and Q2 write-up
Replace the previous manuscript with an independently structured
analysis. Import, cleaning and 27 structural assertions move to
R/prepare.R at the repo root, so the pipeline runs standalone and
the render fails if the data file changes. Completeness is assessed
against two frames, the file's own panel and the DANE 2020 municipal
register, and the map, ND-by-year chart and department heatmap are
drawn from those. PLAN.md records the approved plan and
references.bib adds the citations.

Assisted-by: Claude claude-fable-5-1
</commit_message>
<xml_diff>
--- a/manuscript/_manuscript/index.docx
+++ b/manuscript/_manuscript/index.docx
@@ -7,7 +7,7 @@
         <w:pStyle w:val="Title"/>
       </w:pPr>
       <w:r>
-        <w:t xml:space="preserve">Structure and completeness of Colombia’s drinking-water quality data</w:t>
+        <w:t xml:space="preserve">What the Colombian drinking-water quality file measures, and how much of it is there</w:t>
       </w:r>
     </w:p>
     <w:p>
@@ -63,16 +63,16 @@
         <w:pStyle w:val="Abstract"/>
       </w:pPr>
       <w:r>
-        <w:t xml:space="preserve">This note answers the first two questions posed for the Colombian drinking-water quality dataset held in this repository. Question 1 asks for the observational unit of the measurements: it is the municipality-year. Each row carries the annual Water Quality Risk Index (IRCA) and its risk category for one municipality in one calendar year, for the municipality as a whole and for its urban and rural areas, and a smaller set of department-year aggregates is stacked in the same file. Question 2 asks how complete the data are. The overall IRCA is never missing and every calendar year from 2007 to 2024 is present, but the rural component is unavailable in about half of all municipal rows, about 6% of municipality-years are absent from the implied panel, with the shortfall concentrated in Chocó and the Amazon and Orinoco departments, and roughly a quarter of municipalities have an interrupted series.</w:t>
+        <w:t xml:space="preserve">This note answers the first two questions posed for the Colombian drinking-water quality file held in this repository. Question 1 asks for the observational unit. It is the municipality-year: each row carries the annual Water Quality Risk Index (IRCA) of one municipality in one calendar year, with separate values for the whole municipality, its urban area and its rural area, and department-year aggregates are stacked in the same file. Question 2 asks how complete the data are. The overall IRCA is never missing and every calendar year from 2007 to 2024 is present, but the rural index is unavailable in about half of the municipal rows, about 6% of the municipality-years that the national municipal register implies are absent, two thirds of municipalities have an uninterrupted series, and Chocó is missing more than four fifths of its municipality-years.</w:t>
       </w:r>
     </w:p>
-    <w:bookmarkStart w:id="25" w:name="introduction"/>
+    <w:bookmarkStart w:id="26" w:name="data-and-validation"/>
     <w:p>
       <w:pPr>
         <w:pStyle w:val="Heading1"/>
       </w:pPr>
       <w:r>
-        <w:t xml:space="preserve">1. Introduction</w:t>
+        <w:t xml:space="preserve">1. Data and validation</w:t>
       </w:r>
     </w:p>
     <w:p>
@@ -80,7 +80,7 @@
         <w:pStyle w:val="FirstParagraph"/>
       </w:pPr>
       <w:r>
-        <w:t xml:space="preserve">The repository holds one data file,</w:t>
+        <w:t xml:space="preserve">The repository holds one file,</w:t>
       </w:r>
       <w:r>
         <w:t xml:space="preserve"> </w:t>
@@ -92,7 +92,16 @@
         <w:t xml:space="preserve">Calidad_del_Agua_para_Consumo_Humano_en_Colombia_20260915.csv</w:t>
       </w:r>
       <w:r>
-        <w:t xml:space="preserve">, from Colombia’s national drinking-water surveillance programme. Water samples collected by territorial health authorities are consolidated into the</w:t>
+        <w:t xml:space="preserve">, published on Colombia’s open-data portal from the national drinking-water surveillance system</w:t>
+      </w:r>
+      <w:r>
+        <w:t xml:space="preserve"> </w:t>
+      </w:r>
+      <w:r>
+        <w:t xml:space="preserve">(Instituto Nacional de Salud and Ministerio de Salud y Protección Social 2026)</w:t>
+      </w:r>
+      <w:r>
+        <w:t xml:space="preserve">. Territorial health authorities sample water supplies through the year, and the samples are consolidated into the</w:t>
       </w:r>
       <w:r>
         <w:t xml:space="preserve"> </w:t>
@@ -108,28 +117,24 @@
         <w:t xml:space="preserve"> </w:t>
       </w:r>
       <w:r>
-        <w:t xml:space="preserve">(IRCA), a score from 0 to 100 that measures deviation from the standards of Resolution 2115 of 2007 and is mapped onto risk categories from</w:t>
-      </w:r>
-      <w:r>
-        <w:t xml:space="preserve"> </w:t>
-      </w:r>
-      <w:r>
-        <w:t xml:space="preserve">“no risk”</w:t>
-      </w:r>
-      <w:r>
-        <w:t xml:space="preserve"> </w:t>
-      </w:r>
-      <w:r>
-        <w:t xml:space="preserve">to</w:t>
-      </w:r>
-      <w:r>
-        <w:t xml:space="preserve"> </w:t>
-      </w:r>
-      <w:r>
-        <w:t xml:space="preserve">“sanitarily unviable”</w:t>
-      </w:r>
-      <w:r>
-        <w:t xml:space="preserve">. This note answers the first two questions in</w:t>
+        <w:t xml:space="preserve">(IRCA), a 0 to 100 score of deviation from the standards of Resolution 2115 of 2007, classed into five risk bands: no risk (0 to 5), low (5.1 to 14), medium (14.1 to 35), high (35.1 to 80) and sanitarily unviable (above 80)</w:t>
+      </w:r>
+      <w:r>
+        <w:t xml:space="preserve"> </w:t>
+      </w:r>
+      <w:r>
+        <w:t xml:space="preserve">(Ministerio de la Protección Social and Ministerio de Ambiente, Vivienda y Desarrollo Territorial 2007)</w:t>
+      </w:r>
+      <w:r>
+        <w:t xml:space="preserve">.</w:t>
+      </w:r>
+    </w:p>
+    <w:p>
+      <w:pPr>
+        <w:pStyle w:val="BodyText"/>
+      </w:pPr>
+      <w:r>
+        <w:t xml:space="preserve">The file was imported with every column as text, and the structure that the rest of this note relies on was asserted in code rather than assumed: the column set, the row count, the absence of empty cells, the format of the codes, the parsing of the year, the fact that the token</w:t>
       </w:r>
       <w:r>
         <w:t xml:space="preserve"> </w:t>
@@ -138,33 +143,32 @@
         <w:rPr>
           <w:rStyle w:val="VerbatimChar"/>
         </w:rPr>
-        <w:t xml:space="preserve">questions.md</w:t>
-      </w:r>
-      <w:r>
-        <w:t xml:space="preserve"> </w:t>
-      </w:r>
-      <w:r>
-        <w:t xml:space="preserve">from the structure of the file alone. The file was imported with every column as text, so that nothing was coerced silently; the year, stored as text with a thousands separator, was converted to an integer. All numbers below are computed from the file when the document is rendered.</w:t>
-      </w:r>
-      <w:r>
-        <w:t xml:space="preserve"> </w:t>
-      </w:r>
-      <w:hyperlink w:anchor="fig-map">
+        <w:t xml:space="preserve">ND</w:t>
+      </w:r>
+      <w:r>
+        <w:t xml:space="preserve"> </w:t>
+      </w:r>
+      <w:r>
+        <w:t xml:space="preserve">is the only non-numeric value in the index columns, the spelling set of the risk labels, and the uniqueness of the keys (27 checks, all passing at render time).</w:t>
+      </w:r>
+      <w:r>
+        <w:t xml:space="preserve"> </w:t>
+      </w:r>
+      <w:hyperlink w:anchor="tbl-columns">
         <w:r>
           <w:rPr>
             <w:rStyle w:val="Hyperlink"/>
           </w:rPr>
-          <w:t xml:space="preserve">Figure 1</w:t>
+          <w:t xml:space="preserve">Table 1</w:t>
         </w:r>
       </w:hyperlink>
       <w:r>
         <w:t xml:space="preserve"> </w:t>
       </w:r>
       <w:r>
-        <w:t xml:space="preserve">gives a first view of the measurement: the annual IRCA of every municipality in 2019, the year in which the largest number of municipalities is reported, drawn on the DANE 2020 municipal boundaries and classed into the official risk categories of Resolution 2115.</w:t>
+        <w:t xml:space="preserve">describes the columns and what was done to each on import.</w:t>
       </w:r>
     </w:p>
-    <w:bookmarkStart w:id="24" w:name="cell-fig-map"/>
     <w:tbl>
       <w:tblPr>
         <w:tblStyle w:val="Table"/>
@@ -178,7 +182,834 @@
       <w:tr>
         <w:tc>
           <w:tcPr/>
-          <w:bookmarkStart w:id="23" w:name="fig-map"/>
+          <w:bookmarkStart w:id="20" w:name="tbl-columns"/>
+          <w:p>
+            <w:pPr>
+              <w:jc w:val="center"/>
+            </w:pPr>
+            <w:pPr>
+              <w:jc w:val="start"/>
+              <w:spacing w:before="200"/>
+              <w:pStyle w:val="ImageCaption"/>
+            </w:pPr>
+            <w:r>
+              <w:t xml:space="preserve">Table 1: Columns of the data file, their role, and how each was treated on import.</w:t>
+            </w:r>
+          </w:p>
+          <w:tbl>
+            <w:tblPr>
+              <w:tblStyle w:val="Table"/>
+              <w:tblW w:type="pct" w:w="5000"/>
+              <w:tblLayout w:type="fixed"/>
+              <w:tblLook w:firstRow="1" w:lastRow="0" w:firstColumn="0" w:lastColumn="0" w:noHBand="0" w:noVBand="0" w:val="0020"/>
+            </w:tblPr>
+            <w:tblGrid>
+              <w:gridCol w:w="1656"/>
+              <w:gridCol w:w="864"/>
+              <w:gridCol w:w="1080"/>
+              <w:gridCol w:w="4320"/>
+            </w:tblGrid>
+            <w:tr>
+              <w:trPr>
+                <w:tblHeader w:val="on"/>
+              </w:trPr>
+              <w:tc>
+                <w:tcPr/>
+                <w:p>
+                  <w:pPr>
+                    <w:pStyle w:val="Compact"/>
+                    <w:jc w:val="left"/>
+                    <w:jc w:val="center"/>
+                  </w:pPr>
+                  <w:r>
+                    <w:t xml:space="preserve">Column</w:t>
+                  </w:r>
+                </w:p>
+              </w:tc>
+              <w:tc>
+                <w:tcPr/>
+                <w:p>
+                  <w:pPr>
+                    <w:pStyle w:val="Compact"/>
+                    <w:jc w:val="left"/>
+                    <w:jc w:val="center"/>
+                  </w:pPr>
+                  <w:r>
+                    <w:t xml:space="preserve">Role</w:t>
+                  </w:r>
+                </w:p>
+              </w:tc>
+              <w:tc>
+                <w:tcPr/>
+                <w:p>
+                  <w:pPr>
+                    <w:pStyle w:val="Compact"/>
+                    <w:jc w:val="left"/>
+                    <w:jc w:val="center"/>
+                  </w:pPr>
+                  <w:r>
+                    <w:t xml:space="preserve">Cleaned type</w:t>
+                  </w:r>
+                </w:p>
+              </w:tc>
+              <w:tc>
+                <w:tcPr/>
+                <w:p>
+                  <w:pPr>
+                    <w:pStyle w:val="Compact"/>
+                    <w:jc w:val="left"/>
+                    <w:jc w:val="center"/>
+                  </w:pPr>
+                  <w:r>
+                    <w:t xml:space="preserve">Note on import</w:t>
+                  </w:r>
+                </w:p>
+              </w:tc>
+            </w:tr>
+            <w:tr>
+              <w:tc>
+                <w:tcPr/>
+                <w:p>
+                  <w:pPr>
+                    <w:pStyle w:val="Compact"/>
+                    <w:jc w:val="left"/>
+                    <w:jc w:val="center"/>
+                  </w:pPr>
+                  <w:r>
+                    <w:t xml:space="preserve">DepartamentoCodigo</w:t>
+                  </w:r>
+                </w:p>
+              </w:tc>
+              <w:tc>
+                <w:tcPr/>
+                <w:p>
+                  <w:pPr>
+                    <w:pStyle w:val="Compact"/>
+                    <w:jc w:val="left"/>
+                    <w:jc w:val="center"/>
+                  </w:pPr>
+                  <w:r>
+                    <w:t xml:space="preserve">Identifier</w:t>
+                  </w:r>
+                </w:p>
+              </w:tc>
+              <w:tc>
+                <w:tcPr/>
+                <w:p>
+                  <w:pPr>
+                    <w:pStyle w:val="Compact"/>
+                    <w:jc w:val="left"/>
+                    <w:jc w:val="center"/>
+                  </w:pPr>
+                  <w:r>
+                    <w:t xml:space="preserve">Character key</w:t>
+                  </w:r>
+                </w:p>
+              </w:tc>
+              <w:tc>
+                <w:tcPr/>
+                <w:p>
+                  <w:pPr>
+                    <w:pStyle w:val="Compact"/>
+                    <w:jc w:val="left"/>
+                    <w:jc w:val="center"/>
+                  </w:pPr>
+                  <w:r>
+                    <w:t xml:space="preserve">Two-digit DANE code, leading zero kept</w:t>
+                  </w:r>
+                </w:p>
+              </w:tc>
+            </w:tr>
+            <w:tr>
+              <w:tc>
+                <w:tcPr/>
+                <w:p>
+                  <w:pPr>
+                    <w:pStyle w:val="Compact"/>
+                    <w:jc w:val="left"/>
+                    <w:jc w:val="center"/>
+                  </w:pPr>
+                  <w:r>
+                    <w:t xml:space="preserve">Departamento</w:t>
+                  </w:r>
+                </w:p>
+              </w:tc>
+              <w:tc>
+                <w:tcPr/>
+                <w:p>
+                  <w:pPr>
+                    <w:pStyle w:val="Compact"/>
+                    <w:jc w:val="left"/>
+                    <w:jc w:val="center"/>
+                  </w:pPr>
+                  <w:r>
+                    <w:t xml:space="preserve">Identifier</w:t>
+                  </w:r>
+                </w:p>
+              </w:tc>
+              <w:tc>
+                <w:tcPr/>
+                <w:p>
+                  <w:pPr>
+                    <w:pStyle w:val="Compact"/>
+                    <w:jc w:val="left"/>
+                    <w:jc w:val="center"/>
+                  </w:pPr>
+                  <w:r>
+                    <w:t xml:space="preserve">Label</w:t>
+                  </w:r>
+                </w:p>
+              </w:tc>
+              <w:tc>
+                <w:tcPr/>
+                <w:p>
+                  <w:pPr>
+                    <w:pStyle w:val="Compact"/>
+                    <w:jc w:val="left"/>
+                    <w:jc w:val="center"/>
+                  </w:pPr>
+                  <w:r>
+                    <w:t xml:space="preserve">Name; one department has two spellings</w:t>
+                  </w:r>
+                </w:p>
+              </w:tc>
+            </w:tr>
+            <w:tr>
+              <w:tc>
+                <w:tcPr/>
+                <w:p>
+                  <w:pPr>
+                    <w:pStyle w:val="Compact"/>
+                    <w:jc w:val="left"/>
+                    <w:jc w:val="center"/>
+                  </w:pPr>
+                  <w:r>
+                    <w:t xml:space="preserve">MunicipioCodigo</w:t>
+                  </w:r>
+                </w:p>
+              </w:tc>
+              <w:tc>
+                <w:tcPr/>
+                <w:p>
+                  <w:pPr>
+                    <w:pStyle w:val="Compact"/>
+                    <w:jc w:val="left"/>
+                    <w:jc w:val="center"/>
+                  </w:pPr>
+                  <w:r>
+                    <w:t xml:space="preserve">Identifier</w:t>
+                  </w:r>
+                </w:p>
+              </w:tc>
+              <w:tc>
+                <w:tcPr/>
+                <w:p>
+                  <w:pPr>
+                    <w:pStyle w:val="Compact"/>
+                    <w:jc w:val="left"/>
+                    <w:jc w:val="center"/>
+                  </w:pPr>
+                  <w:r>
+                    <w:t xml:space="preserve">Character key</w:t>
+                  </w:r>
+                </w:p>
+              </w:tc>
+              <w:tc>
+                <w:tcPr/>
+                <w:p>
+                  <w:pPr>
+                    <w:pStyle w:val="Compact"/>
+                    <w:jc w:val="left"/>
+                    <w:jc w:val="center"/>
+                  </w:pPr>
+                  <w:r>
+                    <w:t xml:space="preserve">Five-digit DANE code;</w:t>
+                  </w:r>
+                  <w:r>
+                    <w:t xml:space="preserve"> </w:t>
+                  </w:r>
+                  <w:r>
+                    <w:rPr>
+                      <w:rStyle w:val="VerbatimChar"/>
+                    </w:rPr>
+                    <w:t xml:space="preserve">#TODOS</w:t>
+                  </w:r>
+                  <w:r>
+                    <w:t xml:space="preserve"> </w:t>
+                  </w:r>
+                  <w:r>
+                    <w:t xml:space="preserve">marks a department aggregate</w:t>
+                  </w:r>
+                </w:p>
+              </w:tc>
+            </w:tr>
+            <w:tr>
+              <w:tc>
+                <w:tcPr/>
+                <w:p>
+                  <w:pPr>
+                    <w:pStyle w:val="Compact"/>
+                    <w:jc w:val="left"/>
+                    <w:jc w:val="center"/>
+                  </w:pPr>
+                  <w:r>
+                    <w:t xml:space="preserve">Municipio</w:t>
+                  </w:r>
+                </w:p>
+              </w:tc>
+              <w:tc>
+                <w:tcPr/>
+                <w:p>
+                  <w:pPr>
+                    <w:pStyle w:val="Compact"/>
+                    <w:jc w:val="left"/>
+                    <w:jc w:val="center"/>
+                  </w:pPr>
+                  <w:r>
+                    <w:t xml:space="preserve">Identifier</w:t>
+                  </w:r>
+                </w:p>
+              </w:tc>
+              <w:tc>
+                <w:tcPr/>
+                <w:p>
+                  <w:pPr>
+                    <w:pStyle w:val="Compact"/>
+                    <w:jc w:val="left"/>
+                    <w:jc w:val="center"/>
+                  </w:pPr>
+                  <w:r>
+                    <w:t xml:space="preserve">Label</w:t>
+                  </w:r>
+                </w:p>
+              </w:tc>
+              <w:tc>
+                <w:tcPr/>
+                <w:p>
+                  <w:pPr>
+                    <w:pStyle w:val="Compact"/>
+                    <w:jc w:val="left"/>
+                    <w:jc w:val="center"/>
+                  </w:pPr>
+                  <w:r>
+                    <w:t xml:space="preserve">Name; not stable across years</w:t>
+                  </w:r>
+                </w:p>
+              </w:tc>
+            </w:tr>
+            <w:tr>
+              <w:tc>
+                <w:tcPr/>
+                <w:p>
+                  <w:pPr>
+                    <w:pStyle w:val="Compact"/>
+                    <w:jc w:val="left"/>
+                    <w:jc w:val="center"/>
+                  </w:pPr>
+                  <w:r>
+                    <w:t xml:space="preserve">Año</w:t>
+                  </w:r>
+                </w:p>
+              </w:tc>
+              <w:tc>
+                <w:tcPr/>
+                <w:p>
+                  <w:pPr>
+                    <w:pStyle w:val="Compact"/>
+                    <w:jc w:val="left"/>
+                    <w:jc w:val="center"/>
+                  </w:pPr>
+                  <w:r>
+                    <w:t xml:space="preserve">Identifier</w:t>
+                  </w:r>
+                </w:p>
+              </w:tc>
+              <w:tc>
+                <w:tcPr/>
+                <w:p>
+                  <w:pPr>
+                    <w:pStyle w:val="Compact"/>
+                    <w:jc w:val="left"/>
+                    <w:jc w:val="center"/>
+                  </w:pPr>
+                  <w:r>
+                    <w:t xml:space="preserve">Integer</w:t>
+                  </w:r>
+                </w:p>
+              </w:tc>
+              <w:tc>
+                <w:tcPr/>
+                <w:p>
+                  <w:pPr>
+                    <w:pStyle w:val="Compact"/>
+                    <w:jc w:val="left"/>
+                    <w:jc w:val="center"/>
+                  </w:pPr>
+                  <w:r>
+                    <w:t xml:space="preserve">Stored as text with a thousands separator (2,024)</w:t>
+                  </w:r>
+                </w:p>
+              </w:tc>
+            </w:tr>
+            <w:tr>
+              <w:tc>
+                <w:tcPr/>
+                <w:p>
+                  <w:pPr>
+                    <w:pStyle w:val="Compact"/>
+                    <w:jc w:val="left"/>
+                    <w:jc w:val="center"/>
+                  </w:pPr>
+                  <w:r>
+                    <w:t xml:space="preserve">IRCA</w:t>
+                  </w:r>
+                </w:p>
+              </w:tc>
+              <w:tc>
+                <w:tcPr/>
+                <w:p>
+                  <w:pPr>
+                    <w:pStyle w:val="Compact"/>
+                    <w:jc w:val="left"/>
+                    <w:jc w:val="center"/>
+                  </w:pPr>
+                  <w:r>
+                    <w:t xml:space="preserve">Measurement</w:t>
+                  </w:r>
+                </w:p>
+              </w:tc>
+              <w:tc>
+                <w:tcPr/>
+                <w:p>
+                  <w:pPr>
+                    <w:pStyle w:val="Compact"/>
+                    <w:jc w:val="left"/>
+                    <w:jc w:val="center"/>
+                  </w:pPr>
+                  <w:r>
+                    <w:t xml:space="preserve">Numeric 0–100</w:t>
+                  </w:r>
+                </w:p>
+              </w:tc>
+              <w:tc>
+                <w:tcPr/>
+                <w:p>
+                  <w:pPr>
+                    <w:pStyle w:val="Compact"/>
+                    <w:jc w:val="left"/>
+                    <w:jc w:val="center"/>
+                  </w:pPr>
+                  <w:r>
+                    <w:t xml:space="preserve">Annual index, whole unit</w:t>
+                  </w:r>
+                </w:p>
+              </w:tc>
+            </w:tr>
+            <w:tr>
+              <w:tc>
+                <w:tcPr/>
+                <w:p>
+                  <w:pPr>
+                    <w:pStyle w:val="Compact"/>
+                    <w:jc w:val="left"/>
+                    <w:jc w:val="center"/>
+                  </w:pPr>
+                  <w:r>
+                    <w:t xml:space="preserve">Nivel de riesgo</w:t>
+                  </w:r>
+                </w:p>
+              </w:tc>
+              <w:tc>
+                <w:tcPr/>
+                <w:p>
+                  <w:pPr>
+                    <w:pStyle w:val="Compact"/>
+                    <w:jc w:val="left"/>
+                    <w:jc w:val="center"/>
+                  </w:pPr>
+                  <w:r>
+                    <w:t xml:space="preserve">Measurement</w:t>
+                  </w:r>
+                </w:p>
+              </w:tc>
+              <w:tc>
+                <w:tcPr/>
+                <w:p>
+                  <w:pPr>
+                    <w:pStyle w:val="Compact"/>
+                    <w:jc w:val="left"/>
+                    <w:jc w:val="center"/>
+                  </w:pPr>
+                  <w:r>
+                    <w:t xml:space="preserve">5-level factor</w:t>
+                  </w:r>
+                </w:p>
+              </w:tc>
+              <w:tc>
+                <w:tcPr/>
+                <w:p>
+                  <w:pPr>
+                    <w:pStyle w:val="Compact"/>
+                    <w:jc w:val="left"/>
+                    <w:jc w:val="center"/>
+                  </w:pPr>
+                  <w:r>
+                    <w:t xml:space="preserve">Two spellings per band mapped to one</w:t>
+                  </w:r>
+                </w:p>
+              </w:tc>
+            </w:tr>
+            <w:tr>
+              <w:tc>
+                <w:tcPr/>
+                <w:p>
+                  <w:pPr>
+                    <w:pStyle w:val="Compact"/>
+                    <w:jc w:val="left"/>
+                    <w:jc w:val="center"/>
+                  </w:pPr>
+                  <w:r>
+                    <w:t xml:space="preserve">IRCAurbano</w:t>
+                  </w:r>
+                </w:p>
+              </w:tc>
+              <w:tc>
+                <w:tcPr/>
+                <w:p>
+                  <w:pPr>
+                    <w:pStyle w:val="Compact"/>
+                    <w:jc w:val="left"/>
+                    <w:jc w:val="center"/>
+                  </w:pPr>
+                  <w:r>
+                    <w:t xml:space="preserve">Measurement</w:t>
+                  </w:r>
+                </w:p>
+              </w:tc>
+              <w:tc>
+                <w:tcPr/>
+                <w:p>
+                  <w:pPr>
+                    <w:pStyle w:val="Compact"/>
+                    <w:jc w:val="left"/>
+                    <w:jc w:val="center"/>
+                  </w:pPr>
+                  <w:r>
+                    <w:t xml:space="preserve">Numeric 0–100</w:t>
+                  </w:r>
+                </w:p>
+              </w:tc>
+              <w:tc>
+                <w:tcPr/>
+                <w:p>
+                  <w:pPr>
+                    <w:pStyle w:val="Compact"/>
+                    <w:jc w:val="left"/>
+                    <w:jc w:val="center"/>
+                  </w:pPr>
+                  <w:r>
+                    <w:t xml:space="preserve">Urban area;</w:t>
+                  </w:r>
+                  <w:r>
+                    <w:t xml:space="preserve"> </w:t>
+                  </w:r>
+                  <w:r>
+                    <w:rPr>
+                      <w:rStyle w:val="VerbatimChar"/>
+                    </w:rPr>
+                    <w:t xml:space="preserve">ND</w:t>
+                  </w:r>
+                  <w:r>
+                    <w:t xml:space="preserve"> </w:t>
+                  </w:r>
+                  <w:r>
+                    <w:t xml:space="preserve">read as missing</w:t>
+                  </w:r>
+                </w:p>
+              </w:tc>
+            </w:tr>
+            <w:tr>
+              <w:tc>
+                <w:tcPr/>
+                <w:p>
+                  <w:pPr>
+                    <w:pStyle w:val="Compact"/>
+                    <w:jc w:val="left"/>
+                    <w:jc w:val="center"/>
+                  </w:pPr>
+                  <w:r>
+                    <w:t xml:space="preserve">Nivel de riesgo urbano</w:t>
+                  </w:r>
+                </w:p>
+              </w:tc>
+              <w:tc>
+                <w:tcPr/>
+                <w:p>
+                  <w:pPr>
+                    <w:pStyle w:val="Compact"/>
+                    <w:jc w:val="left"/>
+                    <w:jc w:val="center"/>
+                  </w:pPr>
+                  <w:r>
+                    <w:t xml:space="preserve">Measurement</w:t>
+                  </w:r>
+                </w:p>
+              </w:tc>
+              <w:tc>
+                <w:tcPr/>
+                <w:p>
+                  <w:pPr>
+                    <w:pStyle w:val="Compact"/>
+                    <w:jc w:val="left"/>
+                    <w:jc w:val="center"/>
+                  </w:pPr>
+                  <w:r>
+                    <w:t xml:space="preserve">5-level factor</w:t>
+                  </w:r>
+                </w:p>
+              </w:tc>
+              <w:tc>
+                <w:tcPr/>
+                <w:p>
+                  <w:pPr>
+                    <w:pStyle w:val="Compact"/>
+                    <w:jc w:val="left"/>
+                    <w:jc w:val="center"/>
+                  </w:pPr>
+                  <w:r>
+                    <w:t xml:space="preserve">Missing when the value is</w:t>
+                  </w:r>
+                  <w:r>
+                    <w:t xml:space="preserve"> </w:t>
+                  </w:r>
+                  <w:r>
+                    <w:rPr>
+                      <w:rStyle w:val="VerbatimChar"/>
+                    </w:rPr>
+                    <w:t xml:space="preserve">ND</w:t>
+                  </w:r>
+                </w:p>
+              </w:tc>
+            </w:tr>
+            <w:tr>
+              <w:tc>
+                <w:tcPr/>
+                <w:p>
+                  <w:pPr>
+                    <w:pStyle w:val="Compact"/>
+                    <w:jc w:val="left"/>
+                    <w:jc w:val="center"/>
+                  </w:pPr>
+                  <w:r>
+                    <w:t xml:space="preserve">IRCArural</w:t>
+                  </w:r>
+                </w:p>
+              </w:tc>
+              <w:tc>
+                <w:tcPr/>
+                <w:p>
+                  <w:pPr>
+                    <w:pStyle w:val="Compact"/>
+                    <w:jc w:val="left"/>
+                    <w:jc w:val="center"/>
+                  </w:pPr>
+                  <w:r>
+                    <w:t xml:space="preserve">Measurement</w:t>
+                  </w:r>
+                </w:p>
+              </w:tc>
+              <w:tc>
+                <w:tcPr/>
+                <w:p>
+                  <w:pPr>
+                    <w:pStyle w:val="Compact"/>
+                    <w:jc w:val="left"/>
+                    <w:jc w:val="center"/>
+                  </w:pPr>
+                  <w:r>
+                    <w:t xml:space="preserve">Numeric 0–100</w:t>
+                  </w:r>
+                </w:p>
+              </w:tc>
+              <w:tc>
+                <w:tcPr/>
+                <w:p>
+                  <w:pPr>
+                    <w:pStyle w:val="Compact"/>
+                    <w:jc w:val="left"/>
+                    <w:jc w:val="center"/>
+                  </w:pPr>
+                  <w:r>
+                    <w:t xml:space="preserve">Rural area;</w:t>
+                  </w:r>
+                  <w:r>
+                    <w:t xml:space="preserve"> </w:t>
+                  </w:r>
+                  <w:r>
+                    <w:rPr>
+                      <w:rStyle w:val="VerbatimChar"/>
+                    </w:rPr>
+                    <w:t xml:space="preserve">ND</w:t>
+                  </w:r>
+                  <w:r>
+                    <w:t xml:space="preserve"> </w:t>
+                  </w:r>
+                  <w:r>
+                    <w:t xml:space="preserve">read as missing</w:t>
+                  </w:r>
+                </w:p>
+              </w:tc>
+            </w:tr>
+            <w:tr>
+              <w:tc>
+                <w:tcPr/>
+                <w:p>
+                  <w:pPr>
+                    <w:pStyle w:val="Compact"/>
+                    <w:jc w:val="left"/>
+                    <w:jc w:val="center"/>
+                  </w:pPr>
+                  <w:r>
+                    <w:t xml:space="preserve">Nivel de riesgo rural</w:t>
+                  </w:r>
+                </w:p>
+              </w:tc>
+              <w:tc>
+                <w:tcPr/>
+                <w:p>
+                  <w:pPr>
+                    <w:pStyle w:val="Compact"/>
+                    <w:jc w:val="left"/>
+                    <w:jc w:val="center"/>
+                  </w:pPr>
+                  <w:r>
+                    <w:t xml:space="preserve">Measurement</w:t>
+                  </w:r>
+                </w:p>
+              </w:tc>
+              <w:tc>
+                <w:tcPr/>
+                <w:p>
+                  <w:pPr>
+                    <w:pStyle w:val="Compact"/>
+                    <w:jc w:val="left"/>
+                    <w:jc w:val="center"/>
+                  </w:pPr>
+                  <w:r>
+                    <w:t xml:space="preserve">5-level factor</w:t>
+                  </w:r>
+                </w:p>
+              </w:tc>
+              <w:tc>
+                <w:tcPr/>
+                <w:p>
+                  <w:pPr>
+                    <w:pStyle w:val="Compact"/>
+                    <w:jc w:val="left"/>
+                    <w:jc w:val="center"/>
+                  </w:pPr>
+                  <w:r>
+                    <w:t xml:space="preserve">Missing when the value is</w:t>
+                  </w:r>
+                  <w:r>
+                    <w:t xml:space="preserve"> </w:t>
+                  </w:r>
+                  <w:r>
+                    <w:rPr>
+                      <w:rStyle w:val="VerbatimChar"/>
+                    </w:rPr>
+                    <w:t xml:space="preserve">ND</w:t>
+                  </w:r>
+                </w:p>
+              </w:tc>
+            </w:tr>
+          </w:tbl>
+          <w:bookmarkEnd w:id="20"/>
+          <w:p/>
+        </w:tc>
+      </w:tr>
+    </w:tbl>
+    <w:p>
+      <w:pPr>
+        <w:pStyle w:val="BodyText"/>
+      </w:pPr>
+      <w:r>
+        <w:t xml:space="preserve">Completeness needs a reference set of units that ought to be present. Two are used. The</w:t>
+      </w:r>
+      <w:r>
+        <w:t xml:space="preserve"> </w:t>
+      </w:r>
+      <w:r>
+        <w:rPr>
+          <w:i/>
+          <w:iCs/>
+        </w:rPr>
+        <w:t xml:space="preserve">internal</w:t>
+      </w:r>
+      <w:r>
+        <w:t xml:space="preserve"> </w:t>
+      </w:r>
+      <w:r>
+        <w:t xml:space="preserve">frame is every municipality code that appears at least once, crossed with every year that appears at least once; it asks whether the file is balanced on its own terms. The</w:t>
+      </w:r>
+      <w:r>
+        <w:t xml:space="preserve"> </w:t>
+      </w:r>
+      <w:r>
+        <w:rPr>
+          <w:i/>
+          <w:iCs/>
+        </w:rPr>
+        <w:t xml:space="preserve">external</w:t>
+      </w:r>
+      <w:r>
+        <w:t xml:space="preserve"> </w:t>
+      </w:r>
+      <w:r>
+        <w:t xml:space="preserve">frame is the municipal register of the DANE Marco Geoestadístico Nacional 2020</w:t>
+      </w:r>
+      <w:r>
+        <w:t xml:space="preserve"> </w:t>
+      </w:r>
+      <w:r>
+        <w:t xml:space="preserve">(Departamento Administrativo Nacional de Estadística (DANE) 2020)</w:t>
+      </w:r>
+      <w:r>
+        <w:t xml:space="preserve">, which lists 1,122 units, minus the 19 non-municipalised areas of Amazonas, Guainía and Vaupés, which have no municipal administration and never appear in the file; that leaves 1,103 municipalities and asks whether the country is covered. The register is a 2020 snapshot, so the few municipalities created after 2007 slightly overstate the external shortfall in early years.</w:t>
+      </w:r>
+      <w:r>
+        <w:t xml:space="preserve"> </w:t>
+      </w:r>
+      <w:hyperlink w:anchor="fig-map">
+        <w:r>
+          <w:rPr>
+            <w:rStyle w:val="Hyperlink"/>
+          </w:rPr>
+          <w:t xml:space="preserve">Figure 1</w:t>
+        </w:r>
+      </w:hyperlink>
+      <w:r>
+        <w:t xml:space="preserve"> </w:t>
+      </w:r>
+      <w:r>
+        <w:t xml:space="preserve">shows the measurement and the coverage on that register.</w:t>
+      </w:r>
+    </w:p>
+    <w:bookmarkStart w:id="25" w:name="cell-fig-map"/>
+    <w:tbl>
+      <w:tblPr>
+        <w:tblStyle w:val="Table"/>
+        <w:tblW w:type="pct" w:w="5000"/>
+        <w:tblLayout w:type="fixed"/>
+        <w:tblLook w:firstRow="0" w:lastRow="0" w:firstColumn="0" w:lastColumn="0" w:noHBand="0" w:noVBand="0" w:val="0000"/>
+      </w:tblPr>
+      <w:tblGrid>
+        <w:gridCol w:w="7920"/>
+      </w:tblGrid>
+      <w:tr>
+        <w:tc>
+          <w:tcPr/>
+          <w:bookmarkStart w:id="24" w:name="fig-map"/>
           <w:p>
             <w:pPr>
               <w:pStyle w:val="Compact"/>
@@ -187,20 +1018,20 @@
             <w:r>
               <w:drawing>
                 <wp:inline>
-                  <wp:extent cx="5334000" cy="5087815"/>
+                  <wp:extent cx="5334000" cy="3774830"/>
                   <wp:effectExtent b="0" l="0" r="0" t="0"/>
-                  <wp:docPr descr="" title="" id="21" name="Picture"/>
+                  <wp:docPr descr="" title="" id="22" name="Picture"/>
                   <a:graphic>
                     <a:graphicData uri="http://schemas.openxmlformats.org/drawingml/2006/picture">
                       <pic:pic>
                         <pic:nvPicPr>
-                          <pic:cNvPr descr="index_files/figure-docx/fig-map-1.png" id="22" name="Picture"/>
+                          <pic:cNvPr descr="index_files/figure-docx/fig-map-1.png" id="23" name="Picture"/>
                           <pic:cNvPicPr>
                             <a:picLocks noChangeArrowheads="1" noChangeAspect="1"/>
                           </pic:cNvPicPr>
                         </pic:nvPicPr>
                         <pic:blipFill>
-                          <a:blip r:embed="rId20"/>
+                          <a:blip r:embed="rId21"/>
                           <a:stretch>
                             <a:fillRect/>
                           </a:stretch>
@@ -208,7 +1039,7 @@
                         <pic:spPr bwMode="auto">
                           <a:xfrm>
                             <a:off x="0" y="0"/>
-                            <a:ext cx="5334000" cy="5087815"/>
+                            <a:ext cx="5334000" cy="3774830"/>
                           </a:xfrm>
                           <a:prstGeom prst="rect">
                             <a:avLst/>
@@ -237,21 +1068,21 @@
               <w:pStyle w:val="ImageCaption"/>
             </w:pPr>
             <w:r>
-              <w:t xml:space="preserve">Figure 1: Annual IRCA by municipality in 2019, the most complete year in the file, classed into the risk categories of Resolution 2115 of 2007. Grey municipalities have no record for that year. The Archipelago of San Andrés is outside the frame. Boundaries: DANE Marco Geoestadístico Nacional 2020.</w:t>
+              <w:t xml:space="preserve">Figure 1: Left: annual IRCA by municipality in 2019, the year with the most municipalities reported, classed into the risk bands of Resolution 2115. Right: number of years, out of 18, in which each municipality appears in the file; municipalities that never appear are outlined in orange. Non-municipalised areas are not expected in the file. The Archipelago of San Andrés lies outside the frame. Boundaries: DANE 2020.</w:t>
             </w:r>
           </w:p>
-          <w:bookmarkEnd w:id="23"/>
+          <w:bookmarkEnd w:id="24"/>
         </w:tc>
       </w:tr>
     </w:tbl>
-    <w:bookmarkEnd w:id="24"/>
+    <w:bookmarkEnd w:id="25"/>
     <w:p>
       <w:r>
         <w:br w:type="page"/>
       </w:r>
     </w:p>
-    <w:bookmarkEnd w:id="25"/>
-    <w:bookmarkStart w:id="30" w:name="Xa68b6d5b5acbd028757e26f1c3e8cbb9e372abd"/>
+    <w:bookmarkEnd w:id="26"/>
+    <w:bookmarkStart w:id="32" w:name="Xa68b6d5b5acbd028757e26f1c3e8cbb9e372abd"/>
     <w:p>
       <w:pPr>
         <w:pStyle w:val="Heading1"/>
@@ -260,13 +1091,13 @@
         <w:t xml:space="preserve">2. Question 1: What is the observational unit?</w:t>
       </w:r>
     </w:p>
-    <w:bookmarkStart w:id="27" w:name="structure-of-the-file"/>
+    <w:bookmarkStart w:id="28" w:name="what-a-row-looks-like"/>
     <w:p>
       <w:pPr>
         <w:pStyle w:val="Heading2"/>
       </w:pPr>
       <w:r>
-        <w:t xml:space="preserve">2.1 Structure of the file</w:t>
+        <w:t xml:space="preserve">2.1 What a row looks like</w:t>
       </w:r>
     </w:p>
     <w:p>
@@ -274,18 +1105,54 @@
         <w:pStyle w:val="FirstParagraph"/>
       </w:pPr>
       <w:r>
-        <w:t xml:space="preserve">The file has 19,160 rows and 11 columns (</w:t>
-      </w:r>
-      <w:hyperlink w:anchor="tbl-vars">
+        <w:t xml:space="preserve">The file has 19,160 rows and 11 columns.</w:t>
+      </w:r>
+      <w:r>
+        <w:t xml:space="preserve"> </w:t>
+      </w:r>
+      <w:hyperlink w:anchor="tbl-example">
         <w:r>
           <w:rPr>
             <w:rStyle w:val="Hyperlink"/>
           </w:rPr>
-          <w:t xml:space="preserve">Table 1</w:t>
+          <w:t xml:space="preserve">Table 2</w:t>
         </w:r>
       </w:hyperlink>
       <w:r>
-        <w:t xml:space="preserve">). Four columns identify a place, one identifies a calendar year, and six are measurements: a numeric IRCA and its risk category, reported for the whole territorial unit, for its urban area and for its rural area.</w:t>
+        <w:t xml:space="preserve"> </w:t>
+      </w:r>
+      <w:r>
+        <w:t xml:space="preserve">reproduces four rows verbatim. Each row names a place and a year and reports three indices: one for the whole territorial unit, one for its urban area and one for its rural area, each accompanied in the full file by a risk band derived from it. The same municipality code recurs year after year, so a row is not a place but a place in a year. The name attached to a code can change between years while the code stays fixed. The token</w:t>
+      </w:r>
+      <w:r>
+        <w:t xml:space="preserve"> </w:t>
+      </w:r>
+      <w:r>
+        <w:rPr>
+          <w:rStyle w:val="VerbatimChar"/>
+        </w:rPr>
+        <w:t xml:space="preserve">ND</w:t>
+      </w:r>
+      <w:r>
+        <w:t xml:space="preserve"> </w:t>
+      </w:r>
+      <w:r>
+        <w:t xml:space="preserve">stands in for a component that was not reported. The fourth row carries</w:t>
+      </w:r>
+      <w:r>
+        <w:t xml:space="preserve"> </w:t>
+      </w:r>
+      <w:r>
+        <w:rPr>
+          <w:rStyle w:val="VerbatimChar"/>
+        </w:rPr>
+        <w:t xml:space="preserve">#TODOS</w:t>
+      </w:r>
+      <w:r>
+        <w:t xml:space="preserve"> </w:t>
+      </w:r>
+      <w:r>
+        <w:t xml:space="preserve">in place of a municipality: it describes the department as a whole for that year, and 569 such rows are interleaved with the 18,591 municipal rows.</w:t>
       </w:r>
     </w:p>
     <w:tbl>
@@ -301,7 +1168,7 @@
       <w:tr>
         <w:tc>
           <w:tcPr/>
-          <w:bookmarkStart w:id="26" w:name="tbl-vars"/>
+          <w:bookmarkStart w:id="27" w:name="tbl-example"/>
           <w:p>
             <w:pPr>
               <w:jc w:val="center"/>
@@ -312,7 +1179,7 @@
               <w:pStyle w:val="ImageCaption"/>
             </w:pPr>
             <w:r>
-              <w:t xml:space="preserve">Table 1: Columns of the data file and their interpretation.</w:t>
+              <w:t xml:space="preserve">Table 2: Four rows of the file, reproduced verbatim: the same municipality in two consecutive years under two names, a municipality with no rural index, and the department-level aggregate for the same department and year.</w:t>
             </w:r>
           </w:p>
           <w:tbl>
@@ -323,9 +1190,13 @@
               <w:tblLook w:firstRow="1" w:lastRow="0" w:firstColumn="0" w:lastColumn="0" w:noHBand="0" w:noVBand="0" w:val="0020"/>
             </w:tblPr>
             <w:tblGrid>
-              <w:gridCol w:w="1256"/>
-              <w:gridCol w:w="655"/>
-              <w:gridCol w:w="6008"/>
+              <w:gridCol w:w="1729"/>
+              <w:gridCol w:w="1456"/>
+              <w:gridCol w:w="1820"/>
+              <w:gridCol w:w="546"/>
+              <w:gridCol w:w="455"/>
+              <w:gridCol w:w="1001"/>
+              <w:gridCol w:w="910"/>
             </w:tblGrid>
             <w:tr>
               <w:trPr>
@@ -340,33 +1211,85 @@
                     <w:jc w:val="center"/>
                   </w:pPr>
                   <w:r>
-                    <w:t xml:space="preserve">Column</w:t>
-                  </w:r>
-                </w:p>
-              </w:tc>
-              <w:tc>
-                <w:tcPr/>
-                <w:p>
-                  <w:pPr>
-                    <w:pStyle w:val="Compact"/>
-                    <w:jc w:val="left"/>
-                    <w:jc w:val="center"/>
-                  </w:pPr>
-                  <w:r>
-                    <w:t xml:space="preserve">Role</w:t>
-                  </w:r>
-                </w:p>
-              </w:tc>
-              <w:tc>
-                <w:tcPr/>
-                <w:p>
-                  <w:pPr>
-                    <w:pStyle w:val="Compact"/>
-                    <w:jc w:val="left"/>
-                    <w:jc w:val="center"/>
-                  </w:pPr>
-                  <w:r>
-                    <w:t xml:space="preserve">Content</w:t>
+                    <w:t xml:space="preserve">DepartamentoCodigo</w:t>
+                  </w:r>
+                </w:p>
+              </w:tc>
+              <w:tc>
+                <w:tcPr/>
+                <w:p>
+                  <w:pPr>
+                    <w:pStyle w:val="Compact"/>
+                    <w:jc w:val="left"/>
+                    <w:jc w:val="center"/>
+                  </w:pPr>
+                  <w:r>
+                    <w:t xml:space="preserve">MunicipioCodigo</w:t>
+                  </w:r>
+                </w:p>
+              </w:tc>
+              <w:tc>
+                <w:tcPr/>
+                <w:p>
+                  <w:pPr>
+                    <w:pStyle w:val="Compact"/>
+                    <w:jc w:val="left"/>
+                    <w:jc w:val="center"/>
+                  </w:pPr>
+                  <w:r>
+                    <w:t xml:space="preserve">Municipio</w:t>
+                  </w:r>
+                </w:p>
+              </w:tc>
+              <w:tc>
+                <w:tcPr/>
+                <w:p>
+                  <w:pPr>
+                    <w:pStyle w:val="Compact"/>
+                    <w:jc w:val="left"/>
+                    <w:jc w:val="center"/>
+                  </w:pPr>
+                  <w:r>
+                    <w:t xml:space="preserve">Año</w:t>
+                  </w:r>
+                </w:p>
+              </w:tc>
+              <w:tc>
+                <w:tcPr/>
+                <w:p>
+                  <w:pPr>
+                    <w:pStyle w:val="Compact"/>
+                    <w:jc w:val="left"/>
+                    <w:jc w:val="center"/>
+                  </w:pPr>
+                  <w:r>
+                    <w:t xml:space="preserve">IRCA</w:t>
+                  </w:r>
+                </w:p>
+              </w:tc>
+              <w:tc>
+                <w:tcPr/>
+                <w:p>
+                  <w:pPr>
+                    <w:pStyle w:val="Compact"/>
+                    <w:jc w:val="left"/>
+                    <w:jc w:val="center"/>
+                  </w:pPr>
+                  <w:r>
+                    <w:t xml:space="preserve">IRCAurbano</w:t>
+                  </w:r>
+                </w:p>
+              </w:tc>
+              <w:tc>
+                <w:tcPr/>
+                <w:p>
+                  <w:pPr>
+                    <w:pStyle w:val="Compact"/>
+                    <w:jc w:val="left"/>
+                    <w:jc w:val="center"/>
+                  </w:pPr>
+                  <w:r>
+                    <w:t xml:space="preserve">IRCArural</w:t>
                   </w:r>
                 </w:p>
               </w:tc>
@@ -381,33 +1304,85 @@
                     <w:jc w:val="center"/>
                   </w:pPr>
                   <w:r>
-                    <w:t xml:space="preserve">DepartamentoCodigo</w:t>
-                  </w:r>
-                </w:p>
-              </w:tc>
-              <w:tc>
-                <w:tcPr/>
-                <w:p>
-                  <w:pPr>
-                    <w:pStyle w:val="Compact"/>
-                    <w:jc w:val="left"/>
-                    <w:jc w:val="center"/>
-                  </w:pPr>
-                  <w:r>
-                    <w:t xml:space="preserve">Identifier</w:t>
-                  </w:r>
-                </w:p>
-              </w:tc>
-              <w:tc>
-                <w:tcPr/>
-                <w:p>
-                  <w:pPr>
-                    <w:pStyle w:val="Compact"/>
-                    <w:jc w:val="left"/>
-                    <w:jc w:val="center"/>
-                  </w:pPr>
-                  <w:r>
-                    <w:t xml:space="preserve">Two-digit DANE code of the department (33 values; Bogotá D.C. is code 11)</w:t>
+                    <w:t xml:space="preserve">76</w:t>
+                  </w:r>
+                </w:p>
+              </w:tc>
+              <w:tc>
+                <w:tcPr/>
+                <w:p>
+                  <w:pPr>
+                    <w:pStyle w:val="Compact"/>
+                    <w:jc w:val="left"/>
+                    <w:jc w:val="center"/>
+                  </w:pPr>
+                  <w:r>
+                    <w:t xml:space="preserve">76001</w:t>
+                  </w:r>
+                </w:p>
+              </w:tc>
+              <w:tc>
+                <w:tcPr/>
+                <w:p>
+                  <w:pPr>
+                    <w:pStyle w:val="Compact"/>
+                    <w:jc w:val="left"/>
+                    <w:jc w:val="center"/>
+                  </w:pPr>
+                  <w:r>
+                    <w:t xml:space="preserve">Cali</w:t>
+                  </w:r>
+                </w:p>
+              </w:tc>
+              <w:tc>
+                <w:tcPr/>
+                <w:p>
+                  <w:pPr>
+                    <w:pStyle w:val="Compact"/>
+                    <w:jc w:val="left"/>
+                    <w:jc w:val="center"/>
+                  </w:pPr>
+                  <w:r>
+                    <w:t xml:space="preserve">2,024</w:t>
+                  </w:r>
+                </w:p>
+              </w:tc>
+              <w:tc>
+                <w:tcPr/>
+                <w:p>
+                  <w:pPr>
+                    <w:pStyle w:val="Compact"/>
+                    <w:jc w:val="left"/>
+                    <w:jc w:val="center"/>
+                  </w:pPr>
+                  <w:r>
+                    <w:t xml:space="preserve">0.2</w:t>
+                  </w:r>
+                </w:p>
+              </w:tc>
+              <w:tc>
+                <w:tcPr/>
+                <w:p>
+                  <w:pPr>
+                    <w:pStyle w:val="Compact"/>
+                    <w:jc w:val="left"/>
+                    <w:jc w:val="center"/>
+                  </w:pPr>
+                  <w:r>
+                    <w:t xml:space="preserve">0.1</w:t>
+                  </w:r>
+                </w:p>
+              </w:tc>
+              <w:tc>
+                <w:tcPr/>
+                <w:p>
+                  <w:pPr>
+                    <w:pStyle w:val="Compact"/>
+                    <w:jc w:val="left"/>
+                    <w:jc w:val="center"/>
+                  </w:pPr>
+                  <w:r>
+                    <w:t xml:space="preserve">2.5</w:t>
                   </w:r>
                 </w:p>
               </w:tc>
@@ -422,33 +1397,85 @@
                     <w:jc w:val="center"/>
                   </w:pPr>
                   <w:r>
-                    <w:t xml:space="preserve">Departamento</w:t>
-                  </w:r>
-                </w:p>
-              </w:tc>
-              <w:tc>
-                <w:tcPr/>
-                <w:p>
-                  <w:pPr>
-                    <w:pStyle w:val="Compact"/>
-                    <w:jc w:val="left"/>
-                    <w:jc w:val="center"/>
-                  </w:pPr>
-                  <w:r>
-                    <w:t xml:space="preserve">Identifier</w:t>
-                  </w:r>
-                </w:p>
-              </w:tc>
-              <w:tc>
-                <w:tcPr/>
-                <w:p>
-                  <w:pPr>
-                    <w:pStyle w:val="Compact"/>
-                    <w:jc w:val="left"/>
-                    <w:jc w:val="center"/>
-                  </w:pPr>
-                  <w:r>
-                    <w:t xml:space="preserve">Department name</w:t>
+                    <w:t xml:space="preserve">76</w:t>
+                  </w:r>
+                </w:p>
+              </w:tc>
+              <w:tc>
+                <w:tcPr/>
+                <w:p>
+                  <w:pPr>
+                    <w:pStyle w:val="Compact"/>
+                    <w:jc w:val="left"/>
+                    <w:jc w:val="center"/>
+                  </w:pPr>
+                  <w:r>
+                    <w:t xml:space="preserve">76001</w:t>
+                  </w:r>
+                </w:p>
+              </w:tc>
+              <w:tc>
+                <w:tcPr/>
+                <w:p>
+                  <w:pPr>
+                    <w:pStyle w:val="Compact"/>
+                    <w:jc w:val="left"/>
+                    <w:jc w:val="center"/>
+                  </w:pPr>
+                  <w:r>
+                    <w:t xml:space="preserve">Santiago de Cali</w:t>
+                  </w:r>
+                </w:p>
+              </w:tc>
+              <w:tc>
+                <w:tcPr/>
+                <w:p>
+                  <w:pPr>
+                    <w:pStyle w:val="Compact"/>
+                    <w:jc w:val="left"/>
+                    <w:jc w:val="center"/>
+                  </w:pPr>
+                  <w:r>
+                    <w:t xml:space="preserve">2,023</w:t>
+                  </w:r>
+                </w:p>
+              </w:tc>
+              <w:tc>
+                <w:tcPr/>
+                <w:p>
+                  <w:pPr>
+                    <w:pStyle w:val="Compact"/>
+                    <w:jc w:val="left"/>
+                    <w:jc w:val="center"/>
+                  </w:pPr>
+                  <w:r>
+                    <w:t xml:space="preserve">0.3</w:t>
+                  </w:r>
+                </w:p>
+              </w:tc>
+              <w:tc>
+                <w:tcPr/>
+                <w:p>
+                  <w:pPr>
+                    <w:pStyle w:val="Compact"/>
+                    <w:jc w:val="left"/>
+                    <w:jc w:val="center"/>
+                  </w:pPr>
+                  <w:r>
+                    <w:t xml:space="preserve">0.3</w:t>
+                  </w:r>
+                </w:p>
+              </w:tc>
+              <w:tc>
+                <w:tcPr/>
+                <w:p>
+                  <w:pPr>
+                    <w:pStyle w:val="Compact"/>
+                    <w:jc w:val="left"/>
+                    <w:jc w:val="center"/>
+                  </w:pPr>
+                  <w:r>
+                    <w:t xml:space="preserve">0.0</w:t>
                   </w:r>
                 </w:p>
               </w:tc>
@@ -463,33 +1490,85 @@
                     <w:jc w:val="center"/>
                   </w:pPr>
                   <w:r>
-                    <w:t xml:space="preserve">MunicipioCodigo</w:t>
-                  </w:r>
-                </w:p>
-              </w:tc>
-              <w:tc>
-                <w:tcPr/>
-                <w:p>
-                  <w:pPr>
-                    <w:pStyle w:val="Compact"/>
-                    <w:jc w:val="left"/>
-                    <w:jc w:val="center"/>
-                  </w:pPr>
-                  <w:r>
-                    <w:t xml:space="preserve">Identifier</w:t>
-                  </w:r>
-                </w:p>
-              </w:tc>
-              <w:tc>
-                <w:tcPr/>
-                <w:p>
-                  <w:pPr>
-                    <w:pStyle w:val="Compact"/>
-                    <w:jc w:val="left"/>
-                    <w:jc w:val="center"/>
-                  </w:pPr>
-                  <w:r>
-                    <w:t xml:space="preserve">Five-digit DANE municipality code, prefixed by the department code; #TODOS marks a department-level aggregate</w:t>
+                    <w:t xml:space="preserve">76</w:t>
+                  </w:r>
+                </w:p>
+              </w:tc>
+              <w:tc>
+                <w:tcPr/>
+                <w:p>
+                  <w:pPr>
+                    <w:pStyle w:val="Compact"/>
+                    <w:jc w:val="left"/>
+                    <w:jc w:val="center"/>
+                  </w:pPr>
+                  <w:r>
+                    <w:t xml:space="preserve">76111</w:t>
+                  </w:r>
+                </w:p>
+              </w:tc>
+              <w:tc>
+                <w:tcPr/>
+                <w:p>
+                  <w:pPr>
+                    <w:pStyle w:val="Compact"/>
+                    <w:jc w:val="left"/>
+                    <w:jc w:val="center"/>
+                  </w:pPr>
+                  <w:r>
+                    <w:t xml:space="preserve">Guadalajara de Buga</w:t>
+                  </w:r>
+                </w:p>
+              </w:tc>
+              <w:tc>
+                <w:tcPr/>
+                <w:p>
+                  <w:pPr>
+                    <w:pStyle w:val="Compact"/>
+                    <w:jc w:val="left"/>
+                    <w:jc w:val="center"/>
+                  </w:pPr>
+                  <w:r>
+                    <w:t xml:space="preserve">2,024</w:t>
+                  </w:r>
+                </w:p>
+              </w:tc>
+              <w:tc>
+                <w:tcPr/>
+                <w:p>
+                  <w:pPr>
+                    <w:pStyle w:val="Compact"/>
+                    <w:jc w:val="left"/>
+                    <w:jc w:val="center"/>
+                  </w:pPr>
+                  <w:r>
+                    <w:t xml:space="preserve">0</w:t>
+                  </w:r>
+                </w:p>
+              </w:tc>
+              <w:tc>
+                <w:tcPr/>
+                <w:p>
+                  <w:pPr>
+                    <w:pStyle w:val="Compact"/>
+                    <w:jc w:val="left"/>
+                    <w:jc w:val="center"/>
+                  </w:pPr>
+                  <w:r>
+                    <w:t xml:space="preserve">0</w:t>
+                  </w:r>
+                </w:p>
+              </w:tc>
+              <w:tc>
+                <w:tcPr/>
+                <w:p>
+                  <w:pPr>
+                    <w:pStyle w:val="Compact"/>
+                    <w:jc w:val="left"/>
+                    <w:jc w:val="center"/>
+                  </w:pPr>
+                  <w:r>
+                    <w:t xml:space="preserve">ND</w:t>
                   </w:r>
                 </w:p>
               </w:tc>
@@ -504,644 +1583,145 @@
                     <w:jc w:val="center"/>
                   </w:pPr>
                   <w:r>
-                    <w:t xml:space="preserve">Municipio</w:t>
-                  </w:r>
-                </w:p>
-              </w:tc>
-              <w:tc>
-                <w:tcPr/>
-                <w:p>
-                  <w:pPr>
-                    <w:pStyle w:val="Compact"/>
-                    <w:jc w:val="left"/>
-                    <w:jc w:val="center"/>
-                  </w:pPr>
-                  <w:r>
-                    <w:t xml:space="preserve">Identifier</w:t>
-                  </w:r>
-                </w:p>
-              </w:tc>
-              <w:tc>
-                <w:tcPr/>
-                <w:p>
-                  <w:pPr>
-                    <w:pStyle w:val="Compact"/>
-                    <w:jc w:val="left"/>
-                    <w:jc w:val="center"/>
-                  </w:pPr>
-                  <w:r>
-                    <w:t xml:space="preserve">Municipality name; #TODOS for department-level aggregates</w:t>
-                  </w:r>
-                </w:p>
-              </w:tc>
-            </w:tr>
-            <w:tr>
-              <w:tc>
-                <w:tcPr/>
-                <w:p>
-                  <w:pPr>
-                    <w:pStyle w:val="Compact"/>
-                    <w:jc w:val="left"/>
-                    <w:jc w:val="center"/>
-                  </w:pPr>
-                  <w:r>
-                    <w:t xml:space="preserve">Año</w:t>
-                  </w:r>
-                </w:p>
-              </w:tc>
-              <w:tc>
-                <w:tcPr/>
-                <w:p>
-                  <w:pPr>
-                    <w:pStyle w:val="Compact"/>
-                    <w:jc w:val="left"/>
-                    <w:jc w:val="center"/>
-                  </w:pPr>
-                  <w:r>
-                    <w:t xml:space="preserve">Identifier</w:t>
-                  </w:r>
-                </w:p>
-              </w:tc>
-              <w:tc>
-                <w:tcPr/>
-                <w:p>
-                  <w:pPr>
-                    <w:pStyle w:val="Compact"/>
-                    <w:jc w:val="left"/>
-                    <w:jc w:val="center"/>
-                  </w:pPr>
-                  <w:r>
-                    <w:t xml:space="preserve">Calendar year, stored as text with a thousands separator (2,024)</w:t>
-                  </w:r>
-                </w:p>
-              </w:tc>
-            </w:tr>
-            <w:tr>
-              <w:tc>
-                <w:tcPr/>
-                <w:p>
-                  <w:pPr>
-                    <w:pStyle w:val="Compact"/>
-                    <w:jc w:val="left"/>
-                    <w:jc w:val="center"/>
-                  </w:pPr>
-                  <w:r>
-                    <w:t xml:space="preserve">IRCA</w:t>
-                  </w:r>
-                </w:p>
-              </w:tc>
-              <w:tc>
-                <w:tcPr/>
-                <w:p>
-                  <w:pPr>
-                    <w:pStyle w:val="Compact"/>
-                    <w:jc w:val="left"/>
-                    <w:jc w:val="center"/>
-                  </w:pPr>
-                  <w:r>
-                    <w:t xml:space="preserve">Measurement</w:t>
-                  </w:r>
-                </w:p>
-              </w:tc>
-              <w:tc>
-                <w:tcPr/>
-                <w:p>
-                  <w:pPr>
-                    <w:pStyle w:val="Compact"/>
-                    <w:jc w:val="left"/>
-                    <w:jc w:val="center"/>
-                  </w:pPr>
-                  <w:r>
-                    <w:t xml:space="preserve">Annual IRCA (0 to 100) for the whole unit</w:t>
-                  </w:r>
-                </w:p>
-              </w:tc>
-            </w:tr>
-            <w:tr>
-              <w:tc>
-                <w:tcPr/>
-                <w:p>
-                  <w:pPr>
-                    <w:pStyle w:val="Compact"/>
-                    <w:jc w:val="left"/>
-                    <w:jc w:val="center"/>
-                  </w:pPr>
-                  <w:r>
-                    <w:t xml:space="preserve">Nivel de riesgo</w:t>
-                  </w:r>
-                </w:p>
-              </w:tc>
-              <w:tc>
-                <w:tcPr/>
-                <w:p>
-                  <w:pPr>
-                    <w:pStyle w:val="Compact"/>
-                    <w:jc w:val="left"/>
-                    <w:jc w:val="center"/>
-                  </w:pPr>
-                  <w:r>
-                    <w:t xml:space="preserve">Measurement</w:t>
-                  </w:r>
-                </w:p>
-              </w:tc>
-              <w:tc>
-                <w:tcPr/>
-                <w:p>
-                  <w:pPr>
-                    <w:pStyle w:val="Compact"/>
-                    <w:jc w:val="left"/>
-                    <w:jc w:val="center"/>
-                  </w:pPr>
-                  <w:r>
-                    <w:t xml:space="preserve">Risk category derived from IRCA</w:t>
-                  </w:r>
-                </w:p>
-              </w:tc>
-            </w:tr>
-            <w:tr>
-              <w:tc>
-                <w:tcPr/>
-                <w:p>
-                  <w:pPr>
-                    <w:pStyle w:val="Compact"/>
-                    <w:jc w:val="left"/>
-                    <w:jc w:val="center"/>
-                  </w:pPr>
-                  <w:r>
-                    <w:t xml:space="preserve">IRCAurbano</w:t>
-                  </w:r>
-                </w:p>
-              </w:tc>
-              <w:tc>
-                <w:tcPr/>
-                <w:p>
-                  <w:pPr>
-                    <w:pStyle w:val="Compact"/>
-                    <w:jc w:val="left"/>
-                    <w:jc w:val="center"/>
-                  </w:pPr>
-                  <w:r>
-                    <w:t xml:space="preserve">Measurement</w:t>
-                  </w:r>
-                </w:p>
-              </w:tc>
-              <w:tc>
-                <w:tcPr/>
-                <w:p>
-                  <w:pPr>
-                    <w:pStyle w:val="Compact"/>
-                    <w:jc w:val="left"/>
-                    <w:jc w:val="center"/>
-                  </w:pPr>
-                  <w:r>
-                    <w:t xml:space="preserve">Annual IRCA for the urban area; ND when not available</w:t>
-                  </w:r>
-                </w:p>
-              </w:tc>
-            </w:tr>
-            <w:tr>
-              <w:tc>
-                <w:tcPr/>
-                <w:p>
-                  <w:pPr>
-                    <w:pStyle w:val="Compact"/>
-                    <w:jc w:val="left"/>
-                    <w:jc w:val="center"/>
-                  </w:pPr>
-                  <w:r>
-                    <w:t xml:space="preserve">Nivel de riesgo urbano</w:t>
-                  </w:r>
-                </w:p>
-              </w:tc>
-              <w:tc>
-                <w:tcPr/>
-                <w:p>
-                  <w:pPr>
-                    <w:pStyle w:val="Compact"/>
-                    <w:jc w:val="left"/>
-                    <w:jc w:val="center"/>
-                  </w:pPr>
-                  <w:r>
-                    <w:t xml:space="preserve">Measurement</w:t>
-                  </w:r>
-                </w:p>
-              </w:tc>
-              <w:tc>
-                <w:tcPr/>
-                <w:p>
-                  <w:pPr>
-                    <w:pStyle w:val="Compact"/>
-                    <w:jc w:val="left"/>
-                    <w:jc w:val="center"/>
-                  </w:pPr>
-                  <w:r>
-                    <w:t xml:space="preserve">Risk category derived from IRCAurbano</w:t>
-                  </w:r>
-                </w:p>
-              </w:tc>
-            </w:tr>
-            <w:tr>
-              <w:tc>
-                <w:tcPr/>
-                <w:p>
-                  <w:pPr>
-                    <w:pStyle w:val="Compact"/>
-                    <w:jc w:val="left"/>
-                    <w:jc w:val="center"/>
-                  </w:pPr>
-                  <w:r>
-                    <w:t xml:space="preserve">IRCArural</w:t>
-                  </w:r>
-                </w:p>
-              </w:tc>
-              <w:tc>
-                <w:tcPr/>
-                <w:p>
-                  <w:pPr>
-                    <w:pStyle w:val="Compact"/>
-                    <w:jc w:val="left"/>
-                    <w:jc w:val="center"/>
-                  </w:pPr>
-                  <w:r>
-                    <w:t xml:space="preserve">Measurement</w:t>
-                  </w:r>
-                </w:p>
-              </w:tc>
-              <w:tc>
-                <w:tcPr/>
-                <w:p>
-                  <w:pPr>
-                    <w:pStyle w:val="Compact"/>
-                    <w:jc w:val="left"/>
-                    <w:jc w:val="center"/>
-                  </w:pPr>
-                  <w:r>
-                    <w:t xml:space="preserve">Annual IRCA for the rural area; ND when not available</w:t>
-                  </w:r>
-                </w:p>
-              </w:tc>
-            </w:tr>
-            <w:tr>
-              <w:tc>
-                <w:tcPr/>
-                <w:p>
-                  <w:pPr>
-                    <w:pStyle w:val="Compact"/>
-                    <w:jc w:val="left"/>
-                    <w:jc w:val="center"/>
-                  </w:pPr>
-                  <w:r>
-                    <w:t xml:space="preserve">Nivel de riesgo rural</w:t>
-                  </w:r>
-                </w:p>
-              </w:tc>
-              <w:tc>
-                <w:tcPr/>
-                <w:p>
-                  <w:pPr>
-                    <w:pStyle w:val="Compact"/>
-                    <w:jc w:val="left"/>
-                    <w:jc w:val="center"/>
-                  </w:pPr>
-                  <w:r>
-                    <w:t xml:space="preserve">Measurement</w:t>
-                  </w:r>
-                </w:p>
-              </w:tc>
-              <w:tc>
-                <w:tcPr/>
-                <w:p>
-                  <w:pPr>
-                    <w:pStyle w:val="Compact"/>
-                    <w:jc w:val="left"/>
-                    <w:jc w:val="center"/>
-                  </w:pPr>
-                  <w:r>
-                    <w:t xml:space="preserve">Risk category derived from IRCArural</w:t>
+                    <w:t xml:space="preserve">76</w:t>
+                  </w:r>
+                </w:p>
+              </w:tc>
+              <w:tc>
+                <w:tcPr/>
+                <w:p>
+                  <w:pPr>
+                    <w:pStyle w:val="Compact"/>
+                    <w:jc w:val="left"/>
+                    <w:jc w:val="center"/>
+                  </w:pPr>
+                  <w:r>
+                    <w:t xml:space="preserve">#TODOS</w:t>
+                  </w:r>
+                </w:p>
+              </w:tc>
+              <w:tc>
+                <w:tcPr/>
+                <w:p>
+                  <w:pPr>
+                    <w:pStyle w:val="Compact"/>
+                    <w:jc w:val="left"/>
+                    <w:jc w:val="center"/>
+                  </w:pPr>
+                  <w:r>
+                    <w:t xml:space="preserve">#TODOS</w:t>
+                  </w:r>
+                </w:p>
+              </w:tc>
+              <w:tc>
+                <w:tcPr/>
+                <w:p>
+                  <w:pPr>
+                    <w:pStyle w:val="Compact"/>
+                    <w:jc w:val="left"/>
+                    <w:jc w:val="center"/>
+                  </w:pPr>
+                  <w:r>
+                    <w:t xml:space="preserve">2,024</w:t>
+                  </w:r>
+                </w:p>
+              </w:tc>
+              <w:tc>
+                <w:tcPr/>
+                <w:p>
+                  <w:pPr>
+                    <w:pStyle w:val="Compact"/>
+                    <w:jc w:val="left"/>
+                    <w:jc w:val="center"/>
+                  </w:pPr>
+                  <w:r>
+                    <w:t xml:space="preserve">3.9</w:t>
+                  </w:r>
+                </w:p>
+              </w:tc>
+              <w:tc>
+                <w:tcPr/>
+                <w:p>
+                  <w:pPr>
+                    <w:pStyle w:val="Compact"/>
+                    <w:jc w:val="left"/>
+                    <w:jc w:val="center"/>
+                  </w:pPr>
+                  <w:r>
+                    <w:t xml:space="preserve">0.4</w:t>
+                  </w:r>
+                </w:p>
+              </w:tc>
+              <w:tc>
+                <w:tcPr/>
+                <w:p>
+                  <w:pPr>
+                    <w:pStyle w:val="Compact"/>
+                    <w:jc w:val="left"/>
+                    <w:jc w:val="center"/>
+                  </w:pPr>
+                  <w:r>
+                    <w:t xml:space="preserve">12.5</w:t>
                   </w:r>
                 </w:p>
               </w:tc>
             </w:tr>
           </w:tbl>
-          <w:bookmarkEnd w:id="26"/>
+          <w:bookmarkEnd w:id="27"/>
           <w:p/>
         </w:tc>
       </w:tr>
     </w:tbl>
-    <w:bookmarkEnd w:id="27"/>
-    <w:bookmarkStart w:id="28" w:name="two-levels-of-aggregation-and-one-key"/>
+    <w:bookmarkEnd w:id="28"/>
+    <w:bookmarkStart w:id="30" w:name="what-identifies-a-row"/>
     <w:p>
       <w:pPr>
         <w:pStyle w:val="Heading2"/>
       </w:pPr>
       <w:r>
-        <w:t xml:space="preserve">2.2 Two levels of aggregation and one key</w:t>
+        <w:t xml:space="preserve">2.2 What identifies a row</w:t>
       </w:r>
     </w:p>
     <w:p>
       <w:pPr>
         <w:pStyle w:val="FirstParagraph"/>
       </w:pPr>
-      <w:r>
-        <w:t xml:space="preserve">The municipality columns take the value</w:t>
-      </w:r>
-      <w:r>
-        <w:t xml:space="preserve"> </w:t>
-      </w:r>
-      <w:r>
-        <w:rPr>
-          <w:rStyle w:val="VerbatimChar"/>
-        </w:rPr>
-        <w:t xml:space="preserve">#TODOS</w:t>
-      </w:r>
-      <w:r>
-        <w:t xml:space="preserve"> </w:t>
-      </w:r>
-      <w:r>
-        <w:t xml:space="preserve">(</w:t>
-      </w:r>
-      <w:r>
-        <w:t xml:space="preserve">“all”</w:t>
-      </w:r>
-      <w:r>
-        <w:t xml:space="preserve">) in 569 rows. These rows name a department but no municipality, and their IRCA values describe the department as a whole. The other 18,591 rows carry a genuine five-digit municipality code. The file therefore stacks two levels of aggregation: municipal rows and departmental rows.</w:t>
-      </w:r>
-    </w:p>
-    <w:p>
-      <w:pPr>
-        <w:pStyle w:val="BodyText"/>
-      </w:pPr>
-      <w:r>
-        <w:t xml:space="preserve">The combination of department code, municipality code and year identifies every row exactly once (0 duplicates). Within the municipal rows, municipality code and year suffice, because the municipality code embeds the department code as its first two digits in every row (0 mismatches). Within the departmental rows, department code and year suffice. The municipal rows cover 1,095 municipality codes in 33 departments over 18 years, from 2007 to 2024.</w:t>
-      </w:r>
-    </w:p>
-    <w:bookmarkEnd w:id="28"/>
-    <w:bookmarkStart w:id="29" w:name="answer"/>
-    <w:p>
-      <w:pPr>
-        <w:pStyle w:val="Heading2"/>
-      </w:pPr>
-      <w:r>
-        <w:t xml:space="preserve">2.3 Answer</w:t>
-      </w:r>
-    </w:p>
-    <w:p>
-      <w:pPr>
-        <w:pStyle w:val="FirstParagraph"/>
-      </w:pPr>
-      <w:r>
-        <w:t xml:space="preserve">The observational unit of the water quality measurements is the</w:t>
-      </w:r>
-      <w:r>
-        <w:t xml:space="preserve"> </w:t>
-      </w:r>
-      <w:r>
-        <w:rPr>
-          <w:b/>
-          <w:bCs/>
-        </w:rPr>
-        <w:t xml:space="preserve">municipality-year</w:t>
-      </w:r>
-      <w:r>
-        <w:t xml:space="preserve">. Each municipal row records, for one municipality and one calendar year, the annual IRCA score and risk category for the municipality as a whole and separately for its urban and rural areas. The department-year rows marked</w:t>
-      </w:r>
-      <w:r>
-        <w:t xml:space="preserve"> </w:t>
-      </w:r>
-      <w:r>
-        <w:rPr>
-          <w:rStyle w:val="VerbatimChar"/>
-        </w:rPr>
-        <w:t xml:space="preserve">#TODOS</w:t>
-      </w:r>
-      <w:r>
-        <w:t xml:space="preserve"> </w:t>
-      </w:r>
-      <w:r>
-        <w:t xml:space="preserve">are aggregates derived from the same surveillance data; they form a second, coarser set of units and should be separated from the municipal rows rather than mixed with them.</w:t>
-      </w:r>
-    </w:p>
-    <w:p>
-      <w:pPr>
-        <w:pStyle w:val="BodyText"/>
-      </w:pPr>
-      <w:r>
-        <w:t xml:space="preserve">It is worth stating what the unit is not. The IRCA is computed from many individual water samples taken over the year, but those samples are not in the file. A row is not a sample, a water supply system, a sampling site or a month; it is the annual consolidation of all samples in a municipality, and the number of samples behind each value is unknown.</w:t>
-      </w:r>
-    </w:p>
-    <w:p>
-      <w:pPr>
-        <w:pStyle w:val="BodyText"/>
-      </w:pPr>
-      <w:r>
-        <w:t xml:space="preserve">Four further properties of the file must be handled on import. The year carries a thousands separator. Missing urban and rural values are coded as the string</w:t>
-      </w:r>
-      <w:r>
-        <w:t xml:space="preserve"> </w:t>
-      </w:r>
-      <w:r>
-        <w:rPr>
-          <w:rStyle w:val="VerbatimChar"/>
-        </w:rPr>
-        <w:t xml:space="preserve">ND</w:t>
-      </w:r>
-      <w:r>
-        <w:t xml:space="preserve"> </w:t>
-      </w:r>
-      <w:r>
-        <w:t xml:space="preserve">rather than left empty. The risk labels are spelled inconsistently (</w:t>
-      </w:r>
-      <w:r>
-        <w:t xml:space="preserve">“Alto riesgo”</w:t>
-      </w:r>
-      <w:r>
-        <w:t xml:space="preserve"> </w:t>
-      </w:r>
-      <w:r>
-        <w:t xml:space="preserve">and</w:t>
-      </w:r>
-      <w:r>
-        <w:t xml:space="preserve"> </w:t>
-      </w:r>
-      <w:r>
-        <w:t xml:space="preserve">“Riesgo alto”</w:t>
-      </w:r>
-      <w:r>
-        <w:t xml:space="preserve"> </w:t>
-      </w:r>
-      <w:r>
-        <w:t xml:space="preserve">both occur). Names are not stable identifiers: municipality 76001 is</w:t>
-      </w:r>
-      <w:r>
-        <w:t xml:space="preserve"> </w:t>
-      </w:r>
-      <w:r>
-        <w:t xml:space="preserve">“Cali”</w:t>
-      </w:r>
-      <w:r>
-        <w:t xml:space="preserve"> </w:t>
-      </w:r>
-      <w:r>
-        <w:t xml:space="preserve">in some years and</w:t>
-      </w:r>
-      <w:r>
-        <w:t xml:space="preserve"> </w:t>
-      </w:r>
-      <w:r>
-        <w:t xml:space="preserve">“Santiago de Cali”</w:t>
-      </w:r>
-      <w:r>
-        <w:t xml:space="preserve"> </w:t>
-      </w:r>
-      <w:r>
-        <w:t xml:space="preserve">in others, so the numeric codes, not the names, should be used as keys.</w:t>
-      </w:r>
-    </w:p>
-    <w:p>
-      <w:r>
-        <w:br w:type="page"/>
-      </w:r>
-    </w:p>
-    <w:bookmarkEnd w:id="29"/>
-    <w:bookmarkEnd w:id="30"/>
-    <w:bookmarkStart w:id="40" w:name="question-2-how-complete-are-the-data"/>
-    <w:p>
-      <w:pPr>
-        <w:pStyle w:val="Heading1"/>
-      </w:pPr>
-      <w:r>
-        <w:t xml:space="preserve">3. Question 2: How complete are the data?</w:t>
-      </w:r>
-    </w:p>
-    <w:p>
-      <w:pPr>
-        <w:pStyle w:val="FirstParagraph"/>
-      </w:pPr>
-      <w:r>
-        <w:t xml:space="preserve">Completeness is examined at three levels: values within a row, municipalities within a year, and years within a municipality’s series. The file carries no list of the municipalities that ought to be present, so the reference set is defined internally as every municipality code that appears at least once, crossed with every year that appears at least once.</w:t>
-      </w:r>
-    </w:p>
-    <w:bookmarkStart w:id="31" w:name="missing-values-in-the-measurements"/>
-    <w:p>
-      <w:pPr>
-        <w:pStyle w:val="Heading2"/>
-      </w:pPr>
-      <w:r>
-        <w:t xml:space="preserve">3.1 Missing values in the measurements</w:t>
-      </w:r>
-    </w:p>
-    <w:p>
-      <w:pPr>
-        <w:pStyle w:val="FirstParagraph"/>
-      </w:pPr>
-      <w:r>
-        <w:t xml:space="preserve">No cell in the file is empty (0 empty cells). Missingness is encoded by the string</w:t>
-      </w:r>
-      <w:r>
-        <w:t xml:space="preserve"> </w:t>
-      </w:r>
-      <w:r>
-        <w:rPr>
-          <w:rStyle w:val="VerbatimChar"/>
-        </w:rPr>
-        <w:t xml:space="preserve">ND</w:t>
-      </w:r>
-      <w:r>
-        <w:t xml:space="preserve">, which appears only in the four urban and rural measurement columns; the overall IRCA and its risk category are never missing. The value and the risk category of a component are always missing together (0 exceptions). Within municipal rows the rural IRCA is</w:t>
-      </w:r>
-      <w:r>
-        <w:t xml:space="preserve"> </w:t>
-      </w:r>
-      <w:r>
-        <w:rPr>
-          <w:rStyle w:val="VerbatimChar"/>
-        </w:rPr>
-        <w:t xml:space="preserve">ND</w:t>
-      </w:r>
-      <w:r>
-        <w:t xml:space="preserve"> </w:t>
-      </w:r>
-      <w:r>
-        <w:t xml:space="preserve">in 51% of rows and the urban IRCA in 7%; only 47% of rows carry all three indices, and in 917 rows both components are missing while the overall index is present, so the overall index is not simply computed from the two components as they appear in the file.</w:t>
-      </w:r>
-    </w:p>
-    <w:p>
-      <w:pPr>
-        <w:pStyle w:val="BodyText"/>
-      </w:pPr>
-      <w:r>
-        <w:t xml:space="preserve">The rural share fell from about three quarters of rows in 2007 to around 40% by 2010 and drifted back to roughly 55% from 2016 onwards. The urban share is usually below 10% but spikes in 2016 and 2017, peaking at 24% in 2017; the spike affects both components at once and looks like a reporting artefact. The rural gap is intermittent rather than structural: only 148 municipalities never report a rural IRCA and only 48 always do. Finally,</w:t>
-      </w:r>
-      <w:r>
-        <w:t xml:space="preserve"> </w:t>
-      </w:r>
-      <w:r>
-        <w:rPr>
-          <w:rStyle w:val="VerbatimChar"/>
-        </w:rPr>
-        <w:t xml:space="preserve">ND</w:t>
-      </w:r>
-      <w:r>
-        <w:t xml:space="preserve"> </w:t>
-      </w:r>
-      <w:r>
-        <w:t xml:space="preserve">does not reliably mean</w:t>
-      </w:r>
-      <w:r>
-        <w:t xml:space="preserve"> </w:t>
-      </w:r>
-      <w:r>
-        <w:t xml:space="preserve">“not sampled”</w:t>
-      </w:r>
-      <w:r>
-        <w:t xml:space="preserve">. Where the rural IRCA is</w:t>
-      </w:r>
-      <w:r>
-        <w:t xml:space="preserve"> </w:t>
-      </w:r>
-      <w:r>
-        <w:rPr>
-          <w:rStyle w:val="VerbatimChar"/>
-        </w:rPr>
-        <w:t xml:space="preserve">ND</w:t>
-      </w:r>
-      <w:r>
-        <w:t xml:space="preserve"> </w:t>
-      </w:r>
-      <w:r>
-        <w:t xml:space="preserve">and the urban IRCA is present, the overall IRCA equals the urban IRCA in 87% of cases, but in 785 rows the two differ by more than one point, so rural samples entered the overall index even though the rural component is reported as unavailable.</w:t>
-      </w:r>
-    </w:p>
-    <w:bookmarkEnd w:id="31"/>
-    <w:bookmarkStart w:id="37" w:name="missing-observational-units"/>
-    <w:p>
-      <w:pPr>
-        <w:pStyle w:val="Heading2"/>
-      </w:pPr>
-      <w:r>
-        <w:t xml:space="preserve">3.2 Missing observational units</w:t>
-      </w:r>
-    </w:p>
-    <w:p>
-      <w:pPr>
-        <w:pStyle w:val="FirstParagraph"/>
-      </w:pPr>
-      <w:r>
-        <w:t xml:space="preserve">The 1,095 municipality codes and 18 years define 19,710 municipality-years, of which 1,119 (5.7%) are absent, so the panel is unbalanced. Coverage improved until 2019, when only 15 municipalities were absent, and has weakened since 2020; 2022 is the least complete year, with 134 absent. The gaps are very unevenly distributed (</w:t>
-      </w:r>
-      <w:hyperlink w:anchor="fig-heatmap">
+      <w:hyperlink w:anchor="tbl-keys">
         <w:r>
           <w:rPr>
             <w:rStyle w:val="Hyperlink"/>
           </w:rPr>
-          <w:t xml:space="preserve">Figure 2</w:t>
+          <w:t xml:space="preserve">Table 3</w:t>
         </w:r>
       </w:hyperlink>
       <w:r>
-        <w:t xml:space="preserve">). Only 5 departments are complete over the whole period. Chocó is missing 84% of its municipality-years and has no rows of any kind before 2014; of the 23 municipalities observed in five or fewer years, 21 are in Chocó. Guainía, Vaupés, Guaviare, Amazonas, Vichada and Córdoba also show substantial gaps. Department-level aggregates are absent in 25 of 594 department-years, always exactly when the department reported no municipality at all (0 exceptions). Joining the file to the DANE 2020 boundary register (1,122 units) shows that every code in the file exists in the register, and that 8 municipalities never appear in any year (6 in Chocó, 2 in Antioquia), together with the 19 non-municipalised areas of Amazonas, Guainía and Vaupés.</w:t>
+        <w:t xml:space="preserve"> </w:t>
+      </w:r>
+      <w:r>
+        <w:t xml:space="preserve">tests candidate identifiers on the municipal rows. A municipality code alone recurs across years. A municipality name with a year is not unique either, because 63 names are shared by municipalities in different departments. Adding the department name makes the key unique, but names are not stable: municipality 76001 appears as</w:t>
+      </w:r>
+      <w:r>
+        <w:t xml:space="preserve"> </w:t>
+      </w:r>
+      <w:r>
+        <w:t xml:space="preserve">“Santiago de Cali”</w:t>
+      </w:r>
+      <w:r>
+        <w:t xml:space="preserve"> </w:t>
+      </w:r>
+      <w:r>
+        <w:t xml:space="preserve">and as</w:t>
+      </w:r>
+      <w:r>
+        <w:t xml:space="preserve"> </w:t>
+      </w:r>
+      <w:r>
+        <w:t xml:space="preserve">“Cali”</w:t>
+      </w:r>
+      <w:r>
+        <w:t xml:space="preserve">, and over the period more than one name is attached to 1 of the 1,095 codes. The municipality code with the year identifies every municipal row exactly once, and because the first two digits of every municipality code equal the department code, the department adds no information. On the aggregate rows, department code with year is likewise unique.</w:t>
       </w:r>
     </w:p>
-    <w:bookmarkStart w:id="36" w:name="cell-fig-heatmap"/>
     <w:tbl>
       <w:tblPr>
         <w:tblStyle w:val="Table"/>
@@ -1155,7 +1735,1097 @@
       <w:tr>
         <w:tc>
           <w:tcPr/>
-          <w:bookmarkStart w:id="35" w:name="fig-heatmap"/>
+          <w:bookmarkStart w:id="29" w:name="tbl-keys"/>
+          <w:p>
+            <w:pPr>
+              <w:jc w:val="center"/>
+            </w:pPr>
+            <w:pPr>
+              <w:jc w:val="start"/>
+              <w:spacing w:before="200"/>
+              <w:pStyle w:val="ImageCaption"/>
+            </w:pPr>
+            <w:r>
+              <w:t xml:space="preserve">Table 3: Candidate identifiers tested on the municipal rows and, in the last line, on the department aggregate rows.</w:t>
+            </w:r>
+          </w:p>
+          <w:tbl>
+            <w:tblPr>
+              <w:tblStyle w:val="Table"/>
+              <w:tblW w:type="pct" w:w="5000"/>
+              <w:tblLayout w:type="fixed"/>
+              <w:tblLook w:firstRow="1" w:lastRow="0" w:firstColumn="0" w:lastColumn="0" w:noHBand="0" w:noVBand="0" w:val="0020"/>
+            </w:tblPr>
+            <w:tblGrid>
+              <w:gridCol w:w="4153"/>
+              <w:gridCol w:w="1545"/>
+              <w:gridCol w:w="676"/>
+              <w:gridCol w:w="1545"/>
+            </w:tblGrid>
+            <w:tr>
+              <w:trPr>
+                <w:tblHeader w:val="on"/>
+              </w:trPr>
+              <w:tc>
+                <w:tcPr/>
+                <w:p>
+                  <w:pPr>
+                    <w:pStyle w:val="Compact"/>
+                    <w:jc w:val="left"/>
+                    <w:jc w:val="center"/>
+                  </w:pPr>
+                  <w:r>
+                    <w:t xml:space="preserve">Candidate key</w:t>
+                  </w:r>
+                </w:p>
+              </w:tc>
+              <w:tc>
+                <w:tcPr/>
+                <w:p>
+                  <w:pPr>
+                    <w:pStyle w:val="Compact"/>
+                    <w:jc w:val="right"/>
+                    <w:jc w:val="center"/>
+                  </w:pPr>
+                  <w:r>
+                    <w:t xml:space="preserve">Distinct values</w:t>
+                  </w:r>
+                </w:p>
+              </w:tc>
+              <w:tc>
+                <w:tcPr/>
+                <w:p>
+                  <w:pPr>
+                    <w:pStyle w:val="Compact"/>
+                    <w:jc w:val="right"/>
+                    <w:jc w:val="center"/>
+                  </w:pPr>
+                  <w:r>
+                    <w:t xml:space="preserve">Rows</w:t>
+                  </w:r>
+                </w:p>
+              </w:tc>
+              <w:tc>
+                <w:tcPr/>
+                <w:p>
+                  <w:pPr>
+                    <w:pStyle w:val="Compact"/>
+                    <w:jc w:val="right"/>
+                    <w:jc w:val="center"/>
+                  </w:pPr>
+                  <w:r>
+                    <w:t xml:space="preserve">Duplicated rows</w:t>
+                  </w:r>
+                </w:p>
+              </w:tc>
+            </w:tr>
+            <w:tr>
+              <w:tc>
+                <w:tcPr/>
+                <w:p>
+                  <w:pPr>
+                    <w:pStyle w:val="Compact"/>
+                    <w:jc w:val="left"/>
+                    <w:jc w:val="center"/>
+                  </w:pPr>
+                  <w:r>
+                    <w:t xml:space="preserve">Municipality code</w:t>
+                  </w:r>
+                </w:p>
+              </w:tc>
+              <w:tc>
+                <w:tcPr/>
+                <w:p>
+                  <w:pPr>
+                    <w:pStyle w:val="Compact"/>
+                    <w:jc w:val="right"/>
+                    <w:jc w:val="center"/>
+                  </w:pPr>
+                  <w:r>
+                    <w:t xml:space="preserve">1,095</w:t>
+                  </w:r>
+                </w:p>
+              </w:tc>
+              <w:tc>
+                <w:tcPr/>
+                <w:p>
+                  <w:pPr>
+                    <w:pStyle w:val="Compact"/>
+                    <w:jc w:val="right"/>
+                    <w:jc w:val="center"/>
+                  </w:pPr>
+                  <w:r>
+                    <w:t xml:space="preserve">18,591</w:t>
+                  </w:r>
+                </w:p>
+              </w:tc>
+              <w:tc>
+                <w:tcPr/>
+                <w:p>
+                  <w:pPr>
+                    <w:pStyle w:val="Compact"/>
+                    <w:jc w:val="right"/>
+                    <w:jc w:val="center"/>
+                  </w:pPr>
+                  <w:r>
+                    <w:t xml:space="preserve">17,496</w:t>
+                  </w:r>
+                </w:p>
+              </w:tc>
+            </w:tr>
+            <w:tr>
+              <w:tc>
+                <w:tcPr/>
+                <w:p>
+                  <w:pPr>
+                    <w:pStyle w:val="Compact"/>
+                    <w:jc w:val="left"/>
+                    <w:jc w:val="center"/>
+                  </w:pPr>
+                  <w:r>
+                    <w:t xml:space="preserve">Municipality name + year</w:t>
+                  </w:r>
+                </w:p>
+              </w:tc>
+              <w:tc>
+                <w:tcPr/>
+                <w:p>
+                  <w:pPr>
+                    <w:pStyle w:val="Compact"/>
+                    <w:jc w:val="right"/>
+                    <w:jc w:val="center"/>
+                  </w:pPr>
+                  <w:r>
+                    <w:t xml:space="preserve">17,249</w:t>
+                  </w:r>
+                </w:p>
+              </w:tc>
+              <w:tc>
+                <w:tcPr/>
+                <w:p>
+                  <w:pPr>
+                    <w:pStyle w:val="Compact"/>
+                    <w:jc w:val="right"/>
+                    <w:jc w:val="center"/>
+                  </w:pPr>
+                  <w:r>
+                    <w:t xml:space="preserve">18,591</w:t>
+                  </w:r>
+                </w:p>
+              </w:tc>
+              <w:tc>
+                <w:tcPr/>
+                <w:p>
+                  <w:pPr>
+                    <w:pStyle w:val="Compact"/>
+                    <w:jc w:val="right"/>
+                    <w:jc w:val="center"/>
+                  </w:pPr>
+                  <w:r>
+                    <w:t xml:space="preserve">1,342</w:t>
+                  </w:r>
+                </w:p>
+              </w:tc>
+            </w:tr>
+            <w:tr>
+              <w:tc>
+                <w:tcPr/>
+                <w:p>
+                  <w:pPr>
+                    <w:pStyle w:val="Compact"/>
+                    <w:jc w:val="left"/>
+                    <w:jc w:val="center"/>
+                  </w:pPr>
+                  <w:r>
+                    <w:t xml:space="preserve">Department name + municipality name + year</w:t>
+                  </w:r>
+                </w:p>
+              </w:tc>
+              <w:tc>
+                <w:tcPr/>
+                <w:p>
+                  <w:pPr>
+                    <w:pStyle w:val="Compact"/>
+                    <w:jc w:val="right"/>
+                    <w:jc w:val="center"/>
+                  </w:pPr>
+                  <w:r>
+                    <w:t xml:space="preserve">18,591</w:t>
+                  </w:r>
+                </w:p>
+              </w:tc>
+              <w:tc>
+                <w:tcPr/>
+                <w:p>
+                  <w:pPr>
+                    <w:pStyle w:val="Compact"/>
+                    <w:jc w:val="right"/>
+                    <w:jc w:val="center"/>
+                  </w:pPr>
+                  <w:r>
+                    <w:t xml:space="preserve">18,591</w:t>
+                  </w:r>
+                </w:p>
+              </w:tc>
+              <w:tc>
+                <w:tcPr/>
+                <w:p>
+                  <w:pPr>
+                    <w:pStyle w:val="Compact"/>
+                    <w:jc w:val="right"/>
+                    <w:jc w:val="center"/>
+                  </w:pPr>
+                  <w:r>
+                    <w:t xml:space="preserve">0</w:t>
+                  </w:r>
+                </w:p>
+              </w:tc>
+            </w:tr>
+            <w:tr>
+              <w:tc>
+                <w:tcPr/>
+                <w:p>
+                  <w:pPr>
+                    <w:pStyle w:val="Compact"/>
+                    <w:jc w:val="left"/>
+                    <w:jc w:val="center"/>
+                  </w:pPr>
+                  <w:r>
+                    <w:t xml:space="preserve">Municipality code + year</w:t>
+                  </w:r>
+                </w:p>
+              </w:tc>
+              <w:tc>
+                <w:tcPr/>
+                <w:p>
+                  <w:pPr>
+                    <w:pStyle w:val="Compact"/>
+                    <w:jc w:val="right"/>
+                    <w:jc w:val="center"/>
+                  </w:pPr>
+                  <w:r>
+                    <w:t xml:space="preserve">18,591</w:t>
+                  </w:r>
+                </w:p>
+              </w:tc>
+              <w:tc>
+                <w:tcPr/>
+                <w:p>
+                  <w:pPr>
+                    <w:pStyle w:val="Compact"/>
+                    <w:jc w:val="right"/>
+                    <w:jc w:val="center"/>
+                  </w:pPr>
+                  <w:r>
+                    <w:t xml:space="preserve">18,591</w:t>
+                  </w:r>
+                </w:p>
+              </w:tc>
+              <w:tc>
+                <w:tcPr/>
+                <w:p>
+                  <w:pPr>
+                    <w:pStyle w:val="Compact"/>
+                    <w:jc w:val="right"/>
+                    <w:jc w:val="center"/>
+                  </w:pPr>
+                  <w:r>
+                    <w:t xml:space="preserve">0</w:t>
+                  </w:r>
+                </w:p>
+              </w:tc>
+            </w:tr>
+            <w:tr>
+              <w:tc>
+                <w:tcPr/>
+                <w:p>
+                  <w:pPr>
+                    <w:pStyle w:val="Compact"/>
+                    <w:jc w:val="left"/>
+                    <w:jc w:val="center"/>
+                  </w:pPr>
+                  <w:r>
+                    <w:t xml:space="preserve">Department code + year (aggregate rows)</w:t>
+                  </w:r>
+                </w:p>
+              </w:tc>
+              <w:tc>
+                <w:tcPr/>
+                <w:p>
+                  <w:pPr>
+                    <w:pStyle w:val="Compact"/>
+                    <w:jc w:val="right"/>
+                    <w:jc w:val="center"/>
+                  </w:pPr>
+                  <w:r>
+                    <w:t xml:space="preserve">569</w:t>
+                  </w:r>
+                </w:p>
+              </w:tc>
+              <w:tc>
+                <w:tcPr/>
+                <w:p>
+                  <w:pPr>
+                    <w:pStyle w:val="Compact"/>
+                    <w:jc w:val="right"/>
+                    <w:jc w:val="center"/>
+                  </w:pPr>
+                  <w:r>
+                    <w:t xml:space="preserve">569</w:t>
+                  </w:r>
+                </w:p>
+              </w:tc>
+              <w:tc>
+                <w:tcPr/>
+                <w:p>
+                  <w:pPr>
+                    <w:pStyle w:val="Compact"/>
+                    <w:jc w:val="right"/>
+                    <w:jc w:val="center"/>
+                  </w:pPr>
+                  <w:r>
+                    <w:t xml:space="preserve">0</w:t>
+                  </w:r>
+                </w:p>
+              </w:tc>
+            </w:tr>
+          </w:tbl>
+          <w:bookmarkEnd w:id="29"/>
+          <w:p/>
+        </w:tc>
+      </w:tr>
+    </w:tbl>
+    <w:p>
+      <w:pPr>
+        <w:pStyle w:val="BodyText"/>
+      </w:pPr>
+      <w:r>
+        <w:t xml:space="preserve">The municipal rows cover 1,095 municipality codes in 33 departments over 18 years, 2007 to 2024.</w:t>
+      </w:r>
+    </w:p>
+    <w:bookmarkEnd w:id="30"/>
+    <w:bookmarkStart w:id="31" w:name="answer"/>
+    <w:p>
+      <w:pPr>
+        <w:pStyle w:val="Heading2"/>
+      </w:pPr>
+      <w:r>
+        <w:t xml:space="preserve">2.3 Answer</w:t>
+      </w:r>
+    </w:p>
+    <w:p>
+      <w:pPr>
+        <w:pStyle w:val="FirstParagraph"/>
+      </w:pPr>
+      <w:r>
+        <w:t xml:space="preserve">The observational unit is the</w:t>
+      </w:r>
+      <w:r>
+        <w:t xml:space="preserve"> </w:t>
+      </w:r>
+      <w:r>
+        <w:rPr>
+          <w:b/>
+          <w:bCs/>
+        </w:rPr>
+        <w:t xml:space="preserve">municipality-year</w:t>
+      </w:r>
+      <w:r>
+        <w:t xml:space="preserve">. One row records, for one municipality in one calendar year, the annual IRCA of the municipality as a whole and of its urban and rural areas, with the risk band of each. The department-year rows marked</w:t>
+      </w:r>
+      <w:r>
+        <w:t xml:space="preserve"> </w:t>
+      </w:r>
+      <w:r>
+        <w:rPr>
+          <w:rStyle w:val="VerbatimChar"/>
+        </w:rPr>
+        <w:t xml:space="preserve">#TODOS</w:t>
+      </w:r>
+      <w:r>
+        <w:t xml:space="preserve"> </w:t>
+      </w:r>
+      <w:r>
+        <w:t xml:space="preserve">are a second, coarser set of units derived from the same surveillance; they must be separated from the municipal rows before any count or average, or departments will be counted twice.</w:t>
+      </w:r>
+    </w:p>
+    <w:p>
+      <w:pPr>
+        <w:pStyle w:val="BodyText"/>
+      </w:pPr>
+      <w:r>
+        <w:t xml:space="preserve">It is equally important what the unit is not. The IRCA of a municipality-year is a consolidation of many water samples taken over the year, but the samples, the supply systems, the sampling points and the months are not in the file, and the number of samples behind a value is unknown. A row is therefore the annual summary of a municipality’s surveillance, not an observation of any water supply. For any join or panel construction the numeric code, not the name, is the key.</w:t>
+      </w:r>
+    </w:p>
+    <w:p>
+      <w:r>
+        <w:br w:type="page"/>
+      </w:r>
+    </w:p>
+    <w:bookmarkEnd w:id="31"/>
+    <w:bookmarkEnd w:id="32"/>
+    <w:bookmarkStart w:id="49" w:name="question-2-how-complete-are-the-data"/>
+    <w:p>
+      <w:pPr>
+        <w:pStyle w:val="Heading1"/>
+      </w:pPr>
+      <w:r>
+        <w:t xml:space="preserve">3. Question 2: How complete are the data?</w:t>
+      </w:r>
+    </w:p>
+    <w:p>
+      <w:pPr>
+        <w:pStyle w:val="FirstParagraph"/>
+      </w:pPr>
+      <w:r>
+        <w:t xml:space="preserve">Incompleteness can occur at three levels, and the answer differs at each. A row can exist but lack a value (a missing value). A municipality can lack a row in a year in which other municipalities have one (a missing unit). A year can be absent altogether, or absent from the series of a particular municipality (a missing year).</w:t>
+      </w:r>
+    </w:p>
+    <w:bookmarkStart w:id="38" w:name="missing-values-within-rows"/>
+    <w:p>
+      <w:pPr>
+        <w:pStyle w:val="Heading2"/>
+      </w:pPr>
+      <w:r>
+        <w:t xml:space="preserve">3.1 Missing values within rows</w:t>
+      </w:r>
+    </w:p>
+    <w:p>
+      <w:pPr>
+        <w:pStyle w:val="FirstParagraph"/>
+      </w:pPr>
+      <w:r>
+        <w:t xml:space="preserve">No cell is empty (0 empty cells), and the overall IRCA and its band are never missing (0 rows). Missingness lives entirely in the urban and rural components, encoded by</w:t>
+      </w:r>
+      <w:r>
+        <w:t xml:space="preserve"> </w:t>
+      </w:r>
+      <w:r>
+        <w:rPr>
+          <w:rStyle w:val="VerbatimChar"/>
+        </w:rPr>
+        <w:t xml:space="preserve">ND</w:t>
+      </w:r>
+      <w:r>
+        <w:t xml:space="preserve">, always for the value and its band together. In the municipal rows the rural index is missing in 51% of rows and the urban index in 7%; only 47% of rows carry all three indices, and 917 rows carry an overall index with neither component. Department aggregates are better filled: the rural index is missing in 14% of them. Every reported band agrees with the band implied by its value (0 disagreements in 46,597 values).</w:t>
+      </w:r>
+    </w:p>
+    <w:p>
+      <w:pPr>
+        <w:pStyle w:val="BodyText"/>
+      </w:pPr>
+      <w:r>
+        <w:t xml:space="preserve">The rural gap has changed over time (</w:t>
+      </w:r>
+      <w:hyperlink w:anchor="fig-nd-year">
+        <w:r>
+          <w:rPr>
+            <w:rStyle w:val="Hyperlink"/>
+          </w:rPr>
+          <w:t xml:space="preserve">Figure 2</w:t>
+        </w:r>
+      </w:hyperlink>
+      <w:r>
+        <w:t xml:space="preserve">). It affected 77% of rows in 2007, fell to around 40% by 2010, and has stayed above half since 2016. The urban index is rarely missing except in 2016 and 2017, peaking at 24% in 2017, when both components go missing together, which suggests a reporting artefact rather than a change in sampling. The rural gap is intermittent rather than structural: 148 municipalities never report a rural index, 48 always do, and 899 alternate.</w:t>
+      </w:r>
+    </w:p>
+    <w:p>
+      <w:pPr>
+        <w:pStyle w:val="BodyText"/>
+      </w:pPr>
+      <w:r>
+        <w:t xml:space="preserve">Two things distinguish</w:t>
+      </w:r>
+      <w:r>
+        <w:t xml:space="preserve"> </w:t>
+      </w:r>
+      <w:r>
+        <w:rPr>
+          <w:rStyle w:val="VerbatimChar"/>
+        </w:rPr>
+        <w:t xml:space="preserve">ND</w:t>
+      </w:r>
+      <w:r>
+        <w:t xml:space="preserve"> </w:t>
+      </w:r>
+      <w:r>
+        <w:t xml:space="preserve">from a missing unit. Definitionally, a row with</w:t>
+      </w:r>
+      <w:r>
+        <w:t xml:space="preserve"> </w:t>
+      </w:r>
+      <w:r>
+        <w:rPr>
+          <w:rStyle w:val="VerbatimChar"/>
+        </w:rPr>
+        <w:t xml:space="preserve">ND</w:t>
+      </w:r>
+      <w:r>
+        <w:t xml:space="preserve"> </w:t>
+      </w:r>
+      <w:r>
+        <w:t xml:space="preserve">still carries an overall index, whereas an absent municipality-year carries nothing. Empirically,</w:t>
+      </w:r>
+      <w:r>
+        <w:t xml:space="preserve"> </w:t>
+      </w:r>
+      <w:r>
+        <w:rPr>
+          <w:rStyle w:val="VerbatimChar"/>
+        </w:rPr>
+        <w:t xml:space="preserve">ND</w:t>
+      </w:r>
+      <w:r>
+        <w:t xml:space="preserve"> </w:t>
+      </w:r>
+      <w:r>
+        <w:t xml:space="preserve">does not always mean that no rural samples were taken: among the 8,621 rows with a rural</w:t>
+      </w:r>
+      <w:r>
+        <w:t xml:space="preserve"> </w:t>
+      </w:r>
+      <w:r>
+        <w:rPr>
+          <w:rStyle w:val="VerbatimChar"/>
+        </w:rPr>
+        <w:t xml:space="preserve">ND</w:t>
+      </w:r>
+      <w:r>
+        <w:t xml:space="preserve"> </w:t>
+      </w:r>
+      <w:r>
+        <w:t xml:space="preserve">and an urban value, the overall index equals the urban index in 87% of cases, but in 785 rows the two differ by more than one point, so rural samples entered the overall index even though the rural component is reported as unavailable.</w:t>
+      </w:r>
+    </w:p>
+    <w:bookmarkStart w:id="37" w:name="cell-fig-nd-year"/>
+    <w:tbl>
+      <w:tblPr>
+        <w:tblStyle w:val="Table"/>
+        <w:tblW w:type="pct" w:w="5000"/>
+        <w:tblLayout w:type="fixed"/>
+        <w:tblLook w:firstRow="0" w:lastRow="0" w:firstColumn="0" w:lastColumn="0" w:noHBand="0" w:noVBand="0" w:val="0000"/>
+      </w:tblPr>
+      <w:tblGrid>
+        <w:gridCol w:w="7920"/>
+      </w:tblGrid>
+      <w:tr>
+        <w:tc>
+          <w:tcPr/>
+          <w:bookmarkStart w:id="36" w:name="fig-nd-year"/>
+          <w:p>
+            <w:pPr>
+              <w:pStyle w:val="Compact"/>
+              <w:jc w:val="center"/>
+            </w:pPr>
+            <w:r>
+              <w:drawing>
+                <wp:inline>
+                  <wp:extent cx="5334000" cy="1969476"/>
+                  <wp:effectExtent b="0" l="0" r="0" t="0"/>
+                  <wp:docPr descr="" title="" id="34" name="Picture"/>
+                  <a:graphic>
+                    <a:graphicData uri="http://schemas.openxmlformats.org/drawingml/2006/picture">
+                      <pic:pic>
+                        <pic:nvPicPr>
+                          <pic:cNvPr descr="index_files/figure-docx/fig-nd-year-1.png" id="35" name="Picture"/>
+                          <pic:cNvPicPr>
+                            <a:picLocks noChangeArrowheads="1" noChangeAspect="1"/>
+                          </pic:cNvPicPr>
+                        </pic:nvPicPr>
+                        <pic:blipFill>
+                          <a:blip r:embed="rId33"/>
+                          <a:stretch>
+                            <a:fillRect/>
+                          </a:stretch>
+                        </pic:blipFill>
+                        <pic:spPr bwMode="auto">
+                          <a:xfrm>
+                            <a:off x="0" y="0"/>
+                            <a:ext cx="5334000" cy="1969476"/>
+                          </a:xfrm>
+                          <a:prstGeom prst="rect">
+                            <a:avLst/>
+                          </a:prstGeom>
+                          <a:noFill/>
+                          <a:ln w="9525">
+                            <a:noFill/>
+                            <a:headEnd/>
+                            <a:tailEnd/>
+                          </a:ln>
+                        </pic:spPr>
+                      </pic:pic>
+                    </a:graphicData>
+                  </a:graphic>
+                </wp:inline>
+              </w:drawing>
+            </w:r>
+          </w:p>
+          <w:p>
+            <w:pPr>
+              <w:jc w:val="center"/>
+            </w:pPr>
+            <w:pPr>
+              <w:jc w:val="start"/>
+              <w:spacing w:before="200"/>
+              <w:pStyle w:val="ImageCaption"/>
+            </w:pPr>
+            <w:r>
+              <w:t xml:space="preserve">Figure 2: Share of municipal rows in which the urban index, the rural index, or both are reported as ND, by year.</w:t>
+            </w:r>
+          </w:p>
+          <w:bookmarkEnd w:id="36"/>
+        </w:tc>
+      </w:tr>
+    </w:tbl>
+    <w:bookmarkEnd w:id="37"/>
+    <w:bookmarkEnd w:id="38"/>
+    <w:bookmarkStart w:id="45" w:name="missing-observational-units"/>
+    <w:p>
+      <w:pPr>
+        <w:pStyle w:val="Heading2"/>
+      </w:pPr>
+      <w:r>
+        <w:t xml:space="preserve">3.2 Missing observational units</w:t>
+      </w:r>
+    </w:p>
+    <w:p>
+      <w:pPr>
+        <w:pStyle w:val="FirstParagraph"/>
+      </w:pPr>
+      <w:hyperlink w:anchor="tbl-frames">
+        <w:r>
+          <w:rPr>
+            <w:rStyle w:val="Hyperlink"/>
+          </w:rPr>
+          <w:t xml:space="preserve">Table 4</w:t>
+        </w:r>
+      </w:hyperlink>
+      <w:r>
+        <w:t xml:space="preserve"> </w:t>
+      </w:r>
+      <w:r>
+        <w:t xml:space="preserve">counts the units that are expected and observed under each frame. Against the file’s own frame, 5.7% of municipality-years are absent; against the national register, 6.4%, because 8 municipalities never appear at all (Antioquia: Murindó, Vigía del Fuerte; Chocó: El Cantón del San Pablo, Istmina, Medio Baudó, Riosucio, Río Quito, Unguía). Coverage improved from 2007 to 2019, when only 23 municipalities were absent, and has weakened since 2020; 2022 is the least complete year, with 142 absent. Department aggregates are absent in 25 department-years, exactly those in which the department reported no municipality at all (0 exceptions), so the aggregate rows add no coverage of their own.</w:t>
+      </w:r>
+    </w:p>
+    <w:tbl>
+      <w:tblPr>
+        <w:tblStyle w:val="Table"/>
+        <w:tblW w:type="pct" w:w="5000"/>
+        <w:tblLayout w:type="fixed"/>
+        <w:tblLook w:firstRow="0" w:lastRow="0" w:firstColumn="0" w:lastColumn="0" w:noHBand="0" w:noVBand="0" w:val="0000"/>
+      </w:tblPr>
+      <w:tblGrid>
+        <w:gridCol w:w="7920"/>
+      </w:tblGrid>
+      <w:tr>
+        <w:tc>
+          <w:tcPr/>
+          <w:bookmarkStart w:id="39" w:name="tbl-frames"/>
+          <w:p>
+            <w:pPr>
+              <w:jc w:val="center"/>
+            </w:pPr>
+            <w:pPr>
+              <w:jc w:val="start"/>
+              <w:spacing w:before="200"/>
+              <w:pStyle w:val="ImageCaption"/>
+            </w:pPr>
+            <w:r>
+              <w:t xml:space="preserve">Table 4: Expected and observed units under the internal frame (codes present at least once by years present at least once) and the external frame (DANE 2020 municipal register, non-municipalised areas excluded).</w:t>
+            </w:r>
+          </w:p>
+          <w:tbl>
+            <w:tblPr>
+              <w:tblStyle w:val="Table"/>
+              <w:tblW w:type="pct" w:w="5000"/>
+              <w:tblLayout w:type="fixed"/>
+              <w:tblLook w:firstRow="1" w:lastRow="0" w:firstColumn="0" w:lastColumn="0" w:noHBand="0" w:noVBand="0" w:val="0020"/>
+            </w:tblPr>
+            <w:tblGrid>
+              <w:gridCol w:w="3696"/>
+              <w:gridCol w:w="950"/>
+              <w:gridCol w:w="950"/>
+              <w:gridCol w:w="844"/>
+              <w:gridCol w:w="1478"/>
+            </w:tblGrid>
+            <w:tr>
+              <w:trPr>
+                <w:tblHeader w:val="on"/>
+              </w:trPr>
+              <w:tc>
+                <w:tcPr/>
+                <w:p>
+                  <w:pPr>
+                    <w:pStyle w:val="Compact"/>
+                    <w:jc w:val="left"/>
+                    <w:jc w:val="center"/>
+                  </w:pPr>
+                  <w:r>
+                    <w:t xml:space="preserve">Units</w:t>
+                  </w:r>
+                </w:p>
+              </w:tc>
+              <w:tc>
+                <w:tcPr/>
+                <w:p>
+                  <w:pPr>
+                    <w:pStyle w:val="Compact"/>
+                    <w:jc w:val="right"/>
+                    <w:jc w:val="center"/>
+                  </w:pPr>
+                  <w:r>
+                    <w:t xml:space="preserve">Expected</w:t>
+                  </w:r>
+                </w:p>
+              </w:tc>
+              <w:tc>
+                <w:tcPr/>
+                <w:p>
+                  <w:pPr>
+                    <w:pStyle w:val="Compact"/>
+                    <w:jc w:val="right"/>
+                    <w:jc w:val="center"/>
+                  </w:pPr>
+                  <w:r>
+                    <w:t xml:space="preserve">Observed</w:t>
+                  </w:r>
+                </w:p>
+              </w:tc>
+              <w:tc>
+                <w:tcPr/>
+                <w:p>
+                  <w:pPr>
+                    <w:pStyle w:val="Compact"/>
+                    <w:jc w:val="right"/>
+                    <w:jc w:val="center"/>
+                  </w:pPr>
+                  <w:r>
+                    <w:t xml:space="preserve">Missing</w:t>
+                  </w:r>
+                </w:p>
+              </w:tc>
+              <w:tc>
+                <w:tcPr/>
+                <w:p>
+                  <w:pPr>
+                    <w:pStyle w:val="Compact"/>
+                    <w:jc w:val="right"/>
+                    <w:jc w:val="center"/>
+                  </w:pPr>
+                  <w:r>
+                    <w:t xml:space="preserve">Share missing</w:t>
+                  </w:r>
+                </w:p>
+              </w:tc>
+            </w:tr>
+            <w:tr>
+              <w:tc>
+                <w:tcPr/>
+                <w:p>
+                  <w:pPr>
+                    <w:pStyle w:val="Compact"/>
+                    <w:jc w:val="left"/>
+                    <w:jc w:val="center"/>
+                  </w:pPr>
+                  <w:r>
+                    <w:t xml:space="preserve">Municipality-years, internal frame</w:t>
+                  </w:r>
+                </w:p>
+              </w:tc>
+              <w:tc>
+                <w:tcPr/>
+                <w:p>
+                  <w:pPr>
+                    <w:pStyle w:val="Compact"/>
+                    <w:jc w:val="right"/>
+                    <w:jc w:val="center"/>
+                  </w:pPr>
+                  <w:r>
+                    <w:t xml:space="preserve">19,710</w:t>
+                  </w:r>
+                </w:p>
+              </w:tc>
+              <w:tc>
+                <w:tcPr/>
+                <w:p>
+                  <w:pPr>
+                    <w:pStyle w:val="Compact"/>
+                    <w:jc w:val="right"/>
+                    <w:jc w:val="center"/>
+                  </w:pPr>
+                  <w:r>
+                    <w:t xml:space="preserve">18,591</w:t>
+                  </w:r>
+                </w:p>
+              </w:tc>
+              <w:tc>
+                <w:tcPr/>
+                <w:p>
+                  <w:pPr>
+                    <w:pStyle w:val="Compact"/>
+                    <w:jc w:val="right"/>
+                    <w:jc w:val="center"/>
+                  </w:pPr>
+                  <w:r>
+                    <w:t xml:space="preserve">1,119</w:t>
+                  </w:r>
+                </w:p>
+              </w:tc>
+              <w:tc>
+                <w:tcPr/>
+                <w:p>
+                  <w:pPr>
+                    <w:pStyle w:val="Compact"/>
+                    <w:jc w:val="right"/>
+                    <w:jc w:val="center"/>
+                  </w:pPr>
+                  <w:r>
+                    <w:t xml:space="preserve">5.7%</w:t>
+                  </w:r>
+                </w:p>
+              </w:tc>
+            </w:tr>
+            <w:tr>
+              <w:tc>
+                <w:tcPr/>
+                <w:p>
+                  <w:pPr>
+                    <w:pStyle w:val="Compact"/>
+                    <w:jc w:val="left"/>
+                    <w:jc w:val="center"/>
+                  </w:pPr>
+                  <w:r>
+                    <w:t xml:space="preserve">Municipality-years, external frame</w:t>
+                  </w:r>
+                </w:p>
+              </w:tc>
+              <w:tc>
+                <w:tcPr/>
+                <w:p>
+                  <w:pPr>
+                    <w:pStyle w:val="Compact"/>
+                    <w:jc w:val="right"/>
+                    <w:jc w:val="center"/>
+                  </w:pPr>
+                  <w:r>
+                    <w:t xml:space="preserve">19,854</w:t>
+                  </w:r>
+                </w:p>
+              </w:tc>
+              <w:tc>
+                <w:tcPr/>
+                <w:p>
+                  <w:pPr>
+                    <w:pStyle w:val="Compact"/>
+                    <w:jc w:val="right"/>
+                    <w:jc w:val="center"/>
+                  </w:pPr>
+                  <w:r>
+                    <w:t xml:space="preserve">18,591</w:t>
+                  </w:r>
+                </w:p>
+              </w:tc>
+              <w:tc>
+                <w:tcPr/>
+                <w:p>
+                  <w:pPr>
+                    <w:pStyle w:val="Compact"/>
+                    <w:jc w:val="right"/>
+                    <w:jc w:val="center"/>
+                  </w:pPr>
+                  <w:r>
+                    <w:t xml:space="preserve">1,263</w:t>
+                  </w:r>
+                </w:p>
+              </w:tc>
+              <w:tc>
+                <w:tcPr/>
+                <w:p>
+                  <w:pPr>
+                    <w:pStyle w:val="Compact"/>
+                    <w:jc w:val="right"/>
+                    <w:jc w:val="center"/>
+                  </w:pPr>
+                  <w:r>
+                    <w:t xml:space="preserve">6.4%</w:t>
+                  </w:r>
+                </w:p>
+              </w:tc>
+            </w:tr>
+            <w:tr>
+              <w:tc>
+                <w:tcPr/>
+                <w:p>
+                  <w:pPr>
+                    <w:pStyle w:val="Compact"/>
+                    <w:jc w:val="left"/>
+                    <w:jc w:val="center"/>
+                  </w:pPr>
+                  <w:r>
+                    <w:t xml:space="preserve">Municipalities, external frame</w:t>
+                  </w:r>
+                </w:p>
+              </w:tc>
+              <w:tc>
+                <w:tcPr/>
+                <w:p>
+                  <w:pPr>
+                    <w:pStyle w:val="Compact"/>
+                    <w:jc w:val="right"/>
+                    <w:jc w:val="center"/>
+                  </w:pPr>
+                  <w:r>
+                    <w:t xml:space="preserve">1,103</w:t>
+                  </w:r>
+                </w:p>
+              </w:tc>
+              <w:tc>
+                <w:tcPr/>
+                <w:p>
+                  <w:pPr>
+                    <w:pStyle w:val="Compact"/>
+                    <w:jc w:val="right"/>
+                    <w:jc w:val="center"/>
+                  </w:pPr>
+                  <w:r>
+                    <w:t xml:space="preserve">1,095</w:t>
+                  </w:r>
+                </w:p>
+              </w:tc>
+              <w:tc>
+                <w:tcPr/>
+                <w:p>
+                  <w:pPr>
+                    <w:pStyle w:val="Compact"/>
+                    <w:jc w:val="right"/>
+                    <w:jc w:val="center"/>
+                  </w:pPr>
+                  <w:r>
+                    <w:t xml:space="preserve">8</w:t>
+                  </w:r>
+                </w:p>
+              </w:tc>
+              <w:tc>
+                <w:tcPr/>
+                <w:p>
+                  <w:pPr>
+                    <w:pStyle w:val="Compact"/>
+                    <w:jc w:val="right"/>
+                    <w:jc w:val="center"/>
+                  </w:pPr>
+                  <w:r>
+                    <w:t xml:space="preserve">0.7%</w:t>
+                  </w:r>
+                </w:p>
+              </w:tc>
+            </w:tr>
+            <w:tr>
+              <w:tc>
+                <w:tcPr/>
+                <w:p>
+                  <w:pPr>
+                    <w:pStyle w:val="Compact"/>
+                    <w:jc w:val="left"/>
+                    <w:jc w:val="center"/>
+                  </w:pPr>
+                  <w:r>
+                    <w:t xml:space="preserve">Department-years</w:t>
+                  </w:r>
+                </w:p>
+              </w:tc>
+              <w:tc>
+                <w:tcPr/>
+                <w:p>
+                  <w:pPr>
+                    <w:pStyle w:val="Compact"/>
+                    <w:jc w:val="right"/>
+                    <w:jc w:val="center"/>
+                  </w:pPr>
+                  <w:r>
+                    <w:t xml:space="preserve">594</w:t>
+                  </w:r>
+                </w:p>
+              </w:tc>
+              <w:tc>
+                <w:tcPr/>
+                <w:p>
+                  <w:pPr>
+                    <w:pStyle w:val="Compact"/>
+                    <w:jc w:val="right"/>
+                    <w:jc w:val="center"/>
+                  </w:pPr>
+                  <w:r>
+                    <w:t xml:space="preserve">569</w:t>
+                  </w:r>
+                </w:p>
+              </w:tc>
+              <w:tc>
+                <w:tcPr/>
+                <w:p>
+                  <w:pPr>
+                    <w:pStyle w:val="Compact"/>
+                    <w:jc w:val="right"/>
+                    <w:jc w:val="center"/>
+                  </w:pPr>
+                  <w:r>
+                    <w:t xml:space="preserve">25</w:t>
+                  </w:r>
+                </w:p>
+              </w:tc>
+              <w:tc>
+                <w:tcPr/>
+                <w:p>
+                  <w:pPr>
+                    <w:pStyle w:val="Compact"/>
+                    <w:jc w:val="right"/>
+                    <w:jc w:val="center"/>
+                  </w:pPr>
+                  <w:r>
+                    <w:t xml:space="preserve">4.2%</w:t>
+                  </w:r>
+                </w:p>
+              </w:tc>
+            </w:tr>
+          </w:tbl>
+          <w:bookmarkEnd w:id="39"/>
+          <w:p/>
+        </w:tc>
+      </w:tr>
+    </w:tbl>
+    <w:p>
+      <w:pPr>
+        <w:pStyle w:val="BodyText"/>
+      </w:pPr>
+      <w:r>
+        <w:t xml:space="preserve">The gaps are concentrated (</w:t>
+      </w:r>
+      <w:hyperlink w:anchor="fig-heatmap">
+        <w:r>
+          <w:rPr>
+            <w:rStyle w:val="Hyperlink"/>
+          </w:rPr>
+          <w:t xml:space="preserve">Figure 3</w:t>
+        </w:r>
+      </w:hyperlink>
+      <w:r>
+        <w:t xml:space="preserve">). Only 5 departments are complete over the whole period. Chocó has no rows of any kind before 2014 and is missing 87% of its municipality-years, 471 of the 1,263 absent nationally; Guainía, Vaupés, Guaviare, Córdoba and Amazonas each lack more than a fifth.</w:t>
+      </w:r>
+    </w:p>
+    <w:bookmarkStart w:id="44" w:name="cell-fig-heatmap"/>
+    <w:tbl>
+      <w:tblPr>
+        <w:tblStyle w:val="Table"/>
+        <w:tblW w:type="pct" w:w="5000"/>
+        <w:tblLayout w:type="fixed"/>
+        <w:tblLook w:firstRow="0" w:lastRow="0" w:firstColumn="0" w:lastColumn="0" w:noHBand="0" w:noVBand="0" w:val="0000"/>
+      </w:tblPr>
+      <w:tblGrid>
+        <w:gridCol w:w="7920"/>
+      </w:tblGrid>
+      <w:tr>
+        <w:tc>
+          <w:tcPr/>
+          <w:bookmarkStart w:id="43" w:name="fig-heatmap"/>
           <w:p>
             <w:pPr>
               <w:pStyle w:val="Compact"/>
@@ -1166,18 +2836,18 @@
                 <wp:inline>
                   <wp:extent cx="5334000" cy="2954215"/>
                   <wp:effectExtent b="0" l="0" r="0" t="0"/>
-                  <wp:docPr descr="" title="" id="33" name="Picture"/>
+                  <wp:docPr descr="" title="" id="41" name="Picture"/>
                   <a:graphic>
                     <a:graphicData uri="http://schemas.openxmlformats.org/drawingml/2006/picture">
                       <pic:pic>
                         <pic:nvPicPr>
-                          <pic:cNvPr descr="index_files/figure-docx/fig-heatmap-1.png" id="34" name="Picture"/>
+                          <pic:cNvPr descr="index_files/figure-docx/fig-heatmap-1.png" id="42" name="Picture"/>
                           <pic:cNvPicPr>
                             <a:picLocks noChangeArrowheads="1" noChangeAspect="1"/>
                           </pic:cNvPicPr>
                         </pic:nvPicPr>
                         <pic:blipFill>
-                          <a:blip r:embed="rId32"/>
+                          <a:blip r:embed="rId40"/>
                           <a:stretch>
                             <a:fillRect/>
                           </a:stretch>
@@ -1214,22 +2884,22 @@
               <w:pStyle w:val="ImageCaption"/>
             </w:pPr>
             <w:r>
-              <w:t xml:space="preserve">Figure 2: Share of each department’s municipalities absent from the file in each year, departments ordered by overall share missing.</w:t>
+              <w:t xml:space="preserve">Figure 3: Share of each department’s municipalities absent from the file in each year, on the external frame. Departments are ordered by their overall share missing; the number of municipalities in the register follows each name.</w:t>
             </w:r>
           </w:p>
-          <w:bookmarkEnd w:id="35"/>
+          <w:bookmarkEnd w:id="43"/>
         </w:tc>
       </w:tr>
     </w:tbl>
-    <w:bookmarkEnd w:id="36"/>
-    <w:bookmarkEnd w:id="37"/>
-    <w:bookmarkStart w:id="38" w:name="missing-years"/>
+    <w:bookmarkEnd w:id="44"/>
+    <w:bookmarkEnd w:id="45"/>
+    <w:bookmarkStart w:id="47" w:name="missing-years-and-panel-balance"/>
     <w:p>
       <w:pPr>
         <w:pStyle w:val="Heading2"/>
       </w:pPr>
       <w:r>
-        <w:t xml:space="preserve">3.3 Missing years</w:t>
+        <w:t xml:space="preserve">3.3 Missing years and panel balance</w:t>
       </w:r>
     </w:p>
     <w:p>
@@ -1237,11 +2907,395 @@
         <w:pStyle w:val="FirstParagraph"/>
       </w:pPr>
       <w:r>
-        <w:t xml:space="preserve">At the national level there are no missing years: every calendar year from 2007 to 2024 is present (0 gaps). The file was downloaded in September 2026, so the absence of 2025 most likely reflects publication lag. At the municipal level, 732 municipalities (67%) are observed in all 18 years. Of the rest, 101 start after 2007, 89 end before 2024, and 259 have at least one interruption inside their series, accounting for 460 missing municipality-years.</w:t>
+        <w:t xml:space="preserve">At the national level no year is missing: every calendar year from 2007 to 2024 is present (0 gaps). The file was downloaded in September 2026, so the absence of 2025 most likely reflects publication lag rather than a gap. At the municipal level the picture is different (</w:t>
+      </w:r>
+      <w:hyperlink w:anchor="tbl-series">
+        <w:r>
+          <w:rPr>
+            <w:rStyle w:val="Hyperlink"/>
+          </w:rPr>
+          <w:t xml:space="preserve">Table 5</w:t>
+        </w:r>
+      </w:hyperlink>
+      <w:r>
+        <w:t xml:space="preserve">). 732 municipalities (67%) are observed in every year. Of the rest, 101 enter after 2007, 89 drop out before 2024, and 259 have at least one interruption inside their series, which together account for 460 interior gap-years. For anyone who needs a balanced panel, shortening the window helps only moderately: 811 of the 1,103 register municipalities are observed in every year from 2010, 835 from 2015 and 898 from 2019.</w:t>
       </w:r>
     </w:p>
-    <w:bookmarkEnd w:id="38"/>
-    <w:bookmarkStart w:id="39" w:name="answer-1"/>
+    <w:tbl>
+      <w:tblPr>
+        <w:tblStyle w:val="Table"/>
+        <w:tblW w:type="pct" w:w="5000"/>
+        <w:tblLayout w:type="fixed"/>
+        <w:tblLook w:firstRow="0" w:lastRow="0" w:firstColumn="0" w:lastColumn="0" w:noHBand="0" w:noVBand="0" w:val="0000"/>
+      </w:tblPr>
+      <w:tblGrid>
+        <w:gridCol w:w="7920"/>
+      </w:tblGrid>
+      <w:tr>
+        <w:tc>
+          <w:tcPr/>
+          <w:bookmarkStart w:id="46" w:name="tbl-series"/>
+          <w:p>
+            <w:pPr>
+              <w:jc w:val="center"/>
+            </w:pPr>
+            <w:pPr>
+              <w:jc w:val="start"/>
+              <w:spacing w:before="200"/>
+              <w:pStyle w:val="ImageCaption"/>
+            </w:pPr>
+            <w:r>
+              <w:t xml:space="preserve">Table 5: Continuity of each municipality’s series on the internal frame. A series starts late if its first year is after 2007, ends early if its last year is before 2024, and has interior gaps if years are missing between its first and last.</w:t>
+            </w:r>
+          </w:p>
+          <w:tbl>
+            <w:tblPr>
+              <w:tblStyle w:val="Table"/>
+              <w:tblW w:type="pct" w:w="5000"/>
+              <w:tblLayout w:type="fixed"/>
+              <w:tblLook w:firstRow="1" w:lastRow="0" w:firstColumn="0" w:lastColumn="0" w:noHBand="0" w:noVBand="0" w:val="0020"/>
+            </w:tblPr>
+            <w:tblGrid>
+              <w:gridCol w:w="2712"/>
+              <w:gridCol w:w="1627"/>
+              <w:gridCol w:w="650"/>
+              <w:gridCol w:w="2929"/>
+            </w:tblGrid>
+            <w:tr>
+              <w:trPr>
+                <w:tblHeader w:val="on"/>
+              </w:trPr>
+              <w:tc>
+                <w:tcPr/>
+                <w:p>
+                  <w:pPr>
+                    <w:pStyle w:val="Compact"/>
+                    <w:jc w:val="left"/>
+                    <w:jc w:val="center"/>
+                  </w:pPr>
+                  <w:r>
+                    <w:t xml:space="preserve">Pattern</w:t>
+                  </w:r>
+                </w:p>
+              </w:tc>
+              <w:tc>
+                <w:tcPr/>
+                <w:p>
+                  <w:pPr>
+                    <w:pStyle w:val="Compact"/>
+                    <w:jc w:val="right"/>
+                    <w:jc w:val="center"/>
+                  </w:pPr>
+                  <w:r>
+                    <w:t xml:space="preserve">Municipalities</w:t>
+                  </w:r>
+                </w:p>
+              </w:tc>
+              <w:tc>
+                <w:tcPr/>
+                <w:p>
+                  <w:pPr>
+                    <w:pStyle w:val="Compact"/>
+                    <w:jc w:val="right"/>
+                    <w:jc w:val="center"/>
+                  </w:pPr>
+                  <w:r>
+                    <w:t xml:space="preserve">Share</w:t>
+                  </w:r>
+                </w:p>
+              </w:tc>
+              <w:tc>
+                <w:tcPr/>
+                <w:p>
+                  <w:pPr>
+                    <w:pStyle w:val="Compact"/>
+                    <w:jc w:val="right"/>
+                    <w:jc w:val="center"/>
+                  </w:pPr>
+                  <w:r>
+                    <w:t xml:space="preserve">Missing municipality-years</w:t>
+                  </w:r>
+                </w:p>
+              </w:tc>
+            </w:tr>
+            <w:tr>
+              <w:tc>
+                <w:tcPr/>
+                <w:p>
+                  <w:pPr>
+                    <w:pStyle w:val="Compact"/>
+                    <w:jc w:val="left"/>
+                    <w:jc w:val="center"/>
+                  </w:pPr>
+                  <w:r>
+                    <w:t xml:space="preserve">Complete series</w:t>
+                  </w:r>
+                </w:p>
+              </w:tc>
+              <w:tc>
+                <w:tcPr/>
+                <w:p>
+                  <w:pPr>
+                    <w:pStyle w:val="Compact"/>
+                    <w:jc w:val="right"/>
+                    <w:jc w:val="center"/>
+                  </w:pPr>
+                  <w:r>
+                    <w:t xml:space="preserve">732</w:t>
+                  </w:r>
+                </w:p>
+              </w:tc>
+              <w:tc>
+                <w:tcPr/>
+                <w:p>
+                  <w:pPr>
+                    <w:pStyle w:val="Compact"/>
+                    <w:jc w:val="right"/>
+                    <w:jc w:val="center"/>
+                  </w:pPr>
+                  <w:r>
+                    <w:t xml:space="preserve">67%</w:t>
+                  </w:r>
+                </w:p>
+              </w:tc>
+              <w:tc>
+                <w:tcPr/>
+                <w:p>
+                  <w:pPr>
+                    <w:pStyle w:val="Compact"/>
+                    <w:jc w:val="right"/>
+                    <w:jc w:val="center"/>
+                  </w:pPr>
+                  <w:r>
+                    <w:t xml:space="preserve">0</w:t>
+                  </w:r>
+                </w:p>
+              </w:tc>
+            </w:tr>
+            <w:tr>
+              <w:tc>
+                <w:tcPr/>
+                <w:p>
+                  <w:pPr>
+                    <w:pStyle w:val="Compact"/>
+                    <w:jc w:val="left"/>
+                    <w:jc w:val="center"/>
+                  </w:pPr>
+                  <w:r>
+                    <w:t xml:space="preserve">Starts late only</w:t>
+                  </w:r>
+                </w:p>
+              </w:tc>
+              <w:tc>
+                <w:tcPr/>
+                <w:p>
+                  <w:pPr>
+                    <w:pStyle w:val="Compact"/>
+                    <w:jc w:val="right"/>
+                    <w:jc w:val="center"/>
+                  </w:pPr>
+                  <w:r>
+                    <w:t xml:space="preserve">49</w:t>
+                  </w:r>
+                </w:p>
+              </w:tc>
+              <w:tc>
+                <w:tcPr/>
+                <w:p>
+                  <w:pPr>
+                    <w:pStyle w:val="Compact"/>
+                    <w:jc w:val="right"/>
+                    <w:jc w:val="center"/>
+                  </w:pPr>
+                  <w:r>
+                    <w:t xml:space="preserve">4%</w:t>
+                  </w:r>
+                </w:p>
+              </w:tc>
+              <w:tc>
+                <w:tcPr/>
+                <w:p>
+                  <w:pPr>
+                    <w:pStyle w:val="Compact"/>
+                    <w:jc w:val="right"/>
+                    <w:jc w:val="center"/>
+                  </w:pPr>
+                  <w:r>
+                    <w:t xml:space="preserve">64</w:t>
+                  </w:r>
+                </w:p>
+              </w:tc>
+            </w:tr>
+            <w:tr>
+              <w:tc>
+                <w:tcPr/>
+                <w:p>
+                  <w:pPr>
+                    <w:pStyle w:val="Compact"/>
+                    <w:jc w:val="left"/>
+                    <w:jc w:val="center"/>
+                  </w:pPr>
+                  <w:r>
+                    <w:t xml:space="preserve">Ends early only</w:t>
+                  </w:r>
+                </w:p>
+              </w:tc>
+              <w:tc>
+                <w:tcPr/>
+                <w:p>
+                  <w:pPr>
+                    <w:pStyle w:val="Compact"/>
+                    <w:jc w:val="right"/>
+                    <w:jc w:val="center"/>
+                  </w:pPr>
+                  <w:r>
+                    <w:t xml:space="preserve">41</w:t>
+                  </w:r>
+                </w:p>
+              </w:tc>
+              <w:tc>
+                <w:tcPr/>
+                <w:p>
+                  <w:pPr>
+                    <w:pStyle w:val="Compact"/>
+                    <w:jc w:val="right"/>
+                    <w:jc w:val="center"/>
+                  </w:pPr>
+                  <w:r>
+                    <w:t xml:space="preserve">4%</w:t>
+                  </w:r>
+                </w:p>
+              </w:tc>
+              <w:tc>
+                <w:tcPr/>
+                <w:p>
+                  <w:pPr>
+                    <w:pStyle w:val="Compact"/>
+                    <w:jc w:val="right"/>
+                    <w:jc w:val="center"/>
+                  </w:pPr>
+                  <w:r>
+                    <w:t xml:space="preserve">135</w:t>
+                  </w:r>
+                </w:p>
+              </w:tc>
+            </w:tr>
+            <w:tr>
+              <w:tc>
+                <w:tcPr/>
+                <w:p>
+                  <w:pPr>
+                    <w:pStyle w:val="Compact"/>
+                    <w:jc w:val="left"/>
+                    <w:jc w:val="center"/>
+                  </w:pPr>
+                  <w:r>
+                    <w:t xml:space="preserve">Interior gaps only</w:t>
+                  </w:r>
+                </w:p>
+              </w:tc>
+              <w:tc>
+                <w:tcPr/>
+                <w:p>
+                  <w:pPr>
+                    <w:pStyle w:val="Compact"/>
+                    <w:jc w:val="right"/>
+                    <w:jc w:val="center"/>
+                  </w:pPr>
+                  <w:r>
+                    <w:t xml:space="preserve">209</w:t>
+                  </w:r>
+                </w:p>
+              </w:tc>
+              <w:tc>
+                <w:tcPr/>
+                <w:p>
+                  <w:pPr>
+                    <w:pStyle w:val="Compact"/>
+                    <w:jc w:val="right"/>
+                    <w:jc w:val="center"/>
+                  </w:pPr>
+                  <w:r>
+                    <w:t xml:space="preserve">19%</w:t>
+                  </w:r>
+                </w:p>
+              </w:tc>
+              <w:tc>
+                <w:tcPr/>
+                <w:p>
+                  <w:pPr>
+                    <w:pStyle w:val="Compact"/>
+                    <w:jc w:val="right"/>
+                    <w:jc w:val="center"/>
+                  </w:pPr>
+                  <w:r>
+                    <w:t xml:space="preserve">339</w:t>
+                  </w:r>
+                </w:p>
+              </w:tc>
+            </w:tr>
+            <w:tr>
+              <w:tc>
+                <w:tcPr/>
+                <w:p>
+                  <w:pPr>
+                    <w:pStyle w:val="Compact"/>
+                    <w:jc w:val="left"/>
+                    <w:jc w:val="center"/>
+                  </w:pPr>
+                  <w:r>
+                    <w:t xml:space="preserve">Two or more of the above</w:t>
+                  </w:r>
+                </w:p>
+              </w:tc>
+              <w:tc>
+                <w:tcPr/>
+                <w:p>
+                  <w:pPr>
+                    <w:pStyle w:val="Compact"/>
+                    <w:jc w:val="right"/>
+                    <w:jc w:val="center"/>
+                  </w:pPr>
+                  <w:r>
+                    <w:t xml:space="preserve">64</w:t>
+                  </w:r>
+                </w:p>
+              </w:tc>
+              <w:tc>
+                <w:tcPr/>
+                <w:p>
+                  <w:pPr>
+                    <w:pStyle w:val="Compact"/>
+                    <w:jc w:val="right"/>
+                    <w:jc w:val="center"/>
+                  </w:pPr>
+                  <w:r>
+                    <w:t xml:space="preserve">6%</w:t>
+                  </w:r>
+                </w:p>
+              </w:tc>
+              <w:tc>
+                <w:tcPr/>
+                <w:p>
+                  <w:pPr>
+                    <w:pStyle w:val="Compact"/>
+                    <w:jc w:val="right"/>
+                    <w:jc w:val="center"/>
+                  </w:pPr>
+                  <w:r>
+                    <w:t xml:space="preserve">581</w:t>
+                  </w:r>
+                </w:p>
+              </w:tc>
+            </w:tr>
+          </w:tbl>
+          <w:bookmarkEnd w:id="46"/>
+          <w:p/>
+        </w:tc>
+      </w:tr>
+    </w:tbl>
+    <w:bookmarkEnd w:id="47"/>
+    <w:bookmarkStart w:id="48" w:name="answer-1"/>
     <w:p>
       <w:pPr>
         <w:pStyle w:val="Heading2"/>
@@ -1255,11 +3309,132 @@
         <w:pStyle w:val="FirstParagraph"/>
       </w:pPr>
       <w:r>
-        <w:t xml:space="preserve">The data are complete in the overall IRCA and in calendar coverage. They are incomplete in the urban and rural components, which are missing in a large and time-varying share of rows, and as a panel of municipalities, with about 6% of municipality-years absent, most of them in Chocó and the Amazon and Orinoco departments, and a quarter of municipalities with interrupted series. Analyses that use the components, compare departments or follow individual municipalities over time must account for this missingness explicitly; analyses of the overall index at the national level can proceed with fewer reservations.</w:t>
+        <w:t xml:space="preserve">Are there missing values? Not in the overall index, which is present in every row, but yes in the components: the rural index is unavailable in about half of the municipal rows, and</w:t>
+      </w:r>
+      <w:r>
+        <w:t xml:space="preserve"> </w:t>
+      </w:r>
+      <w:r>
+        <w:rPr>
+          <w:rStyle w:val="VerbatimChar"/>
+        </w:rPr>
+        <w:t xml:space="preserve">ND</w:t>
+      </w:r>
+      <w:r>
+        <w:t xml:space="preserve"> </w:t>
+      </w:r>
+      <w:r>
+        <w:t xml:space="preserve">sometimes hides rural samples that did enter the overall index. Are there missing units? Yes: about 6% of the municipality-years implied by the national register are absent, 8 municipalities never appear, and the shortfall is concentrated in Chocó and the Amazon and Orinoco departments. Are there missing years? Not at the national level, where 2007 to 2024 is continuous, but a third of municipalities have a series that starts late, ends early or is interrupted. Analyses of the overall index at the national level can proceed with few reservations; analyses of the urban or rural components, comparisons across departments, and municipal time series must treat the missingness explicitly.</w:t>
       </w:r>
     </w:p>
-    <w:bookmarkEnd w:id="39"/>
-    <w:bookmarkEnd w:id="40"/>
+    <w:bookmarkEnd w:id="48"/>
+    <w:bookmarkEnd w:id="49"/>
+    <w:bookmarkStart w:id="56" w:name="references"/>
+    <w:p>
+      <w:pPr>
+        <w:pStyle w:val="Heading1"/>
+      </w:pPr>
+      <w:r>
+        <w:t xml:space="preserve">References</w:t>
+      </w:r>
+    </w:p>
+    <w:bookmarkStart w:id="55" w:name="refs"/>
+    <w:bookmarkStart w:id="51" w:name="ref-danemgn2020"/>
+    <w:p>
+      <w:pPr>
+        <w:pStyle w:val="Bibliography"/>
+      </w:pPr>
+      <w:r>
+        <w:t xml:space="preserve">Departamento Administrativo Nacional de Estadística (DANE). 2020.</w:t>
+      </w:r>
+      <w:r>
+        <w:t xml:space="preserve"> </w:t>
+      </w:r>
+      <w:r>
+        <w:t xml:space="preserve">“Marco Geoestadístico Nacional 2020: Límites Administrativos de Colombia (COD-AB).”</w:t>
+      </w:r>
+      <w:r>
+        <w:t xml:space="preserve"> </w:t>
+      </w:r>
+      <w:r>
+        <w:t xml:space="preserve">Humanitarian Data Exchange,</w:t>
+      </w:r>
+      <w:r>
+        <w:t xml:space="preserve"> </w:t>
+      </w:r>
+      <w:hyperlink r:id="rId50">
+        <w:r>
+          <w:rPr>
+            <w:rStyle w:val="Hyperlink"/>
+          </w:rPr>
+          <w:t xml:space="preserve">https://data.humdata.org/dataset/cod-ab-col</w:t>
+        </w:r>
+      </w:hyperlink>
+      <w:r>
+        <w:t xml:space="preserve">.</w:t>
+      </w:r>
+    </w:p>
+    <w:bookmarkEnd w:id="51"/>
+    <w:bookmarkStart w:id="53" w:name="ref-sivicap2026"/>
+    <w:p>
+      <w:pPr>
+        <w:pStyle w:val="Bibliography"/>
+      </w:pPr>
+      <w:r>
+        <w:t xml:space="preserve">Instituto Nacional de Salud, and Ministerio de Salud y Protección Social. 2026.</w:t>
+      </w:r>
+      <w:r>
+        <w:t xml:space="preserve"> </w:t>
+      </w:r>
+      <w:r>
+        <w:t xml:space="preserve">“Calidad Del Agua Para Consumo Humano En Colombia.”</w:t>
+      </w:r>
+      <w:r>
+        <w:t xml:space="preserve"> </w:t>
+      </w:r>
+      <w:r>
+        <w:t xml:space="preserve">Datos Abiertos Colombia,</w:t>
+      </w:r>
+      <w:r>
+        <w:t xml:space="preserve"> </w:t>
+      </w:r>
+      <w:hyperlink r:id="rId52">
+        <w:r>
+          <w:rPr>
+            <w:rStyle w:val="Hyperlink"/>
+          </w:rPr>
+          <w:t xml:space="preserve">https://www.datos.gov.co</w:t>
+        </w:r>
+      </w:hyperlink>
+      <w:r>
+        <w:t xml:space="preserve">.</w:t>
+      </w:r>
+    </w:p>
+    <w:bookmarkEnd w:id="53"/>
+    <w:bookmarkStart w:id="54" w:name="ref-res2115"/>
+    <w:p>
+      <w:pPr>
+        <w:pStyle w:val="Bibliography"/>
+      </w:pPr>
+      <w:r>
+        <w:t xml:space="preserve">Ministerio de la Protección Social, and Ministerio de Ambiente, Vivienda y Desarrollo Territorial. 2007.</w:t>
+      </w:r>
+      <w:r>
+        <w:t xml:space="preserve"> </w:t>
+      </w:r>
+      <w:r>
+        <w:t xml:space="preserve">“Resolución 2115 de 2007: Características, Instrumentos Básicos y Frecuencias Del Sistema de Control y Vigilancia Para La Calidad Del Agua Para Consumo Humano.”</w:t>
+      </w:r>
+      <w:r>
+        <w:t xml:space="preserve"> </w:t>
+      </w:r>
+      <w:r>
+        <w:t xml:space="preserve">Bogotá.</w:t>
+      </w:r>
+    </w:p>
+    <w:bookmarkEnd w:id="54"/>
+    <w:bookmarkEnd w:id="55"/>
+    <w:bookmarkEnd w:id="56"/>
     <w:sectPr>
       <w:footnotePr>
         <w:numRestart w:val="eachSect"/>
@@ -1384,7 +3559,7 @@
         <w:rFonts w:asciiTheme="minorHAnsi" w:cstheme="minorBidi" w:eastAsiaTheme="minorHAnsi" w:hAnsiTheme="minorHAnsi"/>
         <w:sz w:val="24"/>
         <w:szCs w:val="24"/>
-        <w:lang w:bidi="ar-SA" w:eastAsia="en-US" w:val="en-US"/>
+        <w:lang w:bidi="ar-SA" w:eastAsia="en-US" w:val="en"/>
       </w:rPr>
     </w:rPrDefault>
     <w:pPrDefault>

</xml_diff>

<commit_message>
docs(manuscript): work through review TODOs
Rename sections to describe their content rather than the questions,
recast the abstract and closing sections in flowing prose, shorten the
map caption, keep only comments that explain a decision, wrap every
line at 80 characters, and take n_empty from prepare.R instead of
hard-coding it. The bibliography already has three entries, within the
requested limit of five.

Prompts:
- 2026-09-29-008-work-through-the-todos-in-the-manuscript

Assisted-by: Claude claude-fable-5-1
</commit_message>
<xml_diff>
--- a/manuscript/_manuscript/index.docx
+++ b/manuscript/_manuscript/index.docx
@@ -15,7 +15,7 @@
         <w:pStyle w:val="Subtitle"/>
       </w:pPr>
       <w:r>
-        <w:t xml:space="preserve">Answers to questions 1 and 2 on the</w:t>
+        <w:t xml:space="preserve">Structure and completeness of the</w:t>
       </w:r>
       <w:r>
         <w:t xml:space="preserve"> </w:t>
@@ -63,7 +63,67 @@
         <w:pStyle w:val="Abstract"/>
       </w:pPr>
       <w:r>
-        <w:t xml:space="preserve">This note answers the first two questions posed for the Colombian drinking-water quality file held in this repository. Question 1 asks for the observational unit. It is the municipality-year: each row carries the annual Water Quality Risk Index (IRCA) of one municipality in one calendar year, with separate values for the whole municipality, its urban area and its rural area, and department-year aggregates are stacked in the same file. Question 2 asks how complete the data are. The overall IRCA is never missing and every calendar year from 2007 to 2024 is present, but the rural index is unavailable in about half of the municipal rows, about 6% of the municipality-years that the national municipal register implies are absent, two thirds of municipalities have an uninterrupted series, and Chocó is missing more than four fifths of its municipality-years.</w:t>
+        <w:t xml:space="preserve">This note describes what the Colombian drinking-water quality file held in</w:t>
+      </w:r>
+      <w:r>
+        <w:t xml:space="preserve"> </w:t>
+      </w:r>
+      <w:r>
+        <w:t xml:space="preserve">this repository measures and how complete it is. The observational unit is</w:t>
+      </w:r>
+      <w:r>
+        <w:t xml:space="preserve"> </w:t>
+      </w:r>
+      <w:r>
+        <w:t xml:space="preserve">the municipality-year: each row carries the annual Water Quality Risk Index</w:t>
+      </w:r>
+      <w:r>
+        <w:t xml:space="preserve"> </w:t>
+      </w:r>
+      <w:r>
+        <w:t xml:space="preserve">(IRCA) of one municipality in one calendar year, with separate values for</w:t>
+      </w:r>
+      <w:r>
+        <w:t xml:space="preserve"> </w:t>
+      </w:r>
+      <w:r>
+        <w:t xml:space="preserve">the whole municipality, its urban area and its rural area, and</w:t>
+      </w:r>
+      <w:r>
+        <w:t xml:space="preserve"> </w:t>
+      </w:r>
+      <w:r>
+        <w:t xml:space="preserve">department-year aggregates are stacked in the same file. The overall IRCA</w:t>
+      </w:r>
+      <w:r>
+        <w:t xml:space="preserve"> </w:t>
+      </w:r>
+      <w:r>
+        <w:t xml:space="preserve">is never missing and every calendar year from 2007 to 2024 is present, but</w:t>
+      </w:r>
+      <w:r>
+        <w:t xml:space="preserve"> </w:t>
+      </w:r>
+      <w:r>
+        <w:t xml:space="preserve">the rural index is unavailable in about half of the municipal rows, about</w:t>
+      </w:r>
+      <w:r>
+        <w:t xml:space="preserve"> </w:t>
+      </w:r>
+      <w:r>
+        <w:t xml:space="preserve">6% of the municipality-years that the national municipal register implies</w:t>
+      </w:r>
+      <w:r>
+        <w:t xml:space="preserve"> </w:t>
+      </w:r>
+      <w:r>
+        <w:t xml:space="preserve">are absent, two thirds of municipalities have an uninterrupted series, and</w:t>
+      </w:r>
+      <w:r>
+        <w:t xml:space="preserve"> </w:t>
+      </w:r>
+      <w:r>
+        <w:t xml:space="preserve">Chocó is missing more than four fifths of its municipality-years.</w:t>
       </w:r>
     </w:p>
     <w:bookmarkStart w:id="26" w:name="data-and-validation"/>
@@ -92,7 +152,19 @@
         <w:t xml:space="preserve">Calidad_del_Agua_para_Consumo_Humano_en_Colombia_20260915.csv</w:t>
       </w:r>
       <w:r>
-        <w:t xml:space="preserve">, published on Colombia’s open-data portal from the national drinking-water surveillance system</w:t>
+        <w:t xml:space="preserve">, published on</w:t>
+      </w:r>
+      <w:r>
+        <w:t xml:space="preserve"> </w:t>
+      </w:r>
+      <w:r>
+        <w:t xml:space="preserve">Colombia’s open-data portal from the national drinking-water surveillance</w:t>
+      </w:r>
+      <w:r>
+        <w:t xml:space="preserve"> </w:t>
+      </w:r>
+      <w:r>
+        <w:t xml:space="preserve">system</w:t>
       </w:r>
       <w:r>
         <w:t xml:space="preserve"> </w:t>
@@ -101,7 +173,13 @@
         <w:t xml:space="preserve">(Instituto Nacional de Salud and Ministerio de Salud y Protección Social 2026)</w:t>
       </w:r>
       <w:r>
-        <w:t xml:space="preserve">. Territorial health authorities sample water supplies through the year, and the samples are consolidated into the</w:t>
+        <w:t xml:space="preserve">. Territorial health authorities sample water supplies</w:t>
+      </w:r>
+      <w:r>
+        <w:t xml:space="preserve"> </w:t>
+      </w:r>
+      <w:r>
+        <w:t xml:space="preserve">through the year, and the samples are consolidated into the</w:t>
       </w:r>
       <w:r>
         <w:t xml:space="preserve"> </w:t>
@@ -111,13 +189,45 @@
           <w:i/>
           <w:iCs/>
         </w:rPr>
-        <w:t xml:space="preserve">Índice de Riesgo de la Calidad del Agua para Consumo Humano</w:t>
-      </w:r>
-      <w:r>
-        <w:t xml:space="preserve"> </w:t>
-      </w:r>
-      <w:r>
-        <w:t xml:space="preserve">(IRCA), a 0 to 100 score of deviation from the standards of Resolution 2115 of 2007, classed into five risk bands: no risk (0 to 5), low (5.1 to 14), medium (14.1 to 35), high (35.1 to 80) and sanitarily unviable (above 80)</w:t>
+        <w:t xml:space="preserve">Índice de Riesgo</w:t>
+      </w:r>
+      <w:r>
+        <w:rPr>
+          <w:i/>
+          <w:iCs/>
+        </w:rPr>
+        <w:t xml:space="preserve"> </w:t>
+      </w:r>
+      <w:r>
+        <w:rPr>
+          <w:i/>
+          <w:iCs/>
+        </w:rPr>
+        <w:t xml:space="preserve">de la Calidad del Agua para Consumo Humano</w:t>
+      </w:r>
+      <w:r>
+        <w:t xml:space="preserve"> </w:t>
+      </w:r>
+      <w:r>
+        <w:t xml:space="preserve">(IRCA), a 0 to 100 score of</w:t>
+      </w:r>
+      <w:r>
+        <w:t xml:space="preserve"> </w:t>
+      </w:r>
+      <w:r>
+        <w:t xml:space="preserve">deviation from the standards of Resolution 2115 of 2007, classed into five</w:t>
+      </w:r>
+      <w:r>
+        <w:t xml:space="preserve"> </w:t>
+      </w:r>
+      <w:r>
+        <w:t xml:space="preserve">risk bands: no risk (0 to 5), low (5.1 to 14), medium (14.1 to 35), high</w:t>
+      </w:r>
+      <w:r>
+        <w:t xml:space="preserve"> </w:t>
+      </w:r>
+      <w:r>
+        <w:t xml:space="preserve">(35.1 to 80) and sanitarily unviable (above 80)</w:t>
       </w:r>
       <w:r>
         <w:t xml:space="preserve"> </w:t>
@@ -126,7 +236,13 @@
         <w:t xml:space="preserve">(Ministerio de la Protección Social and Ministerio de Ambiente, Vivienda y Desarrollo Territorial 2007)</w:t>
       </w:r>
       <w:r>
-        <w:t xml:space="preserve">.</w:t>
+        <w:t xml:space="preserve">. This note</w:t>
+      </w:r>
+      <w:r>
+        <w:t xml:space="preserve"> </w:t>
+      </w:r>
+      <w:r>
+        <w:t xml:space="preserve">describes the structure of the file and then assesses its completeness.</w:t>
       </w:r>
     </w:p>
     <w:p>
@@ -134,7 +250,25 @@
         <w:pStyle w:val="BodyText"/>
       </w:pPr>
       <w:r>
-        <w:t xml:space="preserve">The file was imported with every column as text, and the structure that the rest of this note relies on was asserted in code rather than assumed: the column set, the row count, the absence of empty cells, the format of the codes, the parsing of the year, the fact that the token</w:t>
+        <w:t xml:space="preserve">The file was imported with every column as text, and the structure that the</w:t>
+      </w:r>
+      <w:r>
+        <w:t xml:space="preserve"> </w:t>
+      </w:r>
+      <w:r>
+        <w:t xml:space="preserve">rest of this note relies on was asserted in code rather than assumed: the</w:t>
+      </w:r>
+      <w:r>
+        <w:t xml:space="preserve"> </w:t>
+      </w:r>
+      <w:r>
+        <w:t xml:space="preserve">column set, the row count, the absence of empty cells, the format of the</w:t>
+      </w:r>
+      <w:r>
+        <w:t xml:space="preserve"> </w:t>
+      </w:r>
+      <w:r>
+        <w:t xml:space="preserve">codes, the parsing of the year, the fact that the token</w:t>
       </w:r>
       <w:r>
         <w:t xml:space="preserve"> </w:t>
@@ -149,7 +283,25 @@
         <w:t xml:space="preserve"> </w:t>
       </w:r>
       <w:r>
-        <w:t xml:space="preserve">is the only non-numeric value in the index columns, the spelling set of the risk labels, and the uniqueness of the keys (27 checks, all passing at render time).</w:t>
+        <w:t xml:space="preserve">is the only</w:t>
+      </w:r>
+      <w:r>
+        <w:t xml:space="preserve"> </w:t>
+      </w:r>
+      <w:r>
+        <w:t xml:space="preserve">non-numeric value in the index columns, the spelling set of the risk labels,</w:t>
+      </w:r>
+      <w:r>
+        <w:t xml:space="preserve"> </w:t>
+      </w:r>
+      <w:r>
+        <w:t xml:space="preserve">and the uniqueness of the keys (27 checks, all passing at</w:t>
+      </w:r>
+      <w:r>
+        <w:t xml:space="preserve"> </w:t>
+      </w:r>
+      <w:r>
+        <w:t xml:space="preserve">render time).</w:t>
       </w:r>
       <w:r>
         <w:t xml:space="preserve"> </w:t>
@@ -166,7 +318,13 @@
         <w:t xml:space="preserve"> </w:t>
       </w:r>
       <w:r>
-        <w:t xml:space="preserve">describes the columns and what was done to each on import.</w:t>
+        <w:t xml:space="preserve">describes the columns and what was done to each</w:t>
+      </w:r>
+      <w:r>
+        <w:t xml:space="preserve"> </w:t>
+      </w:r>
+      <w:r>
+        <w:t xml:space="preserve">on import.</w:t>
       </w:r>
     </w:p>
     <w:tbl>
@@ -934,7 +1092,13 @@
         <w:pStyle w:val="BodyText"/>
       </w:pPr>
       <w:r>
-        <w:t xml:space="preserve">Completeness needs a reference set of units that ought to be present. Two are used. The</w:t>
+        <w:t xml:space="preserve">Completeness needs a reference set of units that ought to be present. Two</w:t>
+      </w:r>
+      <w:r>
+        <w:t xml:space="preserve"> </w:t>
+      </w:r>
+      <w:r>
+        <w:t xml:space="preserve">are used. The</w:t>
       </w:r>
       <w:r>
         <w:t xml:space="preserve"> </w:t>
@@ -950,7 +1114,19 @@
         <w:t xml:space="preserve"> </w:t>
       </w:r>
       <w:r>
-        <w:t xml:space="preserve">frame is every municipality code that appears at least once, crossed with every year that appears at least once; it asks whether the file is balanced on its own terms. The</w:t>
+        <w:t xml:space="preserve">frame is every municipality code that appears at</w:t>
+      </w:r>
+      <w:r>
+        <w:t xml:space="preserve"> </w:t>
+      </w:r>
+      <w:r>
+        <w:t xml:space="preserve">least once, crossed with every year that appears at least once; it asks</w:t>
+      </w:r>
+      <w:r>
+        <w:t xml:space="preserve"> </w:t>
+      </w:r>
+      <w:r>
+        <w:t xml:space="preserve">whether the file is balanced on its own terms. The</w:t>
       </w:r>
       <w:r>
         <w:t xml:space="preserve"> </w:t>
@@ -966,7 +1142,13 @@
         <w:t xml:space="preserve"> </w:t>
       </w:r>
       <w:r>
-        <w:t xml:space="preserve">frame is the municipal register of the DANE Marco Geoestadístico Nacional 2020</w:t>
+        <w:t xml:space="preserve">frame is the</w:t>
+      </w:r>
+      <w:r>
+        <w:t xml:space="preserve"> </w:t>
+      </w:r>
+      <w:r>
+        <w:t xml:space="preserve">municipal register of the DANE Marco Geoestadístico Nacional 2020</w:t>
       </w:r>
       <w:r>
         <w:t xml:space="preserve"> </w:t>
@@ -975,7 +1157,43 @@
         <w:t xml:space="preserve">(Departamento Administrativo Nacional de Estadística (DANE) 2020)</w:t>
       </w:r>
       <w:r>
-        <w:t xml:space="preserve">, which lists 1,122 units, minus the 19 non-municipalised areas of Amazonas, Guainía and Vaupés, which have no municipal administration and never appear in the file; that leaves 1,103 municipalities and asks whether the country is covered. The register is a 2020 snapshot, so the few municipalities created after 2007 slightly overstate the external shortfall in early years.</w:t>
+        <w:t xml:space="preserve">, which lists 1,122 units, minus the</w:t>
+      </w:r>
+      <w:r>
+        <w:t xml:space="preserve"> </w:t>
+      </w:r>
+      <w:r>
+        <w:t xml:space="preserve">19 non-municipalised areas of Amazonas, Guainía and</w:t>
+      </w:r>
+      <w:r>
+        <w:t xml:space="preserve"> </w:t>
+      </w:r>
+      <w:r>
+        <w:t xml:space="preserve">Vaupés, which have no municipal administration and never appear in the file;</w:t>
+      </w:r>
+      <w:r>
+        <w:t xml:space="preserve"> </w:t>
+      </w:r>
+      <w:r>
+        <w:t xml:space="preserve">that leaves 1,103 municipalities and asks whether the</w:t>
+      </w:r>
+      <w:r>
+        <w:t xml:space="preserve"> </w:t>
+      </w:r>
+      <w:r>
+        <w:t xml:space="preserve">country is covered. The register is a 2020 snapshot, so the few</w:t>
+      </w:r>
+      <w:r>
+        <w:t xml:space="preserve"> </w:t>
+      </w:r>
+      <w:r>
+        <w:t xml:space="preserve">municipalities created after 2007 slightly overstate the external shortfall</w:t>
+      </w:r>
+      <w:r>
+        <w:t xml:space="preserve"> </w:t>
+      </w:r>
+      <w:r>
+        <w:t xml:space="preserve">in early years.</w:t>
       </w:r>
       <w:r>
         <w:t xml:space="preserve"> </w:t>
@@ -992,7 +1210,13 @@
         <w:t xml:space="preserve"> </w:t>
       </w:r>
       <w:r>
-        <w:t xml:space="preserve">shows the measurement and the coverage on that register.</w:t>
+        <w:t xml:space="preserve">shows the measurement and the coverage on that</w:t>
+      </w:r>
+      <w:r>
+        <w:t xml:space="preserve"> </w:t>
+      </w:r>
+      <w:r>
+        <w:t xml:space="preserve">register.</w:t>
       </w:r>
     </w:p>
     <w:bookmarkStart w:id="25" w:name="cell-fig-map"/>
@@ -1068,7 +1292,7 @@
               <w:pStyle w:val="ImageCaption"/>
             </w:pPr>
             <w:r>
-              <w:t xml:space="preserve">Figure 1: Left: annual IRCA by municipality in 2019, the year with the most municipalities reported, classed into the risk bands of Resolution 2115. Right: number of years, out of 18, in which each municipality appears in the file; municipalities that never appear are outlined in orange. Non-municipalised areas are not expected in the file. The Archipelago of San Andrés lies outside the frame. Boundaries: DANE 2020.</w:t>
+              <w:t xml:space="preserve">Figure 1: Annual IRCA by municipality in 2019 (left) and number of years, out of 18, in which each municipality appears in the file (right). Municipalities that never appear are outlined in orange; non-municipalised areas are not expected. Boundaries: DANE 2020.</w:t>
             </w:r>
           </w:p>
           <w:bookmarkEnd w:id="24"/>
@@ -1082,13 +1306,13 @@
       </w:r>
     </w:p>
     <w:bookmarkEnd w:id="26"/>
-    <w:bookmarkStart w:id="32" w:name="Xa68b6d5b5acbd028757e26f1c3e8cbb9e372abd"/>
+    <w:bookmarkStart w:id="32" w:name="the-observational-unit"/>
     <w:p>
       <w:pPr>
         <w:pStyle w:val="Heading1"/>
       </w:pPr>
       <w:r>
-        <w:t xml:space="preserve">2. Question 1: What is the observational unit?</w:t>
+        <w:t xml:space="preserve">2. The observational unit</w:t>
       </w:r>
     </w:p>
     <w:bookmarkStart w:id="28" w:name="what-a-row-looks-like"/>
@@ -1122,7 +1346,37 @@
         <w:t xml:space="preserve"> </w:t>
       </w:r>
       <w:r>
-        <w:t xml:space="preserve">reproduces four rows verbatim. Each row names a place and a year and reports three indices: one for the whole territorial unit, one for its urban area and one for its rural area, each accompanied in the full file by a risk band derived from it. The same municipality code recurs year after year, so a row is not a place but a place in a year. The name attached to a code can change between years while the code stays fixed. The token</w:t>
+        <w:t xml:space="preserve">reproduces four rows verbatim. Each row names a place and a year and reports</w:t>
+      </w:r>
+      <w:r>
+        <w:t xml:space="preserve"> </w:t>
+      </w:r>
+      <w:r>
+        <w:t xml:space="preserve">three indices: one for the whole territorial unit, one for its urban area</w:t>
+      </w:r>
+      <w:r>
+        <w:t xml:space="preserve"> </w:t>
+      </w:r>
+      <w:r>
+        <w:t xml:space="preserve">and one for its rural area, each accompanied in the full file by a risk band</w:t>
+      </w:r>
+      <w:r>
+        <w:t xml:space="preserve"> </w:t>
+      </w:r>
+      <w:r>
+        <w:t xml:space="preserve">derived from it. The same municipality code recurs year after year, so a row</w:t>
+      </w:r>
+      <w:r>
+        <w:t xml:space="preserve"> </w:t>
+      </w:r>
+      <w:r>
+        <w:t xml:space="preserve">is not a place but a place in a year. The name attached to a code can change</w:t>
+      </w:r>
+      <w:r>
+        <w:t xml:space="preserve"> </w:t>
+      </w:r>
+      <w:r>
+        <w:t xml:space="preserve">between years while the code stays fixed. The token</w:t>
       </w:r>
       <w:r>
         <w:t xml:space="preserve"> </w:t>
@@ -1137,7 +1391,13 @@
         <w:t xml:space="preserve"> </w:t>
       </w:r>
       <w:r>
-        <w:t xml:space="preserve">stands in for a component that was not reported. The fourth row carries</w:t>
+        <w:t xml:space="preserve">stands in for a</w:t>
+      </w:r>
+      <w:r>
+        <w:t xml:space="preserve"> </w:t>
+      </w:r>
+      <w:r>
+        <w:t xml:space="preserve">component that was not reported. The fourth row carries</w:t>
       </w:r>
       <w:r>
         <w:t xml:space="preserve"> </w:t>
@@ -1152,7 +1412,25 @@
         <w:t xml:space="preserve"> </w:t>
       </w:r>
       <w:r>
-        <w:t xml:space="preserve">in place of a municipality: it describes the department as a whole for that year, and 569 such rows are interleaved with the 18,591 municipal rows.</w:t>
+        <w:t xml:space="preserve">in place of</w:t>
+      </w:r>
+      <w:r>
+        <w:t xml:space="preserve"> </w:t>
+      </w:r>
+      <w:r>
+        <w:t xml:space="preserve">a municipality: it describes the department as a whole for that year, and</w:t>
+      </w:r>
+      <w:r>
+        <w:t xml:space="preserve"> </w:t>
+      </w:r>
+      <w:r>
+        <w:t xml:space="preserve">569 such rows are interleaved with the</w:t>
+      </w:r>
+      <w:r>
+        <w:t xml:space="preserve"> </w:t>
+      </w:r>
+      <w:r>
+        <w:t xml:space="preserve">18,591 municipal rows.</w:t>
       </w:r>
     </w:p>
     <w:tbl>
@@ -1698,7 +1976,31 @@
         <w:t xml:space="preserve"> </w:t>
       </w:r>
       <w:r>
-        <w:t xml:space="preserve">tests candidate identifiers on the municipal rows. A municipality code alone recurs across years. A municipality name with a year is not unique either, because 63 names are shared by municipalities in different departments. Adding the department name makes the key unique, but names are not stable: municipality 76001 appears as</w:t>
+        <w:t xml:space="preserve">tests candidate identifiers on the municipal rows. A municipality</w:t>
+      </w:r>
+      <w:r>
+        <w:t xml:space="preserve"> </w:t>
+      </w:r>
+      <w:r>
+        <w:t xml:space="preserve">code alone recurs across years. A municipality name with a year is not</w:t>
+      </w:r>
+      <w:r>
+        <w:t xml:space="preserve"> </w:t>
+      </w:r>
+      <w:r>
+        <w:t xml:space="preserve">unique either, because 63 names are shared by</w:t>
+      </w:r>
+      <w:r>
+        <w:t xml:space="preserve"> </w:t>
+      </w:r>
+      <w:r>
+        <w:t xml:space="preserve">municipalities in different departments. Adding the department name makes</w:t>
+      </w:r>
+      <w:r>
+        <w:t xml:space="preserve"> </w:t>
+      </w:r>
+      <w:r>
+        <w:t xml:space="preserve">the key unique, but names are not stable: municipality 76001 appears as</w:t>
       </w:r>
       <w:r>
         <w:t xml:space="preserve"> </w:t>
@@ -1719,7 +2021,37 @@
         <w:t xml:space="preserve">“Cali”</w:t>
       </w:r>
       <w:r>
-        <w:t xml:space="preserve">, and over the period more than one name is attached to 1 of the 1,095 codes. The municipality code with the year identifies every municipal row exactly once, and because the first two digits of every municipality code equal the department code, the department adds no information. On the aggregate rows, department code with year is likewise unique.</w:t>
+        <w:t xml:space="preserve">, and over the period more than one name is</w:t>
+      </w:r>
+      <w:r>
+        <w:t xml:space="preserve"> </w:t>
+      </w:r>
+      <w:r>
+        <w:t xml:space="preserve">attached to 1 of the 1,095 codes. The</w:t>
+      </w:r>
+      <w:r>
+        <w:t xml:space="preserve"> </w:t>
+      </w:r>
+      <w:r>
+        <w:t xml:space="preserve">municipality code with the year identifies every municipal row exactly once,</w:t>
+      </w:r>
+      <w:r>
+        <w:t xml:space="preserve"> </w:t>
+      </w:r>
+      <w:r>
+        <w:t xml:space="preserve">and because the first two digits of every municipality code equal the</w:t>
+      </w:r>
+      <w:r>
+        <w:t xml:space="preserve"> </w:t>
+      </w:r>
+      <w:r>
+        <w:t xml:space="preserve">department code, the department adds no information. On the aggregate rows,</w:t>
+      </w:r>
+      <w:r>
+        <w:t xml:space="preserve"> </w:t>
+      </w:r>
+      <w:r>
+        <w:t xml:space="preserve">department code with year is likewise unique.</w:t>
       </w:r>
     </w:p>
     <w:tbl>
@@ -2100,17 +2432,29 @@
         <w:pStyle w:val="BodyText"/>
       </w:pPr>
       <w:r>
-        <w:t xml:space="preserve">The municipal rows cover 1,095 municipality codes in 33 departments over 18 years, 2007 to 2024.</w:t>
+        <w:t xml:space="preserve">The municipal rows cover 1,095 municipality codes in</w:t>
+      </w:r>
+      <w:r>
+        <w:t xml:space="preserve"> </w:t>
+      </w:r>
+      <w:r>
+        <w:t xml:space="preserve">33 departments over 18 years, 2007 to</w:t>
+      </w:r>
+      <w:r>
+        <w:t xml:space="preserve"> </w:t>
+      </w:r>
+      <w:r>
+        <w:t xml:space="preserve">2024.</w:t>
       </w:r>
     </w:p>
     <w:bookmarkEnd w:id="30"/>
-    <w:bookmarkStart w:id="31" w:name="answer"/>
+    <w:bookmarkStart w:id="31" w:name="the-municipality-year-and-its-limits"/>
     <w:p>
       <w:pPr>
         <w:pStyle w:val="Heading2"/>
       </w:pPr>
       <w:r>
-        <w:t xml:space="preserve">2.3 Answer</w:t>
+        <w:t xml:space="preserve">2.3 The municipality-year and its limits</w:t>
       </w:r>
     </w:p>
     <w:p>
@@ -2118,7 +2462,7 @@
         <w:pStyle w:val="FirstParagraph"/>
       </w:pPr>
       <w:r>
-        <w:t xml:space="preserve">The observational unit is the</w:t>
+        <w:t xml:space="preserve">The observational unit is therefore the</w:t>
       </w:r>
       <w:r>
         <w:t xml:space="preserve"> </w:t>
@@ -2131,7 +2475,25 @@
         <w:t xml:space="preserve">municipality-year</w:t>
       </w:r>
       <w:r>
-        <w:t xml:space="preserve">. One row records, for one municipality in one calendar year, the annual IRCA of the municipality as a whole and of its urban and rural areas, with the risk band of each. The department-year rows marked</w:t>
+        <w:t xml:space="preserve">. One row</w:t>
+      </w:r>
+      <w:r>
+        <w:t xml:space="preserve"> </w:t>
+      </w:r>
+      <w:r>
+        <w:t xml:space="preserve">records, for one municipality in one calendar year, the annual IRCA of the</w:t>
+      </w:r>
+      <w:r>
+        <w:t xml:space="preserve"> </w:t>
+      </w:r>
+      <w:r>
+        <w:t xml:space="preserve">municipality as a whole and of its urban and rural areas, with the risk band</w:t>
+      </w:r>
+      <w:r>
+        <w:t xml:space="preserve"> </w:t>
+      </w:r>
+      <w:r>
+        <w:t xml:space="preserve">of each. The department-year rows marked</w:t>
       </w:r>
       <w:r>
         <w:t xml:space="preserve"> </w:t>
@@ -2146,7 +2508,25 @@
         <w:t xml:space="preserve"> </w:t>
       </w:r>
       <w:r>
-        <w:t xml:space="preserve">are a second, coarser set of units derived from the same surveillance; they must be separated from the municipal rows before any count or average, or departments will be counted twice.</w:t>
+        <w:t xml:space="preserve">are a second, coarser set</w:t>
+      </w:r>
+      <w:r>
+        <w:t xml:space="preserve"> </w:t>
+      </w:r>
+      <w:r>
+        <w:t xml:space="preserve">of units derived from the same surveillance; they must be separated from the</w:t>
+      </w:r>
+      <w:r>
+        <w:t xml:space="preserve"> </w:t>
+      </w:r>
+      <w:r>
+        <w:t xml:space="preserve">municipal rows before any count or average, or departments will be counted</w:t>
+      </w:r>
+      <w:r>
+        <w:t xml:space="preserve"> </w:t>
+      </w:r>
+      <w:r>
+        <w:t xml:space="preserve">twice.</w:t>
       </w:r>
     </w:p>
     <w:p>
@@ -2154,7 +2534,43 @@
         <w:pStyle w:val="BodyText"/>
       </w:pPr>
       <w:r>
-        <w:t xml:space="preserve">It is equally important what the unit is not. The IRCA of a municipality-year is a consolidation of many water samples taken over the year, but the samples, the supply systems, the sampling points and the months are not in the file, and the number of samples behind a value is unknown. A row is therefore the annual summary of a municipality’s surveillance, not an observation of any water supply. For any join or panel construction the numeric code, not the name, is the key.</w:t>
+        <w:t xml:space="preserve">It is equally important what the unit is not. The IRCA of a</w:t>
+      </w:r>
+      <w:r>
+        <w:t xml:space="preserve"> </w:t>
+      </w:r>
+      <w:r>
+        <w:t xml:space="preserve">municipality-year is a consolidation of many water samples taken over the</w:t>
+      </w:r>
+      <w:r>
+        <w:t xml:space="preserve"> </w:t>
+      </w:r>
+      <w:r>
+        <w:t xml:space="preserve">year, but the samples, the supply systems, the sampling points and the</w:t>
+      </w:r>
+      <w:r>
+        <w:t xml:space="preserve"> </w:t>
+      </w:r>
+      <w:r>
+        <w:t xml:space="preserve">months are not in the file, and the number of samples behind a value is</w:t>
+      </w:r>
+      <w:r>
+        <w:t xml:space="preserve"> </w:t>
+      </w:r>
+      <w:r>
+        <w:t xml:space="preserve">unknown. A row is the annual summary of a municipality’s surveillance, not</w:t>
+      </w:r>
+      <w:r>
+        <w:t xml:space="preserve"> </w:t>
+      </w:r>
+      <w:r>
+        <w:t xml:space="preserve">an observation of any water supply. For any join or panel construction the</w:t>
+      </w:r>
+      <w:r>
+        <w:t xml:space="preserve"> </w:t>
+      </w:r>
+      <w:r>
+        <w:t xml:space="preserve">numeric code, not the name, is the key.</w:t>
       </w:r>
     </w:p>
     <w:p>
@@ -2164,13 +2580,13 @@
     </w:p>
     <w:bookmarkEnd w:id="31"/>
     <w:bookmarkEnd w:id="32"/>
-    <w:bookmarkStart w:id="49" w:name="question-2-how-complete-are-the-data"/>
+    <w:bookmarkStart w:id="49" w:name="completeness-of-the-data"/>
     <w:p>
       <w:pPr>
         <w:pStyle w:val="Heading1"/>
       </w:pPr>
       <w:r>
-        <w:t xml:space="preserve">3. Question 2: How complete are the data?</w:t>
+        <w:t xml:space="preserve">3. Completeness of the data</w:t>
       </w:r>
     </w:p>
     <w:p>
@@ -2178,7 +2594,31 @@
         <w:pStyle w:val="FirstParagraph"/>
       </w:pPr>
       <w:r>
-        <w:t xml:space="preserve">Incompleteness can occur at three levels, and the answer differs at each. A row can exist but lack a value (a missing value). A municipality can lack a row in a year in which other municipalities have one (a missing unit). A year can be absent altogether, or absent from the series of a particular municipality (a missing year).</w:t>
+        <w:t xml:space="preserve">Incompleteness can occur at three levels, and the picture differs at each. A</w:t>
+      </w:r>
+      <w:r>
+        <w:t xml:space="preserve"> </w:t>
+      </w:r>
+      <w:r>
+        <w:t xml:space="preserve">row can exist but lack a value (a missing value). A municipality can lack a</w:t>
+      </w:r>
+      <w:r>
+        <w:t xml:space="preserve"> </w:t>
+      </w:r>
+      <w:r>
+        <w:t xml:space="preserve">row in a year in which other municipalities have one (a missing unit). A</w:t>
+      </w:r>
+      <w:r>
+        <w:t xml:space="preserve"> </w:t>
+      </w:r>
+      <w:r>
+        <w:t xml:space="preserve">year can be absent altogether, or absent from the series of a particular</w:t>
+      </w:r>
+      <w:r>
+        <w:t xml:space="preserve"> </w:t>
+      </w:r>
+      <w:r>
+        <w:t xml:space="preserve">municipality (a missing year).</w:t>
       </w:r>
     </w:p>
     <w:bookmarkStart w:id="38" w:name="missing-values-within-rows"/>
@@ -2195,7 +2635,19 @@
         <w:pStyle w:val="FirstParagraph"/>
       </w:pPr>
       <w:r>
-        <w:t xml:space="preserve">No cell is empty (0 empty cells), and the overall IRCA and its band are never missing (0 rows). Missingness lives entirely in the urban and rural components, encoded by</w:t>
+        <w:t xml:space="preserve">No cell is empty (0 empty cells), and the overall IRCA and its</w:t>
+      </w:r>
+      <w:r>
+        <w:t xml:space="preserve"> </w:t>
+      </w:r>
+      <w:r>
+        <w:t xml:space="preserve">band are never missing (0 rows). Missingness lives entirely in</w:t>
+      </w:r>
+      <w:r>
+        <w:t xml:space="preserve"> </w:t>
+      </w:r>
+      <w:r>
+        <w:t xml:space="preserve">the urban and rural components, encoded by</w:t>
       </w:r>
       <w:r>
         <w:t xml:space="preserve"> </w:t>
@@ -2207,7 +2659,61 @@
         <w:t xml:space="preserve">ND</w:t>
       </w:r>
       <w:r>
-        <w:t xml:space="preserve">, always for the value and its band together. In the municipal rows the rural index is missing in 51% of rows and the urban index in 7%; only 47% of rows carry all three indices, and 917 rows carry an overall index with neither component. Department aggregates are better filled: the rural index is missing in 14% of them. Every reported band agrees with the band implied by its value (0 disagreements in 46,597 values).</w:t>
+        <w:t xml:space="preserve">, always for the value and</w:t>
+      </w:r>
+      <w:r>
+        <w:t xml:space="preserve"> </w:t>
+      </w:r>
+      <w:r>
+        <w:t xml:space="preserve">its band together. In the municipal rows the rural index is missing in</w:t>
+      </w:r>
+      <w:r>
+        <w:t xml:space="preserve"> </w:t>
+      </w:r>
+      <w:r>
+        <w:t xml:space="preserve">51% of rows and the urban index in</w:t>
+      </w:r>
+      <w:r>
+        <w:t xml:space="preserve"> </w:t>
+      </w:r>
+      <w:r>
+        <w:t xml:space="preserve">7%; only 47% of rows carry all</w:t>
+      </w:r>
+      <w:r>
+        <w:t xml:space="preserve"> </w:t>
+      </w:r>
+      <w:r>
+        <w:t xml:space="preserve">three indices, and 917 rows carry an overall index with</w:t>
+      </w:r>
+      <w:r>
+        <w:t xml:space="preserve"> </w:t>
+      </w:r>
+      <w:r>
+        <w:t xml:space="preserve">neither component. Department aggregates are better filled: the rural index</w:t>
+      </w:r>
+      <w:r>
+        <w:t xml:space="preserve"> </w:t>
+      </w:r>
+      <w:r>
+        <w:t xml:space="preserve">is missing in 14% of them. Every reported band</w:t>
+      </w:r>
+      <w:r>
+        <w:t xml:space="preserve"> </w:t>
+      </w:r>
+      <w:r>
+        <w:t xml:space="preserve">agrees with the band implied by its value</w:t>
+      </w:r>
+      <w:r>
+        <w:t xml:space="preserve"> </w:t>
+      </w:r>
+      <w:r>
+        <w:t xml:space="preserve">(0 disagreements in</w:t>
+      </w:r>
+      <w:r>
+        <w:t xml:space="preserve"> </w:t>
+      </w:r>
+      <w:r>
+        <w:t xml:space="preserve">46,597 values).</w:t>
       </w:r>
     </w:p>
     <w:p>
@@ -2226,7 +2732,55 @@
         </w:r>
       </w:hyperlink>
       <w:r>
-        <w:t xml:space="preserve">). It affected 77% of rows in 2007, fell to around 40% by 2010, and has stayed above half since 2016. The urban index is rarely missing except in 2016 and 2017, peaking at 24% in 2017, when both components go missing together, which suggests a reporting artefact rather than a change in sampling. The rural gap is intermittent rather than structural: 148 municipalities never report a rural index, 48 always do, and 899 alternate.</w:t>
+        <w:t xml:space="preserve">). It affected</w:t>
+      </w:r>
+      <w:r>
+        <w:t xml:space="preserve"> </w:t>
+      </w:r>
+      <w:r>
+        <w:t xml:space="preserve">77% of rows in 2007, fell to around 40% by</w:t>
+      </w:r>
+      <w:r>
+        <w:t xml:space="preserve"> </w:t>
+      </w:r>
+      <w:r>
+        <w:t xml:space="preserve">2010, and has stayed above half since 2016. The urban index is rarely</w:t>
+      </w:r>
+      <w:r>
+        <w:t xml:space="preserve"> </w:t>
+      </w:r>
+      <w:r>
+        <w:t xml:space="preserve">missing except in 2016 and 2017, peaking at 24% in</w:t>
+      </w:r>
+      <w:r>
+        <w:t xml:space="preserve"> </w:t>
+      </w:r>
+      <w:r>
+        <w:t xml:space="preserve">2017, when both components go missing together, which</w:t>
+      </w:r>
+      <w:r>
+        <w:t xml:space="preserve"> </w:t>
+      </w:r>
+      <w:r>
+        <w:t xml:space="preserve">suggests a reporting artefact rather than a change in sampling. The rural</w:t>
+      </w:r>
+      <w:r>
+        <w:t xml:space="preserve"> </w:t>
+      </w:r>
+      <w:r>
+        <w:t xml:space="preserve">gap is intermittent rather than structural: 148</w:t>
+      </w:r>
+      <w:r>
+        <w:t xml:space="preserve"> </w:t>
+      </w:r>
+      <w:r>
+        <w:t xml:space="preserve">municipalities never report a rural index, 48 always do, and</w:t>
+      </w:r>
+      <w:r>
+        <w:t xml:space="preserve"> </w:t>
+      </w:r>
+      <w:r>
+        <w:t xml:space="preserve">899 alternate.</w:t>
       </w:r>
     </w:p>
     <w:p>
@@ -2264,7 +2818,13 @@
         <w:t xml:space="preserve"> </w:t>
       </w:r>
       <w:r>
-        <w:t xml:space="preserve">still carries an overall index, whereas an absent municipality-year carries nothing. Empirically,</w:t>
+        <w:t xml:space="preserve">still carries an overall index, whereas an absent municipality-year</w:t>
+      </w:r>
+      <w:r>
+        <w:t xml:space="preserve"> </w:t>
+      </w:r>
+      <w:r>
+        <w:t xml:space="preserve">carries nothing. Empirically,</w:t>
       </w:r>
       <w:r>
         <w:t xml:space="preserve"> </w:t>
@@ -2279,7 +2839,13 @@
         <w:t xml:space="preserve"> </w:t>
       </w:r>
       <w:r>
-        <w:t xml:space="preserve">does not always mean that no rural samples were taken: among the 8,621 rows with a rural</w:t>
+        <w:t xml:space="preserve">does not always mean that no rural</w:t>
+      </w:r>
+      <w:r>
+        <w:t xml:space="preserve"> </w:t>
+      </w:r>
+      <w:r>
+        <w:t xml:space="preserve">samples were taken: among the 8,621 rows with a rural</w:t>
       </w:r>
       <w:r>
         <w:t xml:space="preserve"> </w:t>
@@ -2294,7 +2860,31 @@
         <w:t xml:space="preserve"> </w:t>
       </w:r>
       <w:r>
-        <w:t xml:space="preserve">and an urban value, the overall index equals the urban index in 87% of cases, but in 785 rows the two differ by more than one point, so rural samples entered the overall index even though the rural component is reported as unavailable.</w:t>
+        <w:t xml:space="preserve">and</w:t>
+      </w:r>
+      <w:r>
+        <w:t xml:space="preserve"> </w:t>
+      </w:r>
+      <w:r>
+        <w:t xml:space="preserve">an urban value, the overall index equals the urban index in</w:t>
+      </w:r>
+      <w:r>
+        <w:t xml:space="preserve"> </w:t>
+      </w:r>
+      <w:r>
+        <w:t xml:space="preserve">87% of cases, but in 785 rows</w:t>
+      </w:r>
+      <w:r>
+        <w:t xml:space="preserve"> </w:t>
+      </w:r>
+      <w:r>
+        <w:t xml:space="preserve">the two differ by more than one point, so rural samples entered the overall</w:t>
+      </w:r>
+      <w:r>
+        <w:t xml:space="preserve"> </w:t>
+      </w:r>
+      <w:r>
+        <w:t xml:space="preserve">index even though the rural component is reported as unavailable.</w:t>
       </w:r>
     </w:p>
     <w:bookmarkStart w:id="37" w:name="cell-fig-nd-year"/>
@@ -2404,7 +2994,67 @@
         <w:t xml:space="preserve"> </w:t>
       </w:r>
       <w:r>
-        <w:t xml:space="preserve">counts the units that are expected and observed under each frame. Against the file’s own frame, 5.7% of municipality-years are absent; against the national register, 6.4%, because 8 municipalities never appear at all (Antioquia: Murindó, Vigía del Fuerte; Chocó: El Cantón del San Pablo, Istmina, Medio Baudó, Riosucio, Río Quito, Unguía). Coverage improved from 2007 to 2019, when only 23 municipalities were absent, and has weakened since 2020; 2022 is the least complete year, with 142 absent. Department aggregates are absent in 25 department-years, exactly those in which the department reported no municipality at all (0 exceptions), so the aggregate rows add no coverage of their own.</w:t>
+        <w:t xml:space="preserve">counts the units that are expected and observed under each</w:t>
+      </w:r>
+      <w:r>
+        <w:t xml:space="preserve"> </w:t>
+      </w:r>
+      <w:r>
+        <w:t xml:space="preserve">frame. Against the file’s own frame, 5.7% of</w:t>
+      </w:r>
+      <w:r>
+        <w:t xml:space="preserve"> </w:t>
+      </w:r>
+      <w:r>
+        <w:t xml:space="preserve">municipality-years are absent; against the national register,</w:t>
+      </w:r>
+      <w:r>
+        <w:t xml:space="preserve"> </w:t>
+      </w:r>
+      <w:r>
+        <w:t xml:space="preserve">6.4%, because 8 municipalities never</w:t>
+      </w:r>
+      <w:r>
+        <w:t xml:space="preserve"> </w:t>
+      </w:r>
+      <w:r>
+        <w:t xml:space="preserve">appear at all (Antioquia: Murindó, Vigía del Fuerte; Chocó: El Cantón del San Pablo, Istmina, Medio Baudó, Riosucio, Río Quito, Unguía). Coverage improved from 2007 to</w:t>
+      </w:r>
+      <w:r>
+        <w:t xml:space="preserve"> </w:t>
+      </w:r>
+      <w:r>
+        <w:t xml:space="preserve">2019, when only 23 municipalities were</w:t>
+      </w:r>
+      <w:r>
+        <w:t xml:space="preserve"> </w:t>
+      </w:r>
+      <w:r>
+        <w:t xml:space="preserve">absent, and has weakened since 2020; 2022 is the least</w:t>
+      </w:r>
+      <w:r>
+        <w:t xml:space="preserve"> </w:t>
+      </w:r>
+      <w:r>
+        <w:t xml:space="preserve">complete year, with 142 absent. Department aggregates are</w:t>
+      </w:r>
+      <w:r>
+        <w:t xml:space="preserve"> </w:t>
+      </w:r>
+      <w:r>
+        <w:t xml:space="preserve">absent in 25 department-years, exactly those in which the</w:t>
+      </w:r>
+      <w:r>
+        <w:t xml:space="preserve"> </w:t>
+      </w:r>
+      <w:r>
+        <w:t xml:space="preserve">department reported no municipality at all (0</w:t>
+      </w:r>
+      <w:r>
+        <w:t xml:space="preserve"> </w:t>
+      </w:r>
+      <w:r>
+        <w:t xml:space="preserve">exceptions), so the aggregate rows add no coverage of their own.</w:t>
       </w:r>
     </w:p>
     <w:tbl>
@@ -2808,7 +3458,37 @@
         </w:r>
       </w:hyperlink>
       <w:r>
-        <w:t xml:space="preserve">). Only 5 departments are complete over the whole period. Chocó has no rows of any kind before 2014 and is missing 87% of its municipality-years, 471 of the 1,263 absent nationally; Guainía, Vaupés, Guaviare, Córdoba and Amazonas each lack more than a fifth.</w:t>
+        <w:t xml:space="preserve">). Only 5</w:t>
+      </w:r>
+      <w:r>
+        <w:t xml:space="preserve"> </w:t>
+      </w:r>
+      <w:r>
+        <w:t xml:space="preserve">departments are complete over the whole period. Chocó has no rows of any</w:t>
+      </w:r>
+      <w:r>
+        <w:t xml:space="preserve"> </w:t>
+      </w:r>
+      <w:r>
+        <w:t xml:space="preserve">kind before 2014 and is missing 87% of its</w:t>
+      </w:r>
+      <w:r>
+        <w:t xml:space="preserve"> </w:t>
+      </w:r>
+      <w:r>
+        <w:t xml:space="preserve">municipality-years, 471 of the 1,263</w:t>
+      </w:r>
+      <w:r>
+        <w:t xml:space="preserve"> </w:t>
+      </w:r>
+      <w:r>
+        <w:t xml:space="preserve">absent nationally; Guainía, Vaupés, Guaviare, Córdoba and Amazonas each lack</w:t>
+      </w:r>
+      <w:r>
+        <w:t xml:space="preserve"> </w:t>
+      </w:r>
+      <w:r>
+        <w:t xml:space="preserve">more than a fifth.</w:t>
       </w:r>
     </w:p>
     <w:bookmarkStart w:id="44" w:name="cell-fig-heatmap"/>
@@ -2907,7 +3587,31 @@
         <w:pStyle w:val="FirstParagraph"/>
       </w:pPr>
       <w:r>
-        <w:t xml:space="preserve">At the national level no year is missing: every calendar year from 2007 to 2024 is present (0 gaps). The file was downloaded in September 2026, so the absence of 2025 most likely reflects publication lag rather than a gap. At the municipal level the picture is different (</w:t>
+        <w:t xml:space="preserve">At the national level no year is missing: every calendar year from</w:t>
+      </w:r>
+      <w:r>
+        <w:t xml:space="preserve"> </w:t>
+      </w:r>
+      <w:r>
+        <w:t xml:space="preserve">2007 to 2024 is present (0 gaps). The file</w:t>
+      </w:r>
+      <w:r>
+        <w:t xml:space="preserve"> </w:t>
+      </w:r>
+      <w:r>
+        <w:t xml:space="preserve">was downloaded in September 2026, so the absence of 2025 most likely</w:t>
+      </w:r>
+      <w:r>
+        <w:t xml:space="preserve"> </w:t>
+      </w:r>
+      <w:r>
+        <w:t xml:space="preserve">reflects publication lag rather than a gap. At the municipal level the</w:t>
+      </w:r>
+      <w:r>
+        <w:t xml:space="preserve"> </w:t>
+      </w:r>
+      <w:r>
+        <w:t xml:space="preserve">picture is different (</w:t>
       </w:r>
       <w:hyperlink w:anchor="tbl-series">
         <w:r>
@@ -2918,7 +3622,55 @@
         </w:r>
       </w:hyperlink>
       <w:r>
-        <w:t xml:space="preserve">). 732 municipalities (67%) are observed in every year. Of the rest, 101 enter after 2007, 89 drop out before 2024, and 259 have at least one interruption inside their series, which together account for 460 interior gap-years. For anyone who needs a balanced panel, shortening the window helps only moderately: 811 of the 1,103 register municipalities are observed in every year from 2010, 835 from 2015 and 898 from 2019.</w:t>
+        <w:t xml:space="preserve">). 732 municipalities</w:t>
+      </w:r>
+      <w:r>
+        <w:t xml:space="preserve"> </w:t>
+      </w:r>
+      <w:r>
+        <w:t xml:space="preserve">(67%) are observed in every year. Of the rest, 101</w:t>
+      </w:r>
+      <w:r>
+        <w:t xml:space="preserve"> </w:t>
+      </w:r>
+      <w:r>
+        <w:t xml:space="preserve">enter after 2007, 89 drop out before 2024, and</w:t>
+      </w:r>
+      <w:r>
+        <w:t xml:space="preserve"> </w:t>
+      </w:r>
+      <w:r>
+        <w:t xml:space="preserve">259 have at least one interruption inside their series, which</w:t>
+      </w:r>
+      <w:r>
+        <w:t xml:space="preserve"> </w:t>
+      </w:r>
+      <w:r>
+        <w:t xml:space="preserve">together account for 460 interior gap-years. For anyone</w:t>
+      </w:r>
+      <w:r>
+        <w:t xml:space="preserve"> </w:t>
+      </w:r>
+      <w:r>
+        <w:t xml:space="preserve">who needs a balanced panel, shortening the window helps only moderately:</w:t>
+      </w:r>
+      <w:r>
+        <w:t xml:space="preserve"> </w:t>
+      </w:r>
+      <w:r>
+        <w:t xml:space="preserve">811 of the 1,103 register</w:t>
+      </w:r>
+      <w:r>
+        <w:t xml:space="preserve"> </w:t>
+      </w:r>
+      <w:r>
+        <w:t xml:space="preserve">municipalities are observed in every year from 2010, 835</w:t>
+      </w:r>
+      <w:r>
+        <w:t xml:space="preserve"> </w:t>
+      </w:r>
+      <w:r>
+        <w:t xml:space="preserve">from 2015 and 898 from 2019.</w:t>
       </w:r>
     </w:p>
     <w:tbl>
@@ -3295,13 +4047,13 @@
       </w:tr>
     </w:tbl>
     <w:bookmarkEnd w:id="47"/>
-    <w:bookmarkStart w:id="48" w:name="answer-1"/>
+    <w:bookmarkStart w:id="48" w:name="what-is-complete-and-what-is-not"/>
     <w:p>
       <w:pPr>
         <w:pStyle w:val="Heading2"/>
       </w:pPr>
       <w:r>
-        <w:t xml:space="preserve">3.4 Answer</w:t>
+        <w:t xml:space="preserve">3.4 What is complete and what is not</w:t>
       </w:r>
     </w:p>
     <w:p>
@@ -3309,7 +4061,19 @@
         <w:pStyle w:val="FirstParagraph"/>
       </w:pPr>
       <w:r>
-        <w:t xml:space="preserve">Are there missing values? Not in the overall index, which is present in every row, but yes in the components: the rural index is unavailable in about half of the municipal rows, and</w:t>
+        <w:t xml:space="preserve">The overall index is complete: it is present in every row, and every</w:t>
+      </w:r>
+      <w:r>
+        <w:t xml:space="preserve"> </w:t>
+      </w:r>
+      <w:r>
+        <w:t xml:space="preserve">calendar year from 2007 to 2024 is in the file. The components are not. The</w:t>
+      </w:r>
+      <w:r>
+        <w:t xml:space="preserve"> </w:t>
+      </w:r>
+      <w:r>
+        <w:t xml:space="preserve">rural index is unavailable in about half of the municipal rows, and</w:t>
       </w:r>
       <w:r>
         <w:t xml:space="preserve"> </w:t>
@@ -3324,7 +4088,55 @@
         <w:t xml:space="preserve"> </w:t>
       </w:r>
       <w:r>
-        <w:t xml:space="preserve">sometimes hides rural samples that did enter the overall index. Are there missing units? Yes: about 6% of the municipality-years implied by the national register are absent, 8 municipalities never appear, and the shortfall is concentrated in Chocó and the Amazon and Orinoco departments. Are there missing years? Not at the national level, where 2007 to 2024 is continuous, but a third of municipalities have a series that starts late, ends early or is interrupted. Analyses of the overall index at the national level can proceed with few reservations; analyses of the urban or rural components, comparisons across departments, and municipal time series must treat the missingness explicitly.</w:t>
+        <w:t xml:space="preserve">sometimes hides rural samples that did enter the overall index. The panel is</w:t>
+      </w:r>
+      <w:r>
+        <w:t xml:space="preserve"> </w:t>
+      </w:r>
+      <w:r>
+        <w:t xml:space="preserve">not complete either. About 6% of the municipality-years implied by the</w:t>
+      </w:r>
+      <w:r>
+        <w:t xml:space="preserve"> </w:t>
+      </w:r>
+      <w:r>
+        <w:t xml:space="preserve">national register are absent, 8 municipalities never appear, the</w:t>
+      </w:r>
+      <w:r>
+        <w:t xml:space="preserve"> </w:t>
+      </w:r>
+      <w:r>
+        <w:t xml:space="preserve">shortfall is concentrated in Chocó and the Amazon and Orinoco departments,</w:t>
+      </w:r>
+      <w:r>
+        <w:t xml:space="preserve"> </w:t>
+      </w:r>
+      <w:r>
+        <w:t xml:space="preserve">and a third of municipalities have a series that starts late, ends early or</w:t>
+      </w:r>
+      <w:r>
+        <w:t xml:space="preserve"> </w:t>
+      </w:r>
+      <w:r>
+        <w:t xml:space="preserve">is interrupted. Analyses of the overall index at the national level can</w:t>
+      </w:r>
+      <w:r>
+        <w:t xml:space="preserve"> </w:t>
+      </w:r>
+      <w:r>
+        <w:t xml:space="preserve">therefore proceed with few reservations, whereas analyses of the urban or</w:t>
+      </w:r>
+      <w:r>
+        <w:t xml:space="preserve"> </w:t>
+      </w:r>
+      <w:r>
+        <w:t xml:space="preserve">rural components, comparisons across departments and municipal time series</w:t>
+      </w:r>
+      <w:r>
+        <w:t xml:space="preserve"> </w:t>
+      </w:r>
+      <w:r>
+        <w:t xml:space="preserve">must treat the missingness explicitly.</w:t>
       </w:r>
     </w:p>
     <w:bookmarkEnd w:id="48"/>

</xml_diff>

<commit_message>
feat(manuscript): interactive table and map in the HTML output
The columns table and the IRCA 2019 map are conditional on the format:
the DOCX keeps kable and the static ggplot map, the HTML gets a
sortable reactable and a leaflet map whose tooltips show municipality,
department, IRCA value and risk band. The web geometry is simplified
and rounded so the self-contained page stays at 4.6 MB. PLAN.md now
describes this work.

Prompts:
- 2026-09-29-009-implement-the-remaining-issues-and-close-them

Refs #4, #5, #6

Assisted-by: Claude claude-fable-5-1
</commit_message>
<xml_diff>
--- a/manuscript/_manuscript/index.docx
+++ b/manuscript/_manuscript/index.docx
@@ -126,7 +126,7 @@
         <w:t xml:space="preserve">Chocó is missing more than four fifths of its municipality-years.</w:t>
       </w:r>
     </w:p>
-    <w:bookmarkStart w:id="26" w:name="data-and-validation"/>
+    <w:bookmarkStart w:id="25" w:name="data-and-validation"/>
     <w:p>
       <w:pPr>
         <w:pStyle w:val="Heading1"/>
@@ -1219,7 +1219,6 @@
         <w:t xml:space="preserve">register.</w:t>
       </w:r>
     </w:p>
-    <w:bookmarkStart w:id="25" w:name="cell-fig-map"/>
     <w:tbl>
       <w:tblPr>
         <w:tblStyle w:val="Table"/>
@@ -1236,7 +1235,6 @@
           <w:bookmarkStart w:id="24" w:name="fig-map"/>
           <w:p>
             <w:pPr>
-              <w:pStyle w:val="Compact"/>
               <w:jc w:val="center"/>
             </w:pPr>
             <w:r>
@@ -1249,7 +1247,7 @@
                     <a:graphicData uri="http://schemas.openxmlformats.org/drawingml/2006/picture">
                       <pic:pic>
                         <pic:nvPicPr>
-                          <pic:cNvPr descr="index_files/figure-docx/fig-map-1.png" id="23" name="Picture"/>
+                          <pic:cNvPr descr="index_files/figure-docx/map-static-1.png" id="23" name="Picture"/>
                           <pic:cNvPicPr>
                             <a:picLocks noChangeArrowheads="1" noChangeAspect="1"/>
                           </pic:cNvPicPr>
@@ -1292,21 +1290,38 @@
               <w:pStyle w:val="ImageCaption"/>
             </w:pPr>
             <w:r>
-              <w:t xml:space="preserve">Figure 1: Annual IRCA by municipality in 2019 (left) and number of years, out of 18, in which each municipality appears in the file (right). Municipalities that never appear are outlined in orange; non-municipalised areas are not expected. Boundaries: DANE 2020.</w:t>
+              <w:t xml:space="preserve">Figure 1: Annual IRCA by municipality in 2019 (left) and number of years, out</w:t>
+            </w:r>
+            <w:r>
+              <w:t xml:space="preserve"> </w:t>
+            </w:r>
+            <w:r>
+              <w:t xml:space="preserve">of 18, in which each municipality appears in the file (right).</w:t>
+            </w:r>
+            <w:r>
+              <w:t xml:space="preserve"> </w:t>
+            </w:r>
+            <w:r>
+              <w:t xml:space="preserve">Municipalities that never appear are outlined in orange; non-municipalised</w:t>
+            </w:r>
+            <w:r>
+              <w:t xml:space="preserve"> </w:t>
+            </w:r>
+            <w:r>
+              <w:t xml:space="preserve">areas are not expected. Boundaries: DANE 2020.</w:t>
             </w:r>
           </w:p>
           <w:bookmarkEnd w:id="24"/>
         </w:tc>
       </w:tr>
     </w:tbl>
+    <w:p>
+      <w:r>
+        <w:br w:type="page"/>
+      </w:r>
+    </w:p>
     <w:bookmarkEnd w:id="25"/>
-    <w:p>
-      <w:r>
-        <w:br w:type="page"/>
-      </w:r>
-    </w:p>
-    <w:bookmarkEnd w:id="26"/>
-    <w:bookmarkStart w:id="32" w:name="the-observational-unit"/>
+    <w:bookmarkStart w:id="31" w:name="the-observational-unit"/>
     <w:p>
       <w:pPr>
         <w:pStyle w:val="Heading1"/>
@@ -1315,7 +1330,7 @@
         <w:t xml:space="preserve">2. The observational unit</w:t>
       </w:r>
     </w:p>
-    <w:bookmarkStart w:id="28" w:name="what-a-row-looks-like"/>
+    <w:bookmarkStart w:id="27" w:name="what-a-row-looks-like"/>
     <w:p>
       <w:pPr>
         <w:pStyle w:val="Heading2"/>
@@ -1446,7 +1461,7 @@
       <w:tr>
         <w:tc>
           <w:tcPr/>
-          <w:bookmarkStart w:id="27" w:name="tbl-example"/>
+          <w:bookmarkStart w:id="26" w:name="tbl-example"/>
           <w:p>
             <w:pPr>
               <w:jc w:val="center"/>
@@ -1945,13 +1960,13 @@
               </w:tc>
             </w:tr>
           </w:tbl>
-          <w:bookmarkEnd w:id="27"/>
+          <w:bookmarkEnd w:id="26"/>
           <w:p/>
         </w:tc>
       </w:tr>
     </w:tbl>
-    <w:bookmarkEnd w:id="28"/>
-    <w:bookmarkStart w:id="30" w:name="what-identifies-a-row"/>
+    <w:bookmarkEnd w:id="27"/>
+    <w:bookmarkStart w:id="29" w:name="what-identifies-a-row"/>
     <w:p>
       <w:pPr>
         <w:pStyle w:val="Heading2"/>
@@ -2067,7 +2082,7 @@
       <w:tr>
         <w:tc>
           <w:tcPr/>
-          <w:bookmarkStart w:id="29" w:name="tbl-keys"/>
+          <w:bookmarkStart w:id="28" w:name="tbl-keys"/>
           <w:p>
             <w:pPr>
               <w:jc w:val="center"/>
@@ -2422,7 +2437,7 @@
               </w:tc>
             </w:tr>
           </w:tbl>
-          <w:bookmarkEnd w:id="29"/>
+          <w:bookmarkEnd w:id="28"/>
           <w:p/>
         </w:tc>
       </w:tr>
@@ -2447,8 +2462,8 @@
         <w:t xml:space="preserve">2024.</w:t>
       </w:r>
     </w:p>
-    <w:bookmarkEnd w:id="30"/>
-    <w:bookmarkStart w:id="31" w:name="the-municipality-year-and-its-limits"/>
+    <w:bookmarkEnd w:id="29"/>
+    <w:bookmarkStart w:id="30" w:name="the-municipality-year-and-its-limits"/>
     <w:p>
       <w:pPr>
         <w:pStyle w:val="Heading2"/>
@@ -2578,9 +2593,9 @@
         <w:br w:type="page"/>
       </w:r>
     </w:p>
+    <w:bookmarkEnd w:id="30"/>
     <w:bookmarkEnd w:id="31"/>
-    <w:bookmarkEnd w:id="32"/>
-    <w:bookmarkStart w:id="49" w:name="completeness-of-the-data"/>
+    <w:bookmarkStart w:id="48" w:name="completeness-of-the-data"/>
     <w:p>
       <w:pPr>
         <w:pStyle w:val="Heading1"/>
@@ -2621,7 +2636,7 @@
         <w:t xml:space="preserve">municipality (a missing year).</w:t>
       </w:r>
     </w:p>
-    <w:bookmarkStart w:id="38" w:name="missing-values-within-rows"/>
+    <w:bookmarkStart w:id="37" w:name="missing-values-within-rows"/>
     <w:p>
       <w:pPr>
         <w:pStyle w:val="Heading2"/>
@@ -2887,7 +2902,7 @@
         <w:t xml:space="preserve">index even though the rural component is reported as unavailable.</w:t>
       </w:r>
     </w:p>
-    <w:bookmarkStart w:id="37" w:name="cell-fig-nd-year"/>
+    <w:bookmarkStart w:id="36" w:name="cell-fig-nd-year"/>
     <w:tbl>
       <w:tblPr>
         <w:tblStyle w:val="Table"/>
@@ -2901,7 +2916,7 @@
       <w:tr>
         <w:tc>
           <w:tcPr/>
-          <w:bookmarkStart w:id="36" w:name="fig-nd-year"/>
+          <w:bookmarkStart w:id="35" w:name="fig-nd-year"/>
           <w:p>
             <w:pPr>
               <w:pStyle w:val="Compact"/>
@@ -2912,18 +2927,18 @@
                 <wp:inline>
                   <wp:extent cx="5334000" cy="1969476"/>
                   <wp:effectExtent b="0" l="0" r="0" t="0"/>
-                  <wp:docPr descr="" title="" id="34" name="Picture"/>
+                  <wp:docPr descr="" title="" id="33" name="Picture"/>
                   <a:graphic>
                     <a:graphicData uri="http://schemas.openxmlformats.org/drawingml/2006/picture">
                       <pic:pic>
                         <pic:nvPicPr>
-                          <pic:cNvPr descr="index_files/figure-docx/fig-nd-year-1.png" id="35" name="Picture"/>
+                          <pic:cNvPr descr="index_files/figure-docx/fig-nd-year-1.png" id="34" name="Picture"/>
                           <pic:cNvPicPr>
                             <a:picLocks noChangeArrowheads="1" noChangeAspect="1"/>
                           </pic:cNvPicPr>
                         </pic:nvPicPr>
                         <pic:blipFill>
-                          <a:blip r:embed="rId33"/>
+                          <a:blip r:embed="rId32"/>
                           <a:stretch>
                             <a:fillRect/>
                           </a:stretch>
@@ -2963,13 +2978,13 @@
               <w:t xml:space="preserve">Figure 2: Share of municipal rows in which the urban index, the rural index, or both are reported as ND, by year.</w:t>
             </w:r>
           </w:p>
-          <w:bookmarkEnd w:id="36"/>
+          <w:bookmarkEnd w:id="35"/>
         </w:tc>
       </w:tr>
     </w:tbl>
+    <w:bookmarkEnd w:id="36"/>
     <w:bookmarkEnd w:id="37"/>
-    <w:bookmarkEnd w:id="38"/>
-    <w:bookmarkStart w:id="45" w:name="missing-observational-units"/>
+    <w:bookmarkStart w:id="44" w:name="missing-observational-units"/>
     <w:p>
       <w:pPr>
         <w:pStyle w:val="Heading2"/>
@@ -3070,7 +3085,7 @@
       <w:tr>
         <w:tc>
           <w:tcPr/>
-          <w:bookmarkStart w:id="39" w:name="tbl-frames"/>
+          <w:bookmarkStart w:id="38" w:name="tbl-frames"/>
           <w:p>
             <w:pPr>
               <w:jc w:val="center"/>
@@ -3437,7 +3452,7 @@
               </w:tc>
             </w:tr>
           </w:tbl>
-          <w:bookmarkEnd w:id="39"/>
+          <w:bookmarkEnd w:id="38"/>
           <w:p/>
         </w:tc>
       </w:tr>
@@ -3491,7 +3506,7 @@
         <w:t xml:space="preserve">more than a fifth.</w:t>
       </w:r>
     </w:p>
-    <w:bookmarkStart w:id="44" w:name="cell-fig-heatmap"/>
+    <w:bookmarkStart w:id="43" w:name="cell-fig-heatmap"/>
     <w:tbl>
       <w:tblPr>
         <w:tblStyle w:val="Table"/>
@@ -3505,7 +3520,7 @@
       <w:tr>
         <w:tc>
           <w:tcPr/>
-          <w:bookmarkStart w:id="43" w:name="fig-heatmap"/>
+          <w:bookmarkStart w:id="42" w:name="fig-heatmap"/>
           <w:p>
             <w:pPr>
               <w:pStyle w:val="Compact"/>
@@ -3516,18 +3531,18 @@
                 <wp:inline>
                   <wp:extent cx="5334000" cy="2954215"/>
                   <wp:effectExtent b="0" l="0" r="0" t="0"/>
-                  <wp:docPr descr="" title="" id="41" name="Picture"/>
+                  <wp:docPr descr="" title="" id="40" name="Picture"/>
                   <a:graphic>
                     <a:graphicData uri="http://schemas.openxmlformats.org/drawingml/2006/picture">
                       <pic:pic>
                         <pic:nvPicPr>
-                          <pic:cNvPr descr="index_files/figure-docx/fig-heatmap-1.png" id="42" name="Picture"/>
+                          <pic:cNvPr descr="index_files/figure-docx/fig-heatmap-1.png" id="41" name="Picture"/>
                           <pic:cNvPicPr>
                             <a:picLocks noChangeArrowheads="1" noChangeAspect="1"/>
                           </pic:cNvPicPr>
                         </pic:nvPicPr>
                         <pic:blipFill>
-                          <a:blip r:embed="rId40"/>
+                          <a:blip r:embed="rId39"/>
                           <a:stretch>
                             <a:fillRect/>
                           </a:stretch>
@@ -3567,13 +3582,13 @@
               <w:t xml:space="preserve">Figure 3: Share of each department’s municipalities absent from the file in each year, on the external frame. Departments are ordered by their overall share missing; the number of municipalities in the register follows each name.</w:t>
             </w:r>
           </w:p>
-          <w:bookmarkEnd w:id="43"/>
+          <w:bookmarkEnd w:id="42"/>
         </w:tc>
       </w:tr>
     </w:tbl>
+    <w:bookmarkEnd w:id="43"/>
     <w:bookmarkEnd w:id="44"/>
-    <w:bookmarkEnd w:id="45"/>
-    <w:bookmarkStart w:id="47" w:name="missing-years-and-panel-balance"/>
+    <w:bookmarkStart w:id="46" w:name="missing-years-and-panel-balance"/>
     <w:p>
       <w:pPr>
         <w:pStyle w:val="Heading2"/>
@@ -3686,7 +3701,7 @@
       <w:tr>
         <w:tc>
           <w:tcPr/>
-          <w:bookmarkStart w:id="46" w:name="tbl-series"/>
+          <w:bookmarkStart w:id="45" w:name="tbl-series"/>
           <w:p>
             <w:pPr>
               <w:jc w:val="center"/>
@@ -4041,13 +4056,13 @@
               </w:tc>
             </w:tr>
           </w:tbl>
-          <w:bookmarkEnd w:id="46"/>
+          <w:bookmarkEnd w:id="45"/>
           <w:p/>
         </w:tc>
       </w:tr>
     </w:tbl>
-    <w:bookmarkEnd w:id="47"/>
-    <w:bookmarkStart w:id="48" w:name="what-is-complete-and-what-is-not"/>
+    <w:bookmarkEnd w:id="46"/>
+    <w:bookmarkStart w:id="47" w:name="what-is-complete-and-what-is-not"/>
     <w:p>
       <w:pPr>
         <w:pStyle w:val="Heading2"/>
@@ -4139,9 +4154,9 @@
         <w:t xml:space="preserve">must treat the missingness explicitly.</w:t>
       </w:r>
     </w:p>
+    <w:bookmarkEnd w:id="47"/>
     <w:bookmarkEnd w:id="48"/>
-    <w:bookmarkEnd w:id="49"/>
-    <w:bookmarkStart w:id="56" w:name="references"/>
+    <w:bookmarkStart w:id="55" w:name="references"/>
     <w:p>
       <w:pPr>
         <w:pStyle w:val="Heading1"/>
@@ -4150,8 +4165,8 @@
         <w:t xml:space="preserve">References</w:t>
       </w:r>
     </w:p>
-    <w:bookmarkStart w:id="55" w:name="refs"/>
-    <w:bookmarkStart w:id="51" w:name="ref-danemgn2020"/>
+    <w:bookmarkStart w:id="54" w:name="refs"/>
+    <w:bookmarkStart w:id="50" w:name="ref-danemgn2020"/>
     <w:p>
       <w:pPr>
         <w:pStyle w:val="Bibliography"/>
@@ -4174,7 +4189,7 @@
       <w:r>
         <w:t xml:space="preserve"> </w:t>
       </w:r>
-      <w:hyperlink r:id="rId50">
+      <w:hyperlink r:id="rId49">
         <w:r>
           <w:rPr>
             <w:rStyle w:val="Hyperlink"/>
@@ -4186,8 +4201,8 @@
         <w:t xml:space="preserve">.</w:t>
       </w:r>
     </w:p>
-    <w:bookmarkEnd w:id="51"/>
-    <w:bookmarkStart w:id="53" w:name="ref-sivicap2026"/>
+    <w:bookmarkEnd w:id="50"/>
+    <w:bookmarkStart w:id="52" w:name="ref-sivicap2026"/>
     <w:p>
       <w:pPr>
         <w:pStyle w:val="Bibliography"/>
@@ -4210,7 +4225,7 @@
       <w:r>
         <w:t xml:space="preserve"> </w:t>
       </w:r>
-      <w:hyperlink r:id="rId52">
+      <w:hyperlink r:id="rId51">
         <w:r>
           <w:rPr>
             <w:rStyle w:val="Hyperlink"/>
@@ -4222,8 +4237,8 @@
         <w:t xml:space="preserve">.</w:t>
       </w:r>
     </w:p>
-    <w:bookmarkEnd w:id="53"/>
-    <w:bookmarkStart w:id="54" w:name="ref-res2115"/>
+    <w:bookmarkEnd w:id="52"/>
+    <w:bookmarkStart w:id="53" w:name="ref-res2115"/>
     <w:p>
       <w:pPr>
         <w:pStyle w:val="Bibliography"/>
@@ -4244,9 +4259,9 @@
         <w:t xml:space="preserve">Bogotá.</w:t>
       </w:r>
     </w:p>
+    <w:bookmarkEnd w:id="53"/>
     <w:bookmarkEnd w:id="54"/>
     <w:bookmarkEnd w:id="55"/>
-    <w:bookmarkEnd w:id="56"/>
     <w:sectPr>
       <w:footnotePr>
         <w:numRestart w:val="eachSect"/>

</xml_diff>